<commit_message>
datengenerator smoke_train getestet. funtkioniert. Nur FNO lernt fälschlicherweise rho exakt auf phi in jede raumrichtung abzubilden.
</commit_message>
<xml_diff>
--- a/Konzeptionierung/NO Spezifikationen/Modell/Schnittstelle für NO-Surrogat.docx
+++ b/Konzeptionierung/NO Spezifikationen/Modell/Schnittstelle für NO-Surrogat.docx
@@ -52,23 +52,7 @@
           </w:tcPr>
           <w:p>
             <w:r>
-              <w:t>_</w:t>
-            </w:r>
-            <w:proofErr w:type="spellStart"/>
-            <w:r>
-              <w:t>integrated_green_</w:t>
-            </w:r>
-            <w:proofErr w:type="gramStart"/>
-            <w:r>
-              <w:t>function</w:t>
-            </w:r>
-            <w:proofErr w:type="spellEnd"/>
-            <w:r>
-              <w:t>(</w:t>
-            </w:r>
-            <w:proofErr w:type="gramEnd"/>
-            <w:r>
-              <w:t>)</w:t>
+              <w:t>_integrated_green_function()</w:t>
             </w:r>
           </w:p>
         </w:tc>
@@ -86,37 +70,8 @@
           </w:tcPr>
           <w:p>
             <w:r>
-              <w:t>8× _</w:t>
+              <w:t>8× _integrated_potential(), Oktanten-Spiegelung, dτ = dz·γ</w:t>
             </w:r>
-            <w:proofErr w:type="spellStart"/>
-            <w:r>
-              <w:t>integrated_</w:t>
-            </w:r>
-            <w:proofErr w:type="gramStart"/>
-            <w:r>
-              <w:t>potential</w:t>
-            </w:r>
-            <w:proofErr w:type="spellEnd"/>
-            <w:r>
-              <w:t>(</w:t>
-            </w:r>
-            <w:proofErr w:type="gramEnd"/>
-            <w:r>
-              <w:t xml:space="preserve">), Oktanten-Spiegelung, </w:t>
-            </w:r>
-            <w:proofErr w:type="spellStart"/>
-            <w:r>
-              <w:t>dτ</w:t>
-            </w:r>
-            <w:proofErr w:type="spellEnd"/>
-            <w:r>
-              <w:t xml:space="preserve"> = </w:t>
-            </w:r>
-            <w:proofErr w:type="spellStart"/>
-            <w:r>
-              <w:t>dz·γ</w:t>
-            </w:r>
-            <w:proofErr w:type="spellEnd"/>
           </w:p>
         </w:tc>
         <w:tc>
@@ -171,23 +126,7 @@
           </w:tcPr>
           <w:p>
             <w:r>
-              <w:t>_</w:t>
-            </w:r>
-            <w:proofErr w:type="spellStart"/>
-            <w:r>
-              <w:t>solve_poisson_</w:t>
-            </w:r>
-            <w:proofErr w:type="gramStart"/>
-            <w:r>
-              <w:t>equation</w:t>
-            </w:r>
-            <w:proofErr w:type="spellEnd"/>
-            <w:r>
-              <w:t>(</w:t>
-            </w:r>
-            <w:proofErr w:type="gramEnd"/>
-            <w:r>
-              <w:t>)</w:t>
+              <w:t>_solve_poisson_equation()</w:t>
             </w:r>
           </w:p>
         </w:tc>
@@ -204,29 +143,8 @@
             <w:hideMark/>
           </w:tcPr>
           <w:p>
-            <w:proofErr w:type="spellStart"/>
             <w:r>
-              <w:t>rfftn</w:t>
-            </w:r>
-            <w:proofErr w:type="spellEnd"/>
-            <w:r>
-              <w:t>(ρ)·</w:t>
-            </w:r>
-            <w:proofErr w:type="spellStart"/>
-            <w:r>
-              <w:t>rfftn</w:t>
-            </w:r>
-            <w:proofErr w:type="spellEnd"/>
-            <w:r>
-              <w:t xml:space="preserve">(G) → </w:t>
-            </w:r>
-            <w:proofErr w:type="spellStart"/>
-            <w:r>
-              <w:t>irfftn</w:t>
-            </w:r>
-            <w:proofErr w:type="spellEnd"/>
-            <w:r>
-              <w:t>, ÷ 4πε₀, zurückschneiden</w:t>
+              <w:t>rfftn(ρ)·rfftn(G) → irfftn, ÷ 4πε₀, zurückschneiden</w:t>
             </w:r>
           </w:p>
         </w:tc>
@@ -321,23 +239,7 @@
         <w:t>in</w:t>
       </w:r>
       <w:r>
-        <w:t xml:space="preserve"> 7) _</w:t>
-      </w:r>
-      <w:proofErr w:type="spellStart"/>
-      <w:r>
-        <w:t>solve_poisson_</w:t>
-      </w:r>
-      <w:proofErr w:type="gramStart"/>
-      <w:r>
-        <w:t>equation</w:t>
-      </w:r>
-      <w:proofErr w:type="spellEnd"/>
-      <w:r>
-        <w:t>(</w:t>
-      </w:r>
-      <w:proofErr w:type="gramEnd"/>
-      <w:r>
-        <w:t xml:space="preserve">) einfügen, </w:t>
+        <w:t xml:space="preserve"> 7) _solve_poisson_equation() einfügen, </w:t>
       </w:r>
       <w:r>
         <w:t xml:space="preserve">wo FFT von </w:t>
@@ -346,15 +248,7 @@
         <w:t>Green-Funktion(6)</w:t>
       </w:r>
       <w:r>
-        <w:t xml:space="preserve"> und _</w:t>
-      </w:r>
-      <w:proofErr w:type="spellStart"/>
-      <w:r>
-        <w:t>array_rho</w:t>
-      </w:r>
-      <w:proofErr w:type="spellEnd"/>
-      <w:r>
-        <w:t xml:space="preserve">(5) </w:t>
+        <w:t xml:space="preserve"> und _array_rho(5) </w:t>
       </w:r>
       <w:r>
         <w:t xml:space="preserve">hin </w:t>
@@ -390,86 +284,23 @@
       <w:r>
         <w:t>„</w:t>
       </w:r>
-      <w:proofErr w:type="spellStart"/>
-      <w:r>
-        <w:t>phi</w:t>
-      </w:r>
-      <w:proofErr w:type="spellEnd"/>
-      <w:r>
-        <w:t xml:space="preserve"> </w:t>
-      </w:r>
-      <w:proofErr w:type="spellStart"/>
-      <w:r>
-        <w:t>traegt</w:t>
-      </w:r>
-      <w:proofErr w:type="spellEnd"/>
-      <w:r>
-        <w:t xml:space="preserve"> einen Offset: min = 1.9502e+07 V, Spannweite = 4.6190e+07 V.</w:t>
-      </w:r>
-    </w:p>
-    <w:p>
-      <w:r>
-        <w:t xml:space="preserve">Die integrierte </w:t>
-      </w:r>
-      <w:proofErr w:type="spellStart"/>
-      <w:r>
-        <w:t>Greensche</w:t>
-      </w:r>
-      <w:proofErr w:type="spellEnd"/>
-      <w:r>
-        <w:t xml:space="preserve"> Funktion ist nur bis auf eine Konstante bestimmt --</w:t>
-      </w:r>
-    </w:p>
-    <w:p>
-      <w:r>
-        <w:t xml:space="preserve">physikalisch relevant ist </w:t>
-      </w:r>
-      <w:proofErr w:type="spellStart"/>
-      <w:r>
-        <w:t>ausschliesslich</w:t>
-      </w:r>
-      <w:proofErr w:type="spellEnd"/>
-      <w:r>
-        <w:t xml:space="preserve"> der Gradient. </w:t>
-      </w:r>
-      <w:proofErr w:type="spellStart"/>
-      <w:r>
-        <w:t>Fuer</w:t>
-      </w:r>
-      <w:proofErr w:type="spellEnd"/>
-      <w:r>
-        <w:t xml:space="preserve"> ein Surrogat </w:t>
-      </w:r>
-      <w:proofErr w:type="spellStart"/>
-      <w:r>
-        <w:t>heisst</w:t>
-      </w:r>
-      <w:proofErr w:type="spellEnd"/>
-    </w:p>
-    <w:p>
-      <w:proofErr w:type="gramStart"/>
-      <w:r>
-        <w:t>das</w:t>
-      </w:r>
-      <w:proofErr w:type="gramEnd"/>
-      <w:r>
-        <w:t xml:space="preserve">: Lernziel ist </w:t>
-      </w:r>
-      <w:proofErr w:type="spellStart"/>
-      <w:r>
-        <w:t>phi</w:t>
-      </w:r>
-      <w:proofErr w:type="spellEnd"/>
-      <w:r>
-        <w:t xml:space="preserve"> ohne Mittelwert, nicht </w:t>
-      </w:r>
-      <w:proofErr w:type="spellStart"/>
-      <w:r>
-        <w:t>phi</w:t>
-      </w:r>
-      <w:proofErr w:type="spellEnd"/>
-      <w:r>
-        <w:t>.</w:t>
+      <w:r>
+        <w:t>phi traegt einen Offset: min = 1.9502e+07 V, Spannweite = 4.6190e+07 V.</w:t>
+      </w:r>
+    </w:p>
+    <w:p>
+      <w:r>
+        <w:t>Die integrierte Greensche Funktion ist nur bis auf eine Konstante bestimmt --</w:t>
+      </w:r>
+    </w:p>
+    <w:p>
+      <w:r>
+        <w:t>physikalisch relevant ist ausschliesslich der Gradient. Fuer ein Surrogat heisst</w:t>
+      </w:r>
+    </w:p>
+    <w:p>
+      <w:r>
+        <w:t>das: Lernziel ist phi ohne Mittelwert, nicht phi.</w:t>
       </w:r>
       <w:r>
         <w:t>“</w:t>
@@ -480,13 +311,8 @@
         <w:t>PDE (</w:t>
       </w:r>
       <w:r>
-        <w:t>in _</w:t>
-      </w:r>
-      <w:proofErr w:type="spellStart"/>
-      <w:r>
-        <w:t>integrated_green_function</w:t>
-      </w:r>
-      <w:proofErr w:type="spellEnd"/>
+        <w:t>in _integrated_green_function</w:t>
+      </w:r>
       <w:r>
         <w:t xml:space="preserve">) </w:t>
       </w:r>
@@ -497,83 +323,25 @@
         <w:t>anisotrop, d.h. Feldstärke richt</w:t>
       </w:r>
       <w:r>
-        <w:t xml:space="preserve">ungsabhängig sein, da [dx, </w:t>
-      </w:r>
-      <w:proofErr w:type="spellStart"/>
-      <w:r>
-        <w:t>dy</w:t>
-      </w:r>
-      <w:proofErr w:type="spellEnd"/>
-      <w:r>
-        <w:t xml:space="preserve">, </w:t>
-      </w:r>
-      <w:proofErr w:type="spellStart"/>
+        <w:t xml:space="preserve">ungsabhängig sein, da [dx, dy, </w:t>
+      </w:r>
       <w:r>
         <w:rPr>
           <w:b/>
         </w:rPr>
         <w:t>dtau</w:t>
       </w:r>
-      <w:proofErr w:type="spellEnd"/>
-      <w:r>
-        <w:t xml:space="preserve">] = [dx, </w:t>
-      </w:r>
-      <w:proofErr w:type="spellStart"/>
-      <w:r>
-        <w:t>dy</w:t>
-      </w:r>
-      <w:proofErr w:type="spellEnd"/>
-      <w:r>
-        <w:t xml:space="preserve">, </w:t>
-      </w:r>
-      <w:proofErr w:type="spellStart"/>
+      <w:r>
+        <w:t xml:space="preserve">] = [dx, dy, </w:t>
+      </w:r>
       <w:r>
         <w:rPr>
           <w:b/>
         </w:rPr>
-        <w:t>dz</w:t>
-      </w:r>
-      <w:proofErr w:type="spellEnd"/>
-      <w:r>
-        <w:rPr>
-          <w:b/>
-        </w:rPr>
-        <w:t xml:space="preserve"> * </w:t>
-      </w:r>
-      <w:proofErr w:type="spellStart"/>
-      <w:r>
-        <w:rPr>
-          <w:b/>
-        </w:rPr>
-        <w:t>gamma</w:t>
-      </w:r>
-      <w:proofErr w:type="spellEnd"/>
-      <w:r>
-        <w:t xml:space="preserve">], wenn </w:t>
-      </w:r>
-      <w:proofErr w:type="spellStart"/>
-      <w:r>
-        <w:t>gamma</w:t>
-      </w:r>
-      <w:proofErr w:type="spellEnd"/>
-      <w:r>
-        <w:t xml:space="preserve"> sehr klein oder sehr groß. Das kann andere Anforderungen (hinsichtlich der numerischen Lösbarkeit) an den zu trainierenden </w:t>
-      </w:r>
-      <w:proofErr w:type="spellStart"/>
-      <w:r>
-        <w:t>Neural</w:t>
-      </w:r>
-      <w:proofErr w:type="spellEnd"/>
-      <w:r>
-        <w:t xml:space="preserve"> Operator stellen, der den bisherigen numerischen Solver in _</w:t>
-      </w:r>
-      <w:proofErr w:type="spellStart"/>
-      <w:r>
-        <w:t>solve_poisson_equation</w:t>
-      </w:r>
-      <w:proofErr w:type="spellEnd"/>
-      <w:r>
-        <w:t xml:space="preserve"> ersetzen soll.</w:t>
+        <w:t>dz * gamma</w:t>
+      </w:r>
+      <w:r>
+        <w:t>], wenn gamma sehr klein oder sehr groß. Das kann andere Anforderungen (hinsichtlich der numerischen Lösbarkeit) an den zu trainierenden Neural Operator stellen, der den bisherigen numerischen Solver in _solve_poisson_equation ersetzen soll.</w:t>
       </w:r>
     </w:p>
     <w:p/>
@@ -588,16 +356,8 @@
         <w:rPr>
           <w:lang w:val="en-US"/>
         </w:rPr>
-        <w:t xml:space="preserve">Class </w:t>
-      </w:r>
-      <w:proofErr w:type="spellStart"/>
-      <w:r>
-        <w:rPr>
-          <w:lang w:val="en-US"/>
-        </w:rPr>
-        <w:t>SurrogateSpaceChargeKick</w:t>
-      </w:r>
-      <w:proofErr w:type="spellEnd"/>
+        <w:t>Class SurrogateSpaceChargeKick</w:t>
+      </w:r>
     </w:p>
     <w:p>
       <w:pPr>
@@ -608,18 +368,8 @@
         </w:numPr>
       </w:pPr>
       <w:r>
-        <w:t xml:space="preserve">bisher in </w:t>
-      </w:r>
-      <w:proofErr w:type="spellStart"/>
-      <w:r>
-        <w:t>cheetah_</w:t>
-      </w:r>
-      <w:proofErr w:type="gramStart"/>
-      <w:r>
-        <w:t>test.ipynb</w:t>
-      </w:r>
-      <w:proofErr w:type="spellEnd"/>
-      <w:proofErr w:type="gramEnd"/>
+        <w:t>bisher in cheetah_test.ipynb</w:t>
+      </w:r>
     </w:p>
     <w:p>
       <w:pPr>
@@ -630,15 +380,7 @@
         </w:numPr>
       </w:pPr>
       <w:r>
-        <w:t>In ein Eigenes .</w:t>
-      </w:r>
-      <w:proofErr w:type="spellStart"/>
-      <w:r>
-        <w:t>py</w:t>
-      </w:r>
-      <w:proofErr w:type="spellEnd"/>
-      <w:r>
-        <w:t xml:space="preserve"> überfü</w:t>
+        <w:t>In ein Eigenes .py überfü</w:t>
       </w:r>
       <w:r>
         <w:t>hren oder in space_charge_kick.p</w:t>
@@ -659,18 +401,11 @@
         <w:t>ist ein Child</w:t>
       </w:r>
       <w:r>
-        <w:t xml:space="preserve"> von </w:t>
-      </w:r>
-      <w:proofErr w:type="spellStart"/>
-      <w:proofErr w:type="gramStart"/>
-      <w:r>
-        <w:t>cheetah.</w:t>
+        <w:t xml:space="preserve"> von cheetah.</w:t>
       </w:r>
       <w:r>
         <w:t>SpaceChargeKick</w:t>
       </w:r>
-      <w:proofErr w:type="spellEnd"/>
-      <w:proofErr w:type="gramEnd"/>
     </w:p>
     <w:p>
       <w:pPr>
@@ -681,23 +416,7 @@
         </w:numPr>
       </w:pPr>
       <w:r>
-        <w:t>überschreibt _</w:t>
-      </w:r>
-      <w:proofErr w:type="spellStart"/>
-      <w:r>
-        <w:t>solve_poisson_equation</w:t>
-      </w:r>
-      <w:proofErr w:type="spellEnd"/>
-      <w:r>
-        <w:t xml:space="preserve"> (und __</w:t>
-      </w:r>
-      <w:proofErr w:type="spellStart"/>
-      <w:r>
-        <w:t>init</w:t>
-      </w:r>
-      <w:proofErr w:type="spellEnd"/>
-      <w:r>
-        <w:t>__),</w:t>
+        <w:t>überschreibt _solve_poisson_equation (und __init__),</w:t>
       </w:r>
     </w:p>
     <w:p>
@@ -709,57 +428,7 @@
         </w:numPr>
       </w:pPr>
       <w:r>
-        <w:t xml:space="preserve">um - sobald realisiert - eigenen Solver (d.h. </w:t>
-      </w:r>
-      <w:proofErr w:type="spellStart"/>
-      <w:r>
-        <w:t>Neural</w:t>
-      </w:r>
-      <w:proofErr w:type="spellEnd"/>
-      <w:r>
-        <w:t xml:space="preserve"> Operator) anzuwenden, wobei </w:t>
-      </w:r>
-      <w:proofErr w:type="spellStart"/>
-      <w:proofErr w:type="gramStart"/>
-      <w:r>
-        <w:t>solver</w:t>
-      </w:r>
-      <w:proofErr w:type="spellEnd"/>
-      <w:r>
-        <w:t>(</w:t>
-      </w:r>
-      <w:proofErr w:type="spellStart"/>
-      <w:proofErr w:type="gramEnd"/>
-      <w:r>
-        <w:t>rho</w:t>
-      </w:r>
-      <w:proofErr w:type="spellEnd"/>
-      <w:r>
-        <w:t xml:space="preserve">, </w:t>
-      </w:r>
-      <w:proofErr w:type="spellStart"/>
-      <w:r>
-        <w:t>cell_size</w:t>
-      </w:r>
-      <w:proofErr w:type="spellEnd"/>
-      <w:r>
-        <w:t xml:space="preserve">, </w:t>
-      </w:r>
-      <w:proofErr w:type="spellStart"/>
-      <w:r>
-        <w:t>beam.relativistic_gamma</w:t>
-      </w:r>
-      <w:proofErr w:type="spellEnd"/>
-      <w:r>
-        <w:t xml:space="preserve">, </w:t>
-      </w:r>
-      <w:proofErr w:type="spellStart"/>
-      <w:r>
-        <w:t>exact</w:t>
-      </w:r>
-      <w:proofErr w:type="spellEnd"/>
-      <w:r>
-        <w:t>)</w:t>
+        <w:t>um - sobald realisiert - eigenen Solver (d.h. Neural Operator) anzuwenden, wobei solver(rho, cell_size, beam.relativistic_gamma, exact)</w:t>
       </w:r>
     </w:p>
     <w:p>
@@ -771,61 +440,13 @@
         </w:numPr>
       </w:pPr>
       <w:r>
-        <w:t xml:space="preserve">per </w:t>
-      </w:r>
-      <w:proofErr w:type="spellStart"/>
-      <w:r>
-        <w:t>default</w:t>
-      </w:r>
-      <w:proofErr w:type="spellEnd"/>
-      <w:r>
-        <w:t xml:space="preserve"> „</w:t>
-      </w:r>
-      <w:proofErr w:type="spellStart"/>
-      <w:r>
-        <w:t>solver</w:t>
-      </w:r>
-      <w:proofErr w:type="spellEnd"/>
-      <w:r>
-        <w:t xml:space="preserve"> = None“, d.h. Solver/ </w:t>
-      </w:r>
-      <w:proofErr w:type="spellStart"/>
-      <w:r>
-        <w:t>Neural</w:t>
-      </w:r>
-      <w:proofErr w:type="spellEnd"/>
-      <w:r>
-        <w:t xml:space="preserve"> Opera</w:t>
+        <w:t>per default „solver = None“, d.h. Solver/ Neural Opera</w:t>
       </w:r>
       <w:r>
         <w:t>tor noch nicht vor</w:t>
       </w:r>
       <w:r>
-        <w:t xml:space="preserve">handen – </w:t>
-      </w:r>
-      <w:proofErr w:type="spellStart"/>
-      <w:r>
-        <w:t>Fallback</w:t>
-      </w:r>
-      <w:proofErr w:type="spellEnd"/>
-      <w:r>
-        <w:t xml:space="preserve"> auf _</w:t>
-      </w:r>
-      <w:proofErr w:type="spellStart"/>
-      <w:r>
-        <w:t>solve_poisson_equation</w:t>
-      </w:r>
-      <w:proofErr w:type="spellEnd"/>
-      <w:r>
-        <w:t xml:space="preserve">-Methode bzw. </w:t>
-      </w:r>
-      <w:proofErr w:type="spellStart"/>
-      <w:r>
-        <w:t>solver</w:t>
-      </w:r>
-      <w:proofErr w:type="spellEnd"/>
-      <w:r>
-        <w:t xml:space="preserve"> davon aus Parent-Class</w:t>
+        <w:t>handen – Fallback auf _solve_poisson_equation-Methode bzw. solver davon aus Parent-Class</w:t>
       </w:r>
     </w:p>
     <w:p>
@@ -839,56 +460,12 @@
           <w:lang w:val="en-US"/>
         </w:rPr>
       </w:pPr>
-      <w:proofErr w:type="spellStart"/>
-      <w:r>
-        <w:rPr>
-          <w:lang w:val="en-US"/>
-        </w:rPr>
-        <w:t>Methode</w:t>
-      </w:r>
-      <w:proofErr w:type="spellEnd"/>
-      <w:r>
-        <w:rPr>
-          <w:lang w:val="en-US"/>
-        </w:rPr>
-        <w:t xml:space="preserve"> </w:t>
-      </w:r>
-      <w:proofErr w:type="spellStart"/>
-      <w:r>
-        <w:rPr>
-          <w:lang w:val="en-US"/>
-        </w:rPr>
-        <w:t>build_segment</w:t>
-      </w:r>
-      <w:proofErr w:type="spellEnd"/>
-      <w:r>
-        <w:rPr>
-          <w:lang w:val="en-US"/>
-        </w:rPr>
-        <w:t>(</w:t>
-      </w:r>
-      <w:proofErr w:type="spellStart"/>
-      <w:r>
-        <w:rPr>
-          <w:lang w:val="en-US"/>
-        </w:rPr>
-        <w:t>kick_factory</w:t>
-      </w:r>
-      <w:proofErr w:type="spellEnd"/>
-      <w:r>
-        <w:rPr>
-          <w:lang w:val="en-US"/>
-        </w:rPr>
-        <w:t xml:space="preserve">) </w:t>
-      </w:r>
-      <w:proofErr w:type="spellStart"/>
-      <w:r>
-        <w:rPr>
-          <w:lang w:val="en-US"/>
-        </w:rPr>
-        <w:t>hinzugefügt</w:t>
-      </w:r>
-      <w:proofErr w:type="spellEnd"/>
+      <w:r>
+        <w:rPr>
+          <w:lang w:val="en-US"/>
+        </w:rPr>
+        <w:t>Methode build_segment(kick_factory) hinzugefügt</w:t>
+      </w:r>
     </w:p>
     <w:p>
       <w:pPr>
@@ -898,13 +475,8 @@
           <w:numId w:val="2"/>
         </w:numPr>
       </w:pPr>
-      <w:proofErr w:type="spellStart"/>
-      <w:r>
-        <w:t>kick_factory</w:t>
-      </w:r>
-      <w:proofErr w:type="spellEnd"/>
-      <w:r>
-        <w:t>:</w:t>
+      <w:r>
+        <w:t>kick_factory:</w:t>
       </w:r>
     </w:p>
     <w:p>
@@ -916,13 +488,8 @@
         </w:numPr>
       </w:pPr>
       <w:r>
-        <w:t xml:space="preserve">entweder </w:t>
-      </w:r>
-      <w:proofErr w:type="spellStart"/>
-      <w:r>
-        <w:t>SurrogateSpaceChargeKick</w:t>
-      </w:r>
-      <w:proofErr w:type="spellEnd"/>
+        <w:t>entweder SurrogateSpaceChargeKick</w:t>
+      </w:r>
     </w:p>
     <w:p>
       <w:pPr>
@@ -933,15 +500,8 @@
         </w:numPr>
       </w:pPr>
       <w:r>
-        <w:t xml:space="preserve">oder </w:t>
-      </w:r>
-      <w:proofErr w:type="spellStart"/>
-      <w:proofErr w:type="gramStart"/>
-      <w:r>
-        <w:t>cheetah.SpaceChargeKick</w:t>
-      </w:r>
-      <w:proofErr w:type="spellEnd"/>
-      <w:proofErr w:type="gramEnd"/>
+        <w:t>oder cheetah.SpaceChargeKick</w:t>
+      </w:r>
     </w:p>
     <w:p>
       <w:pPr>
@@ -951,31 +511,8 @@
           <w:numId w:val="2"/>
         </w:numPr>
       </w:pPr>
-      <w:proofErr w:type="spellStart"/>
-      <w:r>
-        <w:t>return</w:t>
-      </w:r>
-      <w:proofErr w:type="spellEnd"/>
-      <w:r>
-        <w:t xml:space="preserve"> </w:t>
-      </w:r>
-      <w:proofErr w:type="spellStart"/>
-      <w:proofErr w:type="gramStart"/>
-      <w:r>
-        <w:t>cheetah.Segment</w:t>
-      </w:r>
-      <w:proofErr w:type="spellEnd"/>
-      <w:proofErr w:type="gramEnd"/>
-      <w:r>
-        <w:t>(</w:t>
-      </w:r>
-      <w:proofErr w:type="spellStart"/>
-      <w:r>
-        <w:t>elements</w:t>
-      </w:r>
-      <w:proofErr w:type="spellEnd"/>
-      <w:r>
-        <w:t>=[…])</w:t>
+      <w:r>
+        <w:t>return cheetah.Segment(elements=[…])</w:t>
       </w:r>
     </w:p>
     <w:p>
@@ -988,13 +525,8 @@
       </w:pPr>
       <w:r>
         <w:lastRenderedPageBreak/>
-        <w:t xml:space="preserve">enthält entsprechenden </w:t>
-      </w:r>
-      <w:proofErr w:type="spellStart"/>
-      <w:r>
-        <w:t>kick_factory</w:t>
-      </w:r>
-      <w:proofErr w:type="spellEnd"/>
+        <w:t>enthält entsprechenden kick_factory</w:t>
+      </w:r>
     </w:p>
     <w:p>
       <w:pPr>
@@ -1005,21 +537,8 @@
         </w:numPr>
       </w:pPr>
       <w:r>
-        <w:t xml:space="preserve">ggf. muss Anordnung innerhalb </w:t>
-      </w:r>
-      <w:proofErr w:type="spellStart"/>
-      <w:r>
-        <w:t>elements</w:t>
-      </w:r>
-      <w:proofErr w:type="spellEnd"/>
-      <w:r>
-        <w:t xml:space="preserve"> angepasst werden an das jeweilige </w:t>
-      </w:r>
-      <w:proofErr w:type="spellStart"/>
-      <w:r>
-        <w:t>Lattice</w:t>
-      </w:r>
-      <w:proofErr w:type="spellEnd"/>
+        <w:t>ggf. muss Anordnung innerhalb elements angepasst werden an das jeweilige Lattice</w:t>
+      </w:r>
     </w:p>
     <w:p>
       <w:pPr>
@@ -1052,47 +571,7 @@
           <w:sz w:val="21"/>
           <w:szCs w:val="21"/>
         </w:rPr>
-        <w:t xml:space="preserve"># Minimales </w:t>
-      </w:r>
-      <w:proofErr w:type="spellStart"/>
-      <w:r>
-        <w:rPr>
-          <w:rFonts w:ascii="Consolas" w:hAnsi="Consolas"/>
-          <w:color w:val="8B949E"/>
-          <w:sz w:val="21"/>
-          <w:szCs w:val="21"/>
-        </w:rPr>
-        <w:t>Lattice</w:t>
-      </w:r>
-      <w:proofErr w:type="spellEnd"/>
-      <w:r>
-        <w:rPr>
-          <w:rFonts w:ascii="Consolas" w:hAnsi="Consolas"/>
-          <w:color w:val="8B949E"/>
-          <w:sz w:val="21"/>
-          <w:szCs w:val="21"/>
-        </w:rPr>
-        <w:t xml:space="preserve"> mit </w:t>
-      </w:r>
-      <w:proofErr w:type="spellStart"/>
-      <w:r>
-        <w:rPr>
-          <w:rFonts w:ascii="Consolas" w:hAnsi="Consolas"/>
-          <w:color w:val="8B949E"/>
-          <w:sz w:val="21"/>
-          <w:szCs w:val="21"/>
-        </w:rPr>
-        <w:t>SpaceChargeKick</w:t>
-      </w:r>
-      <w:proofErr w:type="spellEnd"/>
-      <w:r>
-        <w:rPr>
-          <w:rFonts w:ascii="Consolas" w:hAnsi="Consolas"/>
-          <w:color w:val="8B949E"/>
-          <w:sz w:val="21"/>
-          <w:szCs w:val="21"/>
-        </w:rPr>
-        <w:t>.</w:t>
+        <w:t># Minimales Lattice mit SpaceChargeKick.</w:t>
       </w:r>
     </w:p>
     <w:p>
@@ -1116,73 +595,7 @@
           <w:szCs w:val="21"/>
           <w:lang w:val="en-US"/>
         </w:rPr>
-        <w:t xml:space="preserve"># Aufbau </w:t>
-      </w:r>
-      <w:proofErr w:type="spellStart"/>
-      <w:r>
-        <w:rPr>
-          <w:rFonts w:ascii="Consolas" w:hAnsi="Consolas"/>
-          <w:color w:val="8B949E"/>
-          <w:sz w:val="21"/>
-          <w:szCs w:val="21"/>
-          <w:lang w:val="en-US"/>
-        </w:rPr>
-        <w:t>uebernommen</w:t>
-      </w:r>
-      <w:proofErr w:type="spellEnd"/>
-      <w:r>
-        <w:rPr>
-          <w:rFonts w:ascii="Consolas" w:hAnsi="Consolas"/>
-          <w:color w:val="8B949E"/>
-          <w:sz w:val="21"/>
-          <w:szCs w:val="21"/>
-          <w:lang w:val="en-US"/>
-        </w:rPr>
-        <w:t xml:space="preserve"> </w:t>
-      </w:r>
-      <w:proofErr w:type="spellStart"/>
-      <w:r>
-        <w:rPr>
-          <w:rFonts w:ascii="Consolas" w:hAnsi="Consolas"/>
-          <w:color w:val="8B949E"/>
-          <w:sz w:val="21"/>
-          <w:szCs w:val="21"/>
-          <w:lang w:val="en-US"/>
-        </w:rPr>
-        <w:t>aus</w:t>
-      </w:r>
-      <w:proofErr w:type="spellEnd"/>
-      <w:r>
-        <w:rPr>
-          <w:rFonts w:ascii="Consolas" w:hAnsi="Consolas"/>
-          <w:color w:val="8B949E"/>
-          <w:sz w:val="21"/>
-          <w:szCs w:val="21"/>
-          <w:lang w:val="en-US"/>
-        </w:rPr>
-        <w:t xml:space="preserve"> </w:t>
-      </w:r>
-      <w:proofErr w:type="gramStart"/>
-      <w:r>
-        <w:rPr>
-          <w:rFonts w:ascii="Consolas" w:hAnsi="Consolas"/>
-          <w:color w:val="8B949E"/>
-          <w:sz w:val="21"/>
-          <w:szCs w:val="21"/>
-          <w:lang w:val="en-US"/>
-        </w:rPr>
-        <w:t>tests/test_space_charge_kick.py::</w:t>
-      </w:r>
-      <w:proofErr w:type="gramEnd"/>
-      <w:r>
-        <w:rPr>
-          <w:rFonts w:ascii="Consolas" w:hAnsi="Consolas"/>
-          <w:color w:val="8B949E"/>
-          <w:sz w:val="21"/>
-          <w:szCs w:val="21"/>
-          <w:lang w:val="en-US"/>
-        </w:rPr>
-        <w:t>test_cold_uniform_beam_expansion:</w:t>
+        <w:t># Aufbau uebernommen aus tests/test_space_charge_kick.py::test_cold_uniform_beam_expansion:</w:t>
       </w:r>
     </w:p>
     <w:p>
@@ -1204,107 +617,7 @@
           <w:sz w:val="21"/>
           <w:szCs w:val="21"/>
         </w:rPr>
-        <w:t xml:space="preserve"># ein kalter, uniform </w:t>
-      </w:r>
-      <w:proofErr w:type="spellStart"/>
-      <w:r>
-        <w:rPr>
-          <w:rFonts w:ascii="Consolas" w:hAnsi="Consolas"/>
-          <w:color w:val="8B949E"/>
-          <w:sz w:val="21"/>
-          <w:szCs w:val="21"/>
-        </w:rPr>
-        <w:t>gefuellter</w:t>
-      </w:r>
-      <w:proofErr w:type="spellEnd"/>
-      <w:r>
-        <w:rPr>
-          <w:rFonts w:ascii="Consolas" w:hAnsi="Consolas"/>
-          <w:color w:val="8B949E"/>
-          <w:sz w:val="21"/>
-          <w:szCs w:val="21"/>
-        </w:rPr>
-        <w:t xml:space="preserve"> </w:t>
-      </w:r>
-      <w:proofErr w:type="spellStart"/>
-      <w:r>
-        <w:rPr>
-          <w:rFonts w:ascii="Consolas" w:hAnsi="Consolas"/>
-          <w:color w:val="8B949E"/>
-          <w:sz w:val="21"/>
-          <w:szCs w:val="21"/>
-        </w:rPr>
-        <w:t>Bunch</w:t>
-      </w:r>
-      <w:proofErr w:type="spellEnd"/>
-      <w:r>
-        <w:rPr>
-          <w:rFonts w:ascii="Consolas" w:hAnsi="Consolas"/>
-          <w:color w:val="8B949E"/>
-          <w:sz w:val="21"/>
-          <w:szCs w:val="21"/>
-        </w:rPr>
-        <w:t xml:space="preserve"> verdoppelt </w:t>
-      </w:r>
-      <w:proofErr w:type="spellStart"/>
-      <w:r>
-        <w:rPr>
-          <w:rFonts w:ascii="Consolas" w:hAnsi="Consolas"/>
-          <w:color w:val="8B949E"/>
-          <w:sz w:val="21"/>
-          <w:szCs w:val="21"/>
-        </w:rPr>
-        <w:t>ueber</w:t>
-      </w:r>
-      <w:proofErr w:type="spellEnd"/>
-      <w:r>
-        <w:rPr>
-          <w:rFonts w:ascii="Consolas" w:hAnsi="Consolas"/>
-          <w:color w:val="8B949E"/>
-          <w:sz w:val="21"/>
-          <w:szCs w:val="21"/>
-        </w:rPr>
-        <w:t xml:space="preserve"> `</w:t>
-      </w:r>
-      <w:proofErr w:type="spellStart"/>
-      <w:r>
-        <w:rPr>
-          <w:rFonts w:ascii="Consolas" w:hAnsi="Consolas"/>
-          <w:color w:val="8B949E"/>
-          <w:sz w:val="21"/>
-          <w:szCs w:val="21"/>
-        </w:rPr>
-        <w:t>section_length</w:t>
-      </w:r>
-      <w:proofErr w:type="spellEnd"/>
-      <w:r>
-        <w:rPr>
-          <w:rFonts w:ascii="Consolas" w:hAnsi="Consolas"/>
-          <w:color w:val="8B949E"/>
-          <w:sz w:val="21"/>
-          <w:szCs w:val="21"/>
-        </w:rPr>
-        <w:t xml:space="preserve">` seine </w:t>
-      </w:r>
-      <w:proofErr w:type="spellStart"/>
-      <w:r>
-        <w:rPr>
-          <w:rFonts w:ascii="Consolas" w:hAnsi="Consolas"/>
-          <w:color w:val="8B949E"/>
-          <w:sz w:val="21"/>
-          <w:szCs w:val="21"/>
-        </w:rPr>
-        <w:t>Groesse</w:t>
-      </w:r>
-      <w:proofErr w:type="spellEnd"/>
-      <w:r>
-        <w:rPr>
-          <w:rFonts w:ascii="Consolas" w:hAnsi="Consolas"/>
-          <w:color w:val="8B949E"/>
-          <w:sz w:val="21"/>
-          <w:szCs w:val="21"/>
-        </w:rPr>
-        <w:t>.</w:t>
+        <w:t># ein kalter, uniform gefuellter Bunch verdoppelt ueber `section_length` seine Groesse.</w:t>
       </w:r>
     </w:p>
     <w:p>
@@ -1326,27 +639,7 @@
           <w:sz w:val="21"/>
           <w:szCs w:val="21"/>
         </w:rPr>
-        <w:t xml:space="preserve"># Damit ist "einen Kick tracken" nicht nur </w:t>
-      </w:r>
-      <w:proofErr w:type="spellStart"/>
-      <w:r>
-        <w:rPr>
-          <w:rFonts w:ascii="Consolas" w:hAnsi="Consolas"/>
-          <w:color w:val="8B949E"/>
-          <w:sz w:val="21"/>
-          <w:szCs w:val="21"/>
-        </w:rPr>
-        <w:t>ausgefuehrt</w:t>
-      </w:r>
-      <w:proofErr w:type="spellEnd"/>
-      <w:r>
-        <w:rPr>
-          <w:rFonts w:ascii="Consolas" w:hAnsi="Consolas"/>
-          <w:color w:val="8B949E"/>
-          <w:sz w:val="21"/>
-          <w:szCs w:val="21"/>
-        </w:rPr>
-        <w:t>, sondern gegen eine analytische</w:t>
+        <w:t># Damit ist "einen Kick tracken" nicht nur ausgefuehrt, sondern gegen eine analytische</w:t>
       </w:r>
     </w:p>
     <w:p>
@@ -1368,27 +661,7 @@
           <w:sz w:val="21"/>
           <w:szCs w:val="21"/>
         </w:rPr>
-        <w:t xml:space="preserve"># Referenz </w:t>
-      </w:r>
-      <w:proofErr w:type="spellStart"/>
-      <w:r>
-        <w:rPr>
-          <w:rFonts w:ascii="Consolas" w:hAnsi="Consolas"/>
-          <w:color w:val="8B949E"/>
-          <w:sz w:val="21"/>
-          <w:szCs w:val="21"/>
-        </w:rPr>
-        <w:t>geprueft</w:t>
-      </w:r>
-      <w:proofErr w:type="spellEnd"/>
-      <w:r>
-        <w:rPr>
-          <w:rFonts w:ascii="Consolas" w:hAnsi="Consolas"/>
-          <w:color w:val="8B949E"/>
-          <w:sz w:val="21"/>
-          <w:szCs w:val="21"/>
-        </w:rPr>
-        <w:t>.</w:t>
+        <w:t># Referenz geprueft.</w:t>
       </w:r>
     </w:p>
     <w:p>
@@ -1441,29 +714,7 @@
           <w:sz w:val="21"/>
           <w:szCs w:val="21"/>
         </w:rPr>
-        <w:t xml:space="preserve"> </w:t>
-      </w:r>
-      <w:proofErr w:type="spellStart"/>
-      <w:proofErr w:type="gramStart"/>
-      <w:r>
-        <w:rPr>
-          <w:rFonts w:ascii="Consolas" w:hAnsi="Consolas"/>
-          <w:color w:val="BBBEBF"/>
-          <w:sz w:val="21"/>
-          <w:szCs w:val="21"/>
-        </w:rPr>
-        <w:t>torch.tensor</w:t>
-      </w:r>
-      <w:proofErr w:type="spellEnd"/>
-      <w:proofErr w:type="gramEnd"/>
-      <w:r>
-        <w:rPr>
-          <w:rFonts w:ascii="Consolas" w:hAnsi="Consolas"/>
-          <w:color w:val="BBBEBF"/>
-          <w:sz w:val="21"/>
-          <w:szCs w:val="21"/>
-        </w:rPr>
-        <w:t>(</w:t>
+        <w:t xml:space="preserve"> torch.tensor(</w:t>
       </w:r>
       <w:r>
         <w:rPr>
@@ -1490,27 +741,7 @@
           <w:sz w:val="21"/>
           <w:szCs w:val="21"/>
         </w:rPr>
-        <w:t xml:space="preserve"># </w:t>
-      </w:r>
-      <w:proofErr w:type="spellStart"/>
-      <w:r>
-        <w:rPr>
-          <w:rFonts w:ascii="Consolas" w:hAnsi="Consolas"/>
-          <w:color w:val="8B949E"/>
-          <w:sz w:val="21"/>
-          <w:szCs w:val="21"/>
-        </w:rPr>
-        <w:t>Bunchradius</w:t>
-      </w:r>
-      <w:proofErr w:type="spellEnd"/>
-      <w:r>
-        <w:rPr>
-          <w:rFonts w:ascii="Consolas" w:hAnsi="Consolas"/>
-          <w:color w:val="8B949E"/>
-          <w:sz w:val="21"/>
-          <w:szCs w:val="21"/>
-        </w:rPr>
-        <w:t xml:space="preserve"> im Ruhesystem, m</w:t>
+        <w:t># Bunchradius im Ruhesystem, m</w:t>
       </w:r>
     </w:p>
     <w:p>
@@ -1564,31 +795,7 @@
           <w:szCs w:val="21"/>
           <w:lang w:val="en-US"/>
         </w:rPr>
-        <w:t xml:space="preserve"> </w:t>
-      </w:r>
-      <w:proofErr w:type="spellStart"/>
-      <w:proofErr w:type="gramStart"/>
-      <w:r>
-        <w:rPr>
-          <w:rFonts w:ascii="Consolas" w:hAnsi="Consolas"/>
-          <w:color w:val="BBBEBF"/>
-          <w:sz w:val="21"/>
-          <w:szCs w:val="21"/>
-          <w:lang w:val="en-US"/>
-        </w:rPr>
-        <w:t>torch.tensor</w:t>
-      </w:r>
-      <w:proofErr w:type="spellEnd"/>
-      <w:proofErr w:type="gramEnd"/>
-      <w:r>
-        <w:rPr>
-          <w:rFonts w:ascii="Consolas" w:hAnsi="Consolas"/>
-          <w:color w:val="BBBEBF"/>
-          <w:sz w:val="21"/>
-          <w:szCs w:val="21"/>
-          <w:lang w:val="en-US"/>
-        </w:rPr>
-        <w:t>(</w:t>
+        <w:t xml:space="preserve"> torch.tensor(</w:t>
       </w:r>
       <w:r>
         <w:rPr>
@@ -1672,31 +879,7 @@
           <w:szCs w:val="21"/>
           <w:lang w:val="en-US"/>
         </w:rPr>
-        <w:t xml:space="preserve"> </w:t>
-      </w:r>
-      <w:proofErr w:type="spellStart"/>
-      <w:proofErr w:type="gramStart"/>
-      <w:r>
-        <w:rPr>
-          <w:rFonts w:ascii="Consolas" w:hAnsi="Consolas"/>
-          <w:color w:val="BBBEBF"/>
-          <w:sz w:val="21"/>
-          <w:szCs w:val="21"/>
-          <w:lang w:val="en-US"/>
-        </w:rPr>
-        <w:t>torch.tensor</w:t>
-      </w:r>
-      <w:proofErr w:type="spellEnd"/>
-      <w:proofErr w:type="gramEnd"/>
-      <w:r>
-        <w:rPr>
-          <w:rFonts w:ascii="Consolas" w:hAnsi="Consolas"/>
-          <w:color w:val="BBBEBF"/>
-          <w:sz w:val="21"/>
-          <w:szCs w:val="21"/>
-          <w:lang w:val="en-US"/>
-        </w:rPr>
-        <w:t>(</w:t>
+        <w:t xml:space="preserve"> torch.tensor(</w:t>
       </w:r>
       <w:r>
         <w:rPr>
@@ -1982,31 +1165,7 @@
           <w:szCs w:val="21"/>
           <w:lang w:val="en-US"/>
         </w:rPr>
-        <w:t xml:space="preserve"> </w:t>
-      </w:r>
-      <w:proofErr w:type="spellStart"/>
-      <w:proofErr w:type="gramStart"/>
-      <w:r>
-        <w:rPr>
-          <w:rFonts w:ascii="Consolas" w:hAnsi="Consolas"/>
-          <w:color w:val="BBBEBF"/>
-          <w:sz w:val="21"/>
-          <w:szCs w:val="21"/>
-          <w:lang w:val="en-US"/>
-        </w:rPr>
-        <w:t>gamma.square</w:t>
-      </w:r>
-      <w:proofErr w:type="spellEnd"/>
-      <w:proofErr w:type="gramEnd"/>
-      <w:r>
-        <w:rPr>
-          <w:rFonts w:ascii="Consolas" w:hAnsi="Consolas"/>
-          <w:color w:val="BBBEBF"/>
-          <w:sz w:val="21"/>
-          <w:szCs w:val="21"/>
-          <w:lang w:val="en-US"/>
-        </w:rPr>
-        <w:t>().reciprocal()).sqrt()</w:t>
+        <w:t xml:space="preserve"> gamma.square().reciprocal()).sqrt()</w:t>
       </w:r>
     </w:p>
     <w:p>
@@ -2064,29 +1223,7 @@
           <w:szCs w:val="21"/>
           <w:lang w:val="en-US"/>
         </w:rPr>
-        <w:t xml:space="preserve"> </w:t>
-      </w:r>
-      <w:proofErr w:type="gramStart"/>
-      <w:r>
-        <w:rPr>
-          <w:rFonts w:ascii="Consolas" w:hAnsi="Consolas"/>
-          <w:color w:val="BBBEBF"/>
-          <w:sz w:val="21"/>
-          <w:szCs w:val="21"/>
-          <w:lang w:val="en-US"/>
-        </w:rPr>
-        <w:t>cheetah.ParticleBeam.uniform</w:t>
-      </w:r>
-      <w:proofErr w:type="gramEnd"/>
-      <w:r>
-        <w:rPr>
-          <w:rFonts w:ascii="Consolas" w:hAnsi="Consolas"/>
-          <w:color w:val="BBBEBF"/>
-          <w:sz w:val="21"/>
-          <w:szCs w:val="21"/>
-          <w:lang w:val="en-US"/>
-        </w:rPr>
-        <w:t>_3d_ellipsoid(</w:t>
+        <w:t xml:space="preserve"> cheetah.ParticleBeam.uniform_3d_ellipsoid(</w:t>
       </w:r>
     </w:p>
     <w:p>
@@ -2112,7 +1249,6 @@
         </w:rPr>
         <w:t xml:space="preserve">    </w:t>
       </w:r>
-      <w:proofErr w:type="spellStart"/>
       <w:r>
         <w:rPr>
           <w:rFonts w:ascii="Consolas" w:hAnsi="Consolas"/>
@@ -2123,7 +1259,6 @@
         </w:rPr>
         <w:t>num_particles</w:t>
       </w:r>
-      <w:proofErr w:type="spellEnd"/>
       <w:r>
         <w:rPr>
           <w:rFonts w:ascii="Consolas" w:hAnsi="Consolas"/>
@@ -2178,7 +1313,6 @@
         </w:rPr>
         <w:t xml:space="preserve">    </w:t>
       </w:r>
-      <w:proofErr w:type="spellStart"/>
       <w:r>
         <w:rPr>
           <w:rFonts w:ascii="Consolas" w:hAnsi="Consolas"/>
@@ -2189,7 +1323,6 @@
         </w:rPr>
         <w:t>total_charge</w:t>
       </w:r>
-      <w:proofErr w:type="spellEnd"/>
       <w:r>
         <w:rPr>
           <w:rFonts w:ascii="Consolas" w:hAnsi="Consolas"/>
@@ -2243,7 +1376,6 @@
         </w:rPr>
         <w:t xml:space="preserve">    </w:t>
       </w:r>
-      <w:proofErr w:type="spellStart"/>
       <w:r>
         <w:rPr>
           <w:rFonts w:ascii="Consolas" w:hAnsi="Consolas"/>
@@ -2253,7 +1385,6 @@
         </w:rPr>
         <w:t>energy</w:t>
       </w:r>
-      <w:proofErr w:type="spellEnd"/>
       <w:r>
         <w:rPr>
           <w:rFonts w:ascii="Consolas" w:hAnsi="Consolas"/>
@@ -2303,7 +1434,6 @@
         </w:rPr>
         <w:t xml:space="preserve">    </w:t>
       </w:r>
-      <w:proofErr w:type="spellStart"/>
       <w:r>
         <w:rPr>
           <w:rFonts w:ascii="Consolas" w:hAnsi="Consolas"/>
@@ -2313,7 +1443,6 @@
         </w:rPr>
         <w:t>radius_x</w:t>
       </w:r>
-      <w:proofErr w:type="spellEnd"/>
       <w:r>
         <w:rPr>
           <w:rFonts w:ascii="Consolas" w:hAnsi="Consolas"/>
@@ -2354,7 +1483,6 @@
         </w:rPr>
         <w:t xml:space="preserve">    </w:t>
       </w:r>
-      <w:proofErr w:type="spellStart"/>
       <w:r>
         <w:rPr>
           <w:rFonts w:ascii="Consolas" w:hAnsi="Consolas"/>
@@ -2364,7 +1492,6 @@
         </w:rPr>
         <w:t>radius_y</w:t>
       </w:r>
-      <w:proofErr w:type="spellEnd"/>
       <w:r>
         <w:rPr>
           <w:rFonts w:ascii="Consolas" w:hAnsi="Consolas"/>
@@ -2405,7 +1532,6 @@
         </w:rPr>
         <w:t xml:space="preserve">    </w:t>
       </w:r>
-      <w:proofErr w:type="spellStart"/>
       <w:r>
         <w:rPr>
           <w:rFonts w:ascii="Consolas" w:hAnsi="Consolas"/>
@@ -2415,7 +1541,6 @@
         </w:rPr>
         <w:t>radius_tau</w:t>
       </w:r>
-      <w:proofErr w:type="spellEnd"/>
       <w:r>
         <w:rPr>
           <w:rFonts w:ascii="Consolas" w:hAnsi="Consolas"/>
@@ -2450,27 +1575,7 @@
           <w:sz w:val="21"/>
           <w:szCs w:val="21"/>
         </w:rPr>
-        <w:t xml:space="preserve"> </w:t>
-      </w:r>
-      <w:proofErr w:type="spellStart"/>
-      <w:r>
-        <w:rPr>
-          <w:rFonts w:ascii="Consolas" w:hAnsi="Consolas"/>
-          <w:color w:val="BBBEBF"/>
-          <w:sz w:val="21"/>
-          <w:szCs w:val="21"/>
-        </w:rPr>
-        <w:t>gamma</w:t>
-      </w:r>
-      <w:proofErr w:type="spellEnd"/>
-      <w:r>
-        <w:rPr>
-          <w:rFonts w:ascii="Consolas" w:hAnsi="Consolas"/>
-          <w:color w:val="BBBEBF"/>
-          <w:sz w:val="21"/>
-          <w:szCs w:val="21"/>
-        </w:rPr>
-        <w:t xml:space="preserve"> </w:t>
+        <w:t xml:space="preserve"> gamma </w:t>
       </w:r>
       <w:r>
         <w:rPr>
@@ -2488,28 +1593,7 @@
           <w:sz w:val="21"/>
           <w:szCs w:val="21"/>
         </w:rPr>
-        <w:t xml:space="preserve"> </w:t>
-      </w:r>
-      <w:proofErr w:type="spellStart"/>
-      <w:proofErr w:type="gramStart"/>
-      <w:r>
-        <w:rPr>
-          <w:rFonts w:ascii="Consolas" w:hAnsi="Consolas"/>
-          <w:color w:val="BBBEBF"/>
-          <w:sz w:val="21"/>
-          <w:szCs w:val="21"/>
-        </w:rPr>
-        <w:t>beta</w:t>
-      </w:r>
-      <w:proofErr w:type="spellEnd"/>
-      <w:r>
-        <w:rPr>
-          <w:rFonts w:ascii="Consolas" w:hAnsi="Consolas"/>
-          <w:color w:val="BBBEBF"/>
-          <w:sz w:val="21"/>
-          <w:szCs w:val="21"/>
-        </w:rPr>
-        <w:t>,  </w:t>
+        <w:t xml:space="preserve"> beta,  </w:t>
       </w:r>
       <w:r>
         <w:rPr>
@@ -2518,37 +1602,7 @@
           <w:sz w:val="21"/>
           <w:szCs w:val="21"/>
         </w:rPr>
-        <w:t>#</w:t>
-      </w:r>
-      <w:proofErr w:type="gramEnd"/>
-      <w:r>
-        <w:rPr>
-          <w:rFonts w:ascii="Consolas" w:hAnsi="Consolas"/>
-          <w:color w:val="8B949E"/>
-          <w:sz w:val="21"/>
-          <w:szCs w:val="21"/>
-        </w:rPr>
-        <w:t xml:space="preserve"> </w:t>
-      </w:r>
-      <w:proofErr w:type="spellStart"/>
-      <w:r>
-        <w:rPr>
-          <w:rFonts w:ascii="Consolas" w:hAnsi="Consolas"/>
-          <w:color w:val="8B949E"/>
-          <w:sz w:val="21"/>
-          <w:szCs w:val="21"/>
-        </w:rPr>
-        <w:t>Bunchlaenge</w:t>
-      </w:r>
-      <w:proofErr w:type="spellEnd"/>
-      <w:r>
-        <w:rPr>
-          <w:rFonts w:ascii="Consolas" w:hAnsi="Consolas"/>
-          <w:color w:val="8B949E"/>
-          <w:sz w:val="21"/>
-          <w:szCs w:val="21"/>
-        </w:rPr>
-        <w:t xml:space="preserve"> im Laborsystem</w:t>
+        <w:t># Bunchlaenge im Laborsystem</w:t>
       </w:r>
     </w:p>
     <w:p>
@@ -2572,7 +1626,6 @@
         </w:rPr>
         <w:t xml:space="preserve">    </w:t>
       </w:r>
-      <w:proofErr w:type="spellStart"/>
       <w:r>
         <w:rPr>
           <w:rFonts w:ascii="Consolas" w:hAnsi="Consolas"/>
@@ -2582,7 +1635,6 @@
         </w:rPr>
         <w:t>sigma_px</w:t>
       </w:r>
-      <w:proofErr w:type="spellEnd"/>
       <w:r>
         <w:rPr>
           <w:rFonts w:ascii="Consolas" w:hAnsi="Consolas"/>
@@ -2592,27 +1644,14 @@
         </w:rPr>
         <w:t>=</w:t>
       </w:r>
-      <w:proofErr w:type="spellStart"/>
-      <w:proofErr w:type="gramStart"/>
-      <w:r>
-        <w:rPr>
-          <w:rFonts w:ascii="Consolas" w:hAnsi="Consolas"/>
-          <w:color w:val="BBBEBF"/>
-          <w:sz w:val="21"/>
-          <w:szCs w:val="21"/>
-        </w:rPr>
-        <w:t>torch.tensor</w:t>
-      </w:r>
-      <w:proofErr w:type="spellEnd"/>
-      <w:proofErr w:type="gramEnd"/>
-      <w:r>
-        <w:rPr>
-          <w:rFonts w:ascii="Consolas" w:hAnsi="Consolas"/>
-          <w:color w:val="BBBEBF"/>
-          <w:sz w:val="21"/>
-          <w:szCs w:val="21"/>
-        </w:rPr>
-        <w:t>(</w:t>
+      <w:r>
+        <w:rPr>
+          <w:rFonts w:ascii="Consolas" w:hAnsi="Consolas"/>
+          <w:color w:val="BBBEBF"/>
+          <w:sz w:val="21"/>
+          <w:szCs w:val="21"/>
+        </w:rPr>
+        <w:t>torch.tensor(</w:t>
       </w:r>
       <w:r>
         <w:rPr>
@@ -2663,7 +1702,6 @@
         </w:rPr>
         <w:t xml:space="preserve">    </w:t>
       </w:r>
-      <w:proofErr w:type="spellStart"/>
       <w:r>
         <w:rPr>
           <w:rFonts w:ascii="Consolas" w:hAnsi="Consolas"/>
@@ -2673,7 +1711,6 @@
         </w:rPr>
         <w:t>sigma_py</w:t>
       </w:r>
-      <w:proofErr w:type="spellEnd"/>
       <w:r>
         <w:rPr>
           <w:rFonts w:ascii="Consolas" w:hAnsi="Consolas"/>
@@ -2683,27 +1720,14 @@
         </w:rPr>
         <w:t>=</w:t>
       </w:r>
-      <w:proofErr w:type="spellStart"/>
-      <w:proofErr w:type="gramStart"/>
-      <w:r>
-        <w:rPr>
-          <w:rFonts w:ascii="Consolas" w:hAnsi="Consolas"/>
-          <w:color w:val="BBBEBF"/>
-          <w:sz w:val="21"/>
-          <w:szCs w:val="21"/>
-        </w:rPr>
-        <w:t>torch.tensor</w:t>
-      </w:r>
-      <w:proofErr w:type="spellEnd"/>
-      <w:proofErr w:type="gramEnd"/>
-      <w:r>
-        <w:rPr>
-          <w:rFonts w:ascii="Consolas" w:hAnsi="Consolas"/>
-          <w:color w:val="BBBEBF"/>
-          <w:sz w:val="21"/>
-          <w:szCs w:val="21"/>
-        </w:rPr>
-        <w:t>(</w:t>
+      <w:r>
+        <w:rPr>
+          <w:rFonts w:ascii="Consolas" w:hAnsi="Consolas"/>
+          <w:color w:val="BBBEBF"/>
+          <w:sz w:val="21"/>
+          <w:szCs w:val="21"/>
+        </w:rPr>
+        <w:t>torch.tensor(</w:t>
       </w:r>
       <w:r>
         <w:rPr>
@@ -2745,7 +1769,6 @@
         </w:rPr>
         <w:t xml:space="preserve">    </w:t>
       </w:r>
-      <w:proofErr w:type="spellStart"/>
       <w:r>
         <w:rPr>
           <w:rFonts w:ascii="Consolas" w:hAnsi="Consolas"/>
@@ -2755,7 +1778,6 @@
         </w:rPr>
         <w:t>sigma_p</w:t>
       </w:r>
-      <w:proofErr w:type="spellEnd"/>
       <w:r>
         <w:rPr>
           <w:rFonts w:ascii="Consolas" w:hAnsi="Consolas"/>
@@ -2765,27 +1787,14 @@
         </w:rPr>
         <w:t>=</w:t>
       </w:r>
-      <w:proofErr w:type="spellStart"/>
-      <w:proofErr w:type="gramStart"/>
-      <w:r>
-        <w:rPr>
-          <w:rFonts w:ascii="Consolas" w:hAnsi="Consolas"/>
-          <w:color w:val="BBBEBF"/>
-          <w:sz w:val="21"/>
-          <w:szCs w:val="21"/>
-        </w:rPr>
-        <w:t>torch.tensor</w:t>
-      </w:r>
-      <w:proofErr w:type="spellEnd"/>
-      <w:proofErr w:type="gramEnd"/>
-      <w:r>
-        <w:rPr>
-          <w:rFonts w:ascii="Consolas" w:hAnsi="Consolas"/>
-          <w:color w:val="BBBEBF"/>
-          <w:sz w:val="21"/>
-          <w:szCs w:val="21"/>
-        </w:rPr>
-        <w:t>(</w:t>
+      <w:r>
+        <w:rPr>
+          <w:rFonts w:ascii="Consolas" w:hAnsi="Consolas"/>
+          <w:color w:val="BBBEBF"/>
+          <w:sz w:val="21"/>
+          <w:szCs w:val="21"/>
+        </w:rPr>
+        <w:t>torch.tensor(</w:t>
       </w:r>
       <w:r>
         <w:rPr>
@@ -2885,85 +1894,7 @@
           <w:szCs w:val="21"/>
           <w:lang w:val="en-US"/>
         </w:rPr>
-        <w:t xml:space="preserve"> </w:t>
-      </w:r>
-      <w:proofErr w:type="spellStart"/>
-      <w:r>
-        <w:rPr>
-          <w:rFonts w:ascii="Consolas" w:hAnsi="Consolas"/>
-          <w:color w:val="BBBEBF"/>
-          <w:sz w:val="21"/>
-          <w:szCs w:val="21"/>
-          <w:lang w:val="en-US"/>
-        </w:rPr>
-        <w:t>build_</w:t>
-      </w:r>
-      <w:proofErr w:type="gramStart"/>
-      <w:r>
-        <w:rPr>
-          <w:rFonts w:ascii="Consolas" w:hAnsi="Consolas"/>
-          <w:color w:val="BBBEBF"/>
-          <w:sz w:val="21"/>
-          <w:szCs w:val="21"/>
-          <w:lang w:val="en-US"/>
-        </w:rPr>
-        <w:t>segment</w:t>
-      </w:r>
-      <w:proofErr w:type="spellEnd"/>
-      <w:r>
-        <w:rPr>
-          <w:rFonts w:ascii="Consolas" w:hAnsi="Consolas"/>
-          <w:color w:val="BBBEBF"/>
-          <w:sz w:val="21"/>
-          <w:szCs w:val="21"/>
-          <w:lang w:val="en-US"/>
-        </w:rPr>
-        <w:t>(</w:t>
-      </w:r>
-      <w:proofErr w:type="spellStart"/>
-      <w:proofErr w:type="gramEnd"/>
-      <w:r>
-        <w:rPr>
-          <w:rFonts w:ascii="Consolas" w:hAnsi="Consolas"/>
-          <w:color w:val="BBBEBF"/>
-          <w:sz w:val="21"/>
-          <w:szCs w:val="21"/>
-          <w:lang w:val="en-US"/>
-        </w:rPr>
-        <w:t>SurrogateSpaceChargeKick</w:t>
-      </w:r>
-      <w:proofErr w:type="spellEnd"/>
-      <w:r>
-        <w:rPr>
-          <w:rFonts w:ascii="Consolas" w:hAnsi="Consolas"/>
-          <w:color w:val="BBBEBF"/>
-          <w:sz w:val="21"/>
-          <w:szCs w:val="21"/>
-          <w:lang w:val="en-US"/>
-        </w:rPr>
-        <w:t>, solver=</w:t>
-      </w:r>
-      <w:proofErr w:type="spellStart"/>
-      <w:r>
-        <w:rPr>
-          <w:rFonts w:ascii="Consolas" w:hAnsi="Consolas"/>
-          <w:color w:val="BBBEBF"/>
-          <w:sz w:val="21"/>
-          <w:szCs w:val="21"/>
-          <w:lang w:val="en-US"/>
-        </w:rPr>
-        <w:t>neuraloperator</w:t>
-      </w:r>
-      <w:proofErr w:type="spellEnd"/>
-      <w:r>
-        <w:rPr>
-          <w:rFonts w:ascii="Consolas" w:hAnsi="Consolas"/>
-          <w:color w:val="BBBEBF"/>
-          <w:sz w:val="21"/>
-          <w:szCs w:val="21"/>
-          <w:lang w:val="en-US"/>
-        </w:rPr>
-        <w:t>)</w:t>
+        <w:t xml:space="preserve"> build_segment(SurrogateSpaceChargeKick, solver=neuraloperator)</w:t>
       </w:r>
     </w:p>
     <w:p>
@@ -2978,126 +1909,44 @@
           <w:szCs w:val="21"/>
         </w:rPr>
       </w:pPr>
-      <w:proofErr w:type="spellStart"/>
-      <w:r>
-        <w:rPr>
-          <w:rFonts w:ascii="Consolas" w:hAnsi="Consolas"/>
-          <w:color w:val="BBBEBF"/>
-          <w:sz w:val="21"/>
-          <w:szCs w:val="21"/>
-        </w:rPr>
-        <w:t>outgoing</w:t>
-      </w:r>
-      <w:proofErr w:type="spellEnd"/>
-      <w:r>
-        <w:rPr>
-          <w:rFonts w:ascii="Consolas" w:hAnsi="Consolas"/>
-          <w:color w:val="BBBEBF"/>
-          <w:sz w:val="21"/>
-          <w:szCs w:val="21"/>
-        </w:rPr>
+      <w:r>
+        <w:rPr>
+          <w:rFonts w:ascii="Consolas" w:hAnsi="Consolas"/>
+          <w:color w:val="BBBEBF"/>
+          <w:sz w:val="21"/>
+          <w:szCs w:val="21"/>
+        </w:rPr>
+        <w:t xml:space="preserve">outgoing </w:t>
+      </w:r>
+      <w:r>
+        <w:rPr>
+          <w:rFonts w:ascii="Consolas" w:hAnsi="Consolas"/>
+          <w:color w:val="D4D4D4"/>
+          <w:sz w:val="21"/>
+          <w:szCs w:val="21"/>
+        </w:rPr>
+        <w:t>=</w:t>
+      </w:r>
+      <w:r>
+        <w:rPr>
+          <w:rFonts w:ascii="Consolas" w:hAnsi="Consolas"/>
+          <w:color w:val="BBBEBF"/>
+          <w:sz w:val="21"/>
+          <w:szCs w:val="21"/>
+        </w:rPr>
+        <w:t xml:space="preserve"> segment.track(incoming)</w:t>
+      </w:r>
+    </w:p>
+    <w:p/>
+    <w:p>
+      <w:r>
+        <w:t>Zitat Claude Opus 5 (cheetah_test.ipynb): Die FFT-Faltung ist zyklisch, die Physik ist es nicht. Deshalb wird ρ auf das doppelte</w:t>
+      </w:r>
+      <w:r>
         <w:t xml:space="preserve"> </w:t>
       </w:r>
       <w:r>
-        <w:rPr>
-          <w:rFonts w:ascii="Consolas" w:hAnsi="Consolas"/>
-          <w:color w:val="D4D4D4"/>
-          <w:sz w:val="21"/>
-          <w:szCs w:val="21"/>
-        </w:rPr>
-        <w:t>=</w:t>
-      </w:r>
-      <w:r>
-        <w:rPr>
-          <w:rFonts w:ascii="Consolas" w:hAnsi="Consolas"/>
-          <w:color w:val="BBBEBF"/>
-          <w:sz w:val="21"/>
-          <w:szCs w:val="21"/>
-        </w:rPr>
-        <w:t xml:space="preserve"> </w:t>
-      </w:r>
-      <w:proofErr w:type="spellStart"/>
-      <w:proofErr w:type="gramStart"/>
-      <w:r>
-        <w:rPr>
-          <w:rFonts w:ascii="Consolas" w:hAnsi="Consolas"/>
-          <w:color w:val="BBBEBF"/>
-          <w:sz w:val="21"/>
-          <w:szCs w:val="21"/>
-        </w:rPr>
-        <w:t>segment.track</w:t>
-      </w:r>
-      <w:proofErr w:type="spellEnd"/>
-      <w:proofErr w:type="gramEnd"/>
-      <w:r>
-        <w:rPr>
-          <w:rFonts w:ascii="Consolas" w:hAnsi="Consolas"/>
-          <w:color w:val="BBBEBF"/>
-          <w:sz w:val="21"/>
-          <w:szCs w:val="21"/>
-        </w:rPr>
-        <w:t>(</w:t>
-      </w:r>
-      <w:proofErr w:type="spellStart"/>
-      <w:r>
-        <w:rPr>
-          <w:rFonts w:ascii="Consolas" w:hAnsi="Consolas"/>
-          <w:color w:val="BBBEBF"/>
-          <w:sz w:val="21"/>
-          <w:szCs w:val="21"/>
-        </w:rPr>
-        <w:t>incoming</w:t>
-      </w:r>
-      <w:proofErr w:type="spellEnd"/>
-      <w:r>
-        <w:rPr>
-          <w:rFonts w:ascii="Consolas" w:hAnsi="Consolas"/>
-          <w:color w:val="BBBEBF"/>
-          <w:sz w:val="21"/>
-          <w:szCs w:val="21"/>
-        </w:rPr>
-        <w:t>)</w:t>
-      </w:r>
-    </w:p>
-    <w:p/>
-    <w:p>
-      <w:r>
-        <w:t>Zitat Claude Opus 5 (</w:t>
-      </w:r>
-      <w:proofErr w:type="spellStart"/>
-      <w:r>
-        <w:t>cheetah_</w:t>
-      </w:r>
-      <w:proofErr w:type="gramStart"/>
-      <w:r>
-        <w:t>test.ipynb</w:t>
-      </w:r>
-      <w:proofErr w:type="spellEnd"/>
-      <w:proofErr w:type="gramEnd"/>
-      <w:r>
-        <w:t>): Die FFT-Faltung ist zyklisch, die Physik ist es nicht. Deshalb wird ρ auf das doppelte</w:t>
-      </w:r>
-      <w:r>
-        <w:t xml:space="preserve"> </w:t>
-      </w:r>
-      <w:r>
-        <w:t xml:space="preserve">Gitter </w:t>
-      </w:r>
-      <w:proofErr w:type="spellStart"/>
-      <w:r>
-        <w:t>genullpolstert</w:t>
-      </w:r>
-      <w:proofErr w:type="spellEnd"/>
-      <w:r>
-        <w:t xml:space="preserve"> (`_</w:t>
-      </w:r>
-      <w:proofErr w:type="spellStart"/>
-      <w:r>
-        <w:t>array_rho</w:t>
-      </w:r>
-      <w:proofErr w:type="spellEnd"/>
-      <w:r>
-        <w:t>`), G in alle acht Oktanten gespiegelt, und nach der</w:t>
+        <w:t>Gitter genullpolstert (`_array_rho`), G in alle acht Oktanten gespiegelt, und nach der</w:t>
       </w:r>
       <w:r>
         <w:t xml:space="preserve"> </w:t>
@@ -3145,110 +1994,49 @@
     <w:p>
       <w:r>
         <w:lastRenderedPageBreak/>
-        <w:t>\</w:t>
-      </w:r>
-      <w:proofErr w:type="spellStart"/>
-      <w:r>
-        <w:t>mathcal</w:t>
-      </w:r>
-      <w:proofErr w:type="spellEnd"/>
-      <w:r>
-        <w:t>{S}: \</w:t>
-      </w:r>
-      <w:proofErr w:type="spellStart"/>
-      <w:r>
-        <w:t>rho</w:t>
-      </w:r>
-      <w:proofErr w:type="spellEnd"/>
-      <w:r>
+        <w:t>\mathcal{S}: \rho \;\longmapsto\; \phi</w:t>
+      </w:r>
+    </w:p>
+    <w:p>
+      <w:r>
+        <w:t xml:space="preserve">Li et al. lernen im FNO-Paper unter anderem </w:t>
+      </w:r>
+      <w:r>
+        <w:rPr>
+          <w:highlight w:val="yellow"/>
+        </w:rPr>
+        <w:t>Darcy-Flow, was strukturell dasselbe Tier ist — elliptisch, global gekoppelt</w:t>
+      </w:r>
+      <w:r>
+        <w:t>, Lösung hängt an jedem Punkt vom gesamten Eingabefeld ab.</w:t>
+      </w:r>
+    </w:p>
+    <w:p>
+      <w:r>
+        <w:t xml:space="preserve">Der Charme dabei: die exakte Lösung ist eine Faltung im Ortsraum, also eine punktweise Multiplikation im Fourierraum. Genau das macht eine FNO-Schicht. Der Operator, den du lernen willst, liegt bauartlich schon in der Architektur — dein Netz muss im Grunde nur den Kern </w:t>
+      </w:r>
+      <w:r>
+        <w:rPr>
+          <w:highlight w:val="yellow"/>
+        </w:rPr>
+        <w:t>^G</w:t>
+      </w:r>
+      <w:r>
+        <w:rPr>
+          <w:highlight w:val="yellow"/>
+        </w:rPr>
+        <w:t xml:space="preserve"> approximieren und die</w:t>
+      </w:r>
+      <w:r>
+        <w:rPr>
+          <w:highlight w:val="yellow"/>
+        </w:rPr>
         <w:t xml:space="preserve"> </w:t>
       </w:r>
-      <w:proofErr w:type="gramStart"/>
-      <w:r>
-        <w:t>\;\</w:t>
-      </w:r>
-      <w:proofErr w:type="spellStart"/>
-      <w:r>
-        <w:t>longmapsto</w:t>
-      </w:r>
-      <w:proofErr w:type="spellEnd"/>
-      <w:r>
-        <w:t>\</w:t>
-      </w:r>
-      <w:proofErr w:type="gramEnd"/>
-      <w:r>
-        <w:t>; \</w:t>
-      </w:r>
-      <w:proofErr w:type="spellStart"/>
-      <w:r>
-        <w:t>phi</w:t>
-      </w:r>
-      <w:proofErr w:type="spellEnd"/>
-    </w:p>
-    <w:p>
-      <w:r>
-        <w:t xml:space="preserve">Li et al. lernen im FNO-Paper unter anderem </w:t>
-      </w:r>
       <w:r>
         <w:rPr>
           <w:highlight w:val="yellow"/>
         </w:rPr>
-        <w:t>Darcy-Flow, was strukturell dasselbe Tier ist — elliptisch, global gekoppelt</w:t>
-      </w:r>
-      <w:r>
-        <w:t>, Lösung hängt an jedem Punkt vom gesamten Eingabefeld ab.</w:t>
-      </w:r>
-    </w:p>
-    <w:p>
-      <w:r>
-        <w:t xml:space="preserve">Der Charme dabei: die exakte Lösung ist eine Faltung im </w:t>
-      </w:r>
-      <w:proofErr w:type="spellStart"/>
-      <w:r>
-        <w:t>Ortsraum</w:t>
-      </w:r>
-      <w:proofErr w:type="spellEnd"/>
-      <w:r>
-        <w:t xml:space="preserve">, also eine punktweise Multiplikation im </w:t>
-      </w:r>
-      <w:proofErr w:type="spellStart"/>
-      <w:r>
-        <w:t>Fourierraum</w:t>
-      </w:r>
-      <w:proofErr w:type="spellEnd"/>
-      <w:r>
-        <w:t xml:space="preserve">. Genau das macht eine FNO-Schicht. Der Operator, den du lernen willst, liegt </w:t>
-      </w:r>
-      <w:proofErr w:type="spellStart"/>
-      <w:r>
-        <w:t>bauartlich</w:t>
-      </w:r>
-      <w:proofErr w:type="spellEnd"/>
-      <w:r>
-        <w:t xml:space="preserve"> schon in der Architektur — dein Netz muss im Grunde nur den Kern </w:t>
-      </w:r>
-      <w:r>
-        <w:rPr>
-          <w:highlight w:val="yellow"/>
-        </w:rPr>
-        <w:t>^G</w:t>
-      </w:r>
-      <w:r>
-        <w:rPr>
-          <w:highlight w:val="yellow"/>
-        </w:rPr>
-        <w:t xml:space="preserve"> approximieren und die</w:t>
-      </w:r>
-      <w:r>
-        <w:rPr>
-          <w:highlight w:val="yellow"/>
-        </w:rPr>
-        <w:t xml:space="preserve"> </w:t>
-      </w:r>
-      <w:r>
-        <w:rPr>
-          <w:highlight w:val="yellow"/>
-        </w:rPr>
         <w:t>γ-Abhängigkeit mitlernen</w:t>
       </w:r>
       <w:r>
@@ -3263,63 +2051,13 @@
         <w:t>innerhalb von</w:t>
       </w:r>
       <w:r>
-        <w:t xml:space="preserve"> _</w:t>
-      </w:r>
-      <w:proofErr w:type="spellStart"/>
-      <w:r>
-        <w:t>solve_poisson_equation</w:t>
-      </w:r>
-      <w:proofErr w:type="spellEnd"/>
-      <w:r>
-        <w:t xml:space="preserve">. </w:t>
-      </w:r>
-      <w:r>
-        <w:rPr>
-          <w:lang w:val="en-US"/>
-        </w:rPr>
-        <w:t xml:space="preserve">Rein: </w:t>
-      </w:r>
-      <w:proofErr w:type="spellStart"/>
-      <w:r>
-        <w:rPr>
-          <w:lang w:val="en-US"/>
-        </w:rPr>
-        <w:t>charge_density</w:t>
-      </w:r>
-      <w:proofErr w:type="spellEnd"/>
-      <w:r>
-        <w:rPr>
-          <w:lang w:val="en-US"/>
-        </w:rPr>
-        <w:t xml:space="preserve"> (</w:t>
-      </w:r>
-      <w:proofErr w:type="spellStart"/>
-      <w:r>
-        <w:rPr>
-          <w:lang w:val="en-US"/>
-        </w:rPr>
-        <w:t>ungepaddet</w:t>
-      </w:r>
-      <w:proofErr w:type="spellEnd"/>
-      <w:r>
-        <w:rPr>
-          <w:lang w:val="en-US"/>
-        </w:rPr>
-        <w:t xml:space="preserve">, </w:t>
-      </w:r>
-      <w:proofErr w:type="spellStart"/>
-      <w:r>
-        <w:rPr>
-          <w:lang w:val="en-US"/>
-        </w:rPr>
-        <w:t>grid_shape</w:t>
-      </w:r>
-      <w:proofErr w:type="spellEnd"/>
-      <w:r>
-        <w:rPr>
-          <w:lang w:val="en-US"/>
-        </w:rPr>
-        <w:t xml:space="preserve">) plus </w:t>
+        <w:t xml:space="preserve"> _solve_poisson_equation. </w:t>
+      </w:r>
+      <w:r>
+        <w:rPr>
+          <w:lang w:val="en-US"/>
+        </w:rPr>
+        <w:t xml:space="preserve">Rein: charge_density (ungepaddet, grid_shape) plus </w:t>
       </w:r>
       <w:r>
         <w:t>γ</w:t>
@@ -3328,21 +2066,7 @@
         <w:rPr>
           <w:lang w:val="en-US"/>
         </w:rPr>
-        <w:t xml:space="preserve"> und </w:t>
-      </w:r>
-      <w:proofErr w:type="spellStart"/>
-      <w:r>
-        <w:rPr>
-          <w:lang w:val="en-US"/>
-        </w:rPr>
-        <w:t>cell_size</w:t>
-      </w:r>
-      <w:proofErr w:type="spellEnd"/>
-      <w:r>
-        <w:rPr>
-          <w:lang w:val="en-US"/>
-        </w:rPr>
-        <w:t xml:space="preserve">. </w:t>
+        <w:t xml:space="preserve"> und cell_size. </w:t>
       </w:r>
       <w:r>
         <w:t>Raus: potential auf demselben Gitter.</w:t>
@@ -3352,53 +2076,9 @@
     <w:p>
       <w:pPr>
         <w:pStyle w:val="berschrift1"/>
-        <w:rPr>
-          <w:lang w:val="en-US"/>
-        </w:rPr>
-      </w:pPr>
-      <w:r>
-        <w:rPr>
-          <w:lang w:val="en-US"/>
-        </w:rPr>
-        <w:t>Aus Claude</w:t>
-      </w:r>
-      <w:r>
-        <w:rPr>
-          <w:lang w:val="en-US"/>
-        </w:rPr>
-        <w:t xml:space="preserve"> Code</w:t>
-      </w:r>
-      <w:r>
-        <w:rPr>
-          <w:lang w:val="en-US"/>
-        </w:rPr>
-        <w:t xml:space="preserve"> Opus 5.5 (Medium) Chat „</w:t>
-      </w:r>
-      <w:proofErr w:type="spellStart"/>
-      <w:r>
-        <w:rPr>
-          <w:lang w:val="en-US"/>
-        </w:rPr>
-        <w:t>space_charge_kick</w:t>
-      </w:r>
-      <w:proofErr w:type="spellEnd"/>
-      <w:r>
-        <w:rPr>
-          <w:lang w:val="en-US"/>
-        </w:rPr>
-        <w:t xml:space="preserve"> gradient error”</w:t>
-      </w:r>
-      <w:r>
-        <w:rPr>
-          <w:lang w:val="en-US"/>
-        </w:rPr>
-        <w:t xml:space="preserve"> (05.10.2026)</w:t>
-      </w:r>
-      <w:r>
-        <w:rPr>
-          <w:lang w:val="en-US"/>
-        </w:rPr>
-        <w:t>:</w:t>
+      </w:pPr>
+      <w:r>
+        <w:t>Aus Claude Code Opus 5.5 (Medium) Chat „space_charge_kick gradient error” (05.10.2026):</w:t>
       </w:r>
     </w:p>
     <w:p>
@@ -3441,47 +2121,7 @@
         <w:t>Speichern</w:t>
       </w:r>
       <w:r>
-        <w:t xml:space="preserve"> als {"x": </w:t>
-      </w:r>
-      <w:proofErr w:type="spellStart"/>
-      <w:r>
-        <w:t>rho</w:t>
-      </w:r>
-      <w:proofErr w:type="spellEnd"/>
-      <w:r>
-        <w:t>[N,</w:t>
-      </w:r>
-      <w:proofErr w:type="gramStart"/>
-      <w:r>
-        <w:t>1,nx</w:t>
-      </w:r>
-      <w:proofErr w:type="gramEnd"/>
-      <w:r>
-        <w:t xml:space="preserve">,ny,nτ], "y": </w:t>
-      </w:r>
-      <w:proofErr w:type="spellStart"/>
-      <w:r>
-        <w:t>phi</w:t>
-      </w:r>
-      <w:proofErr w:type="spellEnd"/>
-      <w:r>
-        <w:t>[...], "</w:t>
-      </w:r>
-      <w:proofErr w:type="spellStart"/>
-      <w:r>
-        <w:t>cell_size</w:t>
-      </w:r>
-      <w:proofErr w:type="spellEnd"/>
-      <w:r>
-        <w:t>": ..., "</w:t>
-      </w:r>
-      <w:proofErr w:type="spellStart"/>
-      <w:r>
-        <w:t>gamma</w:t>
-      </w:r>
-      <w:proofErr w:type="spellEnd"/>
-      <w:r>
-        <w:t>": ...}.</w:t>
+        <w:t> als {"x": rho[N,1,nx,ny,nτ], "y": phi[...], "cell_size": ..., "gamma": ...}.</w:t>
       </w:r>
     </w:p>
     <w:p>
@@ -3499,15 +2139,7 @@
         <w:t>Test bei mehreren Auflösungen,</w:t>
       </w:r>
       <w:r>
-        <w:t xml:space="preserve"> z. B. Training auf 32³ und Test auf 64³, wie die Darcy-Tests bei 16/32. So prüfst du, ob das Modell bei feinerem Gitter genauso gut funktioniert, was ein Hauptargument für </w:t>
-      </w:r>
-      <w:proofErr w:type="spellStart"/>
-      <w:r>
-        <w:t>Neural</w:t>
-      </w:r>
-      <w:proofErr w:type="spellEnd"/>
-      <w:r>
-        <w:t xml:space="preserve"> Operators ist.</w:t>
+        <w:t> z. B. Training auf 32³ und Test auf 64³, wie die Darcy-Tests bei 16/32. So prüfst du, ob das Modell bei feinerem Gitter genauso gut funktioniert, was ein Hauptargument für Neural Operators ist.</w:t>
       </w:r>
     </w:p>
     <w:p>
@@ -3522,23 +2154,7 @@
           <w:b/>
           <w:bCs/>
         </w:rPr>
-        <w:t xml:space="preserve">Ein </w:t>
-      </w:r>
-      <w:proofErr w:type="spellStart"/>
-      <w:r>
-        <w:rPr>
-          <w:b/>
-          <w:bCs/>
-        </w:rPr>
-        <w:t>Testset</w:t>
-      </w:r>
-      <w:proofErr w:type="spellEnd"/>
-      <w:r>
-        <w:rPr>
-          <w:b/>
-          <w:bCs/>
-        </w:rPr>
-        <w:t xml:space="preserve"> mit Strahltypen, die im Training nicht vorkamen.</w:t>
+        <w:t>Ein Testset mit Strahltypen, die im Training nicht vorkamen.</w:t>
       </w:r>
       <w:r>
         <w:t> Sonst misst du nur, wie gut das Modell bekannte Fälle reproduziert.</w:t>
@@ -3588,21 +2204,7 @@
         <w:rPr>
           <w:highlight w:val="green"/>
         </w:rPr>
-        <w:t> (32³) speichern und übergeben, plus </w:t>
-      </w:r>
-      <w:proofErr w:type="spellStart"/>
-      <w:r>
-        <w:rPr>
-          <w:highlight w:val="green"/>
-        </w:rPr>
-        <w:t>domain_padding</w:t>
-      </w:r>
-      <w:proofErr w:type="spellEnd"/>
-      <w:r>
-        <w:rPr>
-          <w:highlight w:val="green"/>
-        </w:rPr>
-        <w:t> im FNO</w:t>
+        <w:t> (32³) speichern und übergeben, plus domain_padding im FNO</w:t>
       </w:r>
       <w:r>
         <w:t>. Das Hockney-Polster ist ein Detail des klassischen Lösers. Das Modell sollte es nicht lernen müssen.</w:t>
@@ -3655,21 +2257,7 @@
         <w:rPr>
           <w:highlight w:val="green"/>
         </w:rPr>
-        <w:t>G hängt aber von </w:t>
-      </w:r>
-      <w:proofErr w:type="spellStart"/>
-      <w:r>
-        <w:rPr>
-          <w:highlight w:val="green"/>
-        </w:rPr>
-        <w:t>cell_size</w:t>
-      </w:r>
-      <w:proofErr w:type="spellEnd"/>
-      <w:r>
-        <w:rPr>
-          <w:highlight w:val="green"/>
-        </w:rPr>
-        <w:t> und γ ab, ändert sich also von Sample zu Sample. Das ist der eigentliche Lerninhalt (siehe Abschnitt</w:t>
+        <w:t>G hängt aber von cell_size und γ ab, ändert sich also von Sample zu Sample. Das ist der eigentliche Lerninhalt (siehe Abschnitt</w:t>
       </w:r>
       <w:r>
         <w:rPr>
@@ -3740,35 +2328,17 @@
           <w:b/>
           <w:bCs/>
         </w:rPr>
-        <w:t>Was </w:t>
-      </w:r>
-      <w:proofErr w:type="spellStart"/>
-      <w:r>
-        <w:rPr>
-          <w:b/>
-          <w:bCs/>
+        <w:t>Was n_modes bedeutet:</w:t>
+      </w:r>
+      <w:r>
+        <w:t> Pro Fourier-Schicht behält ein FNO nur die untersten </w:t>
+      </w:r>
+      <w:r>
+        <w:rPr>
+          <w:highlight w:val="green"/>
         </w:rPr>
         <w:t>n_modes</w:t>
       </w:r>
-      <w:proofErr w:type="spellEnd"/>
-      <w:r>
-        <w:rPr>
-          <w:b/>
-          <w:bCs/>
-        </w:rPr>
-        <w:t> bedeutet:</w:t>
-      </w:r>
-      <w:r>
-        <w:t> Pro Fourier-Schicht behält ein FNO nur die untersten </w:t>
-      </w:r>
-      <w:proofErr w:type="spellStart"/>
-      <w:r>
-        <w:rPr>
-          <w:highlight w:val="green"/>
-        </w:rPr>
-        <w:t>n_modes</w:t>
-      </w:r>
-      <w:proofErr w:type="spellEnd"/>
       <w:r>
         <w:t xml:space="preserve"> Moden pro Richtung. </w:t>
       </w:r>
@@ -3821,62 +2391,13 @@
         <w:rPr>
           <w:highlight w:val="green"/>
         </w:rPr>
-        <w:t xml:space="preserve">Wie du </w:t>
-      </w:r>
-      <w:proofErr w:type="spellStart"/>
-      <w:r>
-        <w:rPr>
-          <w:highlight w:val="green"/>
-        </w:rPr>
-        <w:t>n_modes</w:t>
-      </w:r>
-      <w:proofErr w:type="spellEnd"/>
-      <w:r>
-        <w:rPr>
-          <w:highlight w:val="green"/>
-        </w:rPr>
-        <w:t xml:space="preserve"> wählst: Dein </w:t>
-      </w:r>
-      <w:proofErr w:type="spellStart"/>
-      <w:r>
-        <w:rPr>
-          <w:highlight w:val="green"/>
-        </w:rPr>
-        <w:t>TruncatedSolver</w:t>
-      </w:r>
-      <w:proofErr w:type="spellEnd"/>
-      <w:r>
-        <w:rPr>
-          <w:highlight w:val="green"/>
-        </w:rPr>
-        <w:t xml:space="preserve"> aus Zelle 22</w:t>
-      </w:r>
-      <w:r>
-        <w:t xml:space="preserve"> (</w:t>
-      </w:r>
-      <w:proofErr w:type="spellStart"/>
-      <w:r>
-        <w:t>cheetah_</w:t>
-      </w:r>
-      <w:proofErr w:type="gramStart"/>
-      <w:r>
-        <w:t>test.ipynb</w:t>
-      </w:r>
-      <w:proofErr w:type="spellEnd"/>
-      <w:proofErr w:type="gramEnd"/>
-      <w:r>
-        <w:t>)</w:t>
-      </w:r>
-      <w:r>
-        <w:t xml:space="preserve"> ist genau dafür gebaut. Er zeigt, welchen Fehler im Strahl eine bestimmte Modenzahl im besten Fall verursacht. Damit kannst du </w:t>
-      </w:r>
-      <w:proofErr w:type="spellStart"/>
-      <w:r>
-        <w:t>n_modes</w:t>
-      </w:r>
-      <w:proofErr w:type="spellEnd"/>
-      <w:r>
-        <w:t xml:space="preserve"> belegen statt raten.</w:t>
+        <w:t>Wie du n_modes wählst: Dein TruncatedSolver aus Zelle 22</w:t>
+      </w:r>
+      <w:r>
+        <w:t xml:space="preserve"> (cheetah_test.ipynb)</w:t>
+      </w:r>
+      <w:r>
+        <w:t xml:space="preserve"> ist genau dafür gebaut. Er zeigt, welchen Fehler im Strahl eine bestimmte Modenzahl im besten Fall verursacht. Damit kannst du n_modes belegen statt raten.</w:t>
       </w:r>
     </w:p>
     <w:p>
@@ -3904,42 +2425,12 @@
       <w:r>
         <w:t>Schau dir deshalb Tucker- oder CP-faktorisierte Gewichte an (</w:t>
       </w:r>
-      <w:proofErr w:type="spellStart"/>
       <w:r>
         <w:rPr>
           <w:highlight w:val="yellow"/>
         </w:rPr>
-        <w:t>factorization</w:t>
-      </w:r>
-      <w:proofErr w:type="spellEnd"/>
-      <w:r>
-        <w:rPr>
-          <w:highlight w:val="yellow"/>
-        </w:rPr>
-        <w:t>="</w:t>
-      </w:r>
-      <w:proofErr w:type="spellStart"/>
-      <w:r>
-        <w:rPr>
-          <w:highlight w:val="yellow"/>
-        </w:rPr>
-        <w:t>tucker</w:t>
-      </w:r>
-      <w:proofErr w:type="spellEnd"/>
-      <w:r>
-        <w:rPr>
-          <w:highlight w:val="yellow"/>
-        </w:rPr>
-        <w:t>" im FNO von </w:t>
-      </w:r>
-      <w:proofErr w:type="spellStart"/>
-      <w:r>
-        <w:rPr>
-          <w:highlight w:val="yellow"/>
-        </w:rPr>
-        <w:t>neuralop</w:t>
-      </w:r>
-      <w:proofErr w:type="spellEnd"/>
+        <w:t>factorization="tucker" im FNO von neuralop</w:t>
+      </w:r>
       <w:r>
         <w:t>).</w:t>
       </w:r>
@@ -3991,15 +2482,7 @@
         <w:t>Trainiere deshalb entweder auf φ ohne Mittelwert</w:t>
       </w:r>
       <w:r>
-        <w:t xml:space="preserve"> oder direkt auf dem Feld (Schnitt bei _</w:t>
-      </w:r>
-      <w:proofErr w:type="spellStart"/>
-      <w:r>
-        <w:t>E_plus_vB_field</w:t>
-      </w:r>
-      <w:proofErr w:type="spellEnd"/>
-      <w:r>
-        <w:t>).</w:t>
+        <w:t xml:space="preserve"> oder direkt auf dem Feld (Schnitt bei _E_plus_vB_field).</w:t>
       </w:r>
     </w:p>
     <w:p>
@@ -4072,15 +2555,7 @@
         <w:t>Gitter</w:t>
       </w:r>
       <w:r>
-        <w:t xml:space="preserve"> mit dem Strahl (</w:t>
-      </w:r>
-      <w:proofErr w:type="spellStart"/>
-      <w:r>
-        <w:t>grid_extent</w:t>
-      </w:r>
-      <w:proofErr w:type="spellEnd"/>
-      <w:r>
-        <w:t xml:space="preserve"> · σ)</w:t>
+        <w:t xml:space="preserve"> mit dem Strahl (grid_extent · σ)</w:t>
       </w:r>
       <w:r>
         <w:br/>
@@ -4111,44 +2586,8 @@
         <w:rPr>
           <w:highlight w:val="green"/>
         </w:rPr>
-        <w:t xml:space="preserve">Seitenverhältnis </w:t>
-      </w:r>
-      <w:proofErr w:type="gramStart"/>
-      <w:r>
-        <w:rPr>
-          <w:highlight w:val="green"/>
-        </w:rPr>
-        <w:t>dx :</w:t>
-      </w:r>
-      <w:proofErr w:type="gramEnd"/>
-      <w:r>
-        <w:rPr>
-          <w:highlight w:val="green"/>
-        </w:rPr>
-        <w:t xml:space="preserve"> </w:t>
-      </w:r>
-      <w:proofErr w:type="spellStart"/>
-      <w:r>
-        <w:rPr>
-          <w:highlight w:val="green"/>
-        </w:rPr>
-        <w:t>dy</w:t>
-      </w:r>
-      <w:proofErr w:type="spellEnd"/>
-      <w:r>
-        <w:rPr>
-          <w:highlight w:val="green"/>
-        </w:rPr>
-        <w:t xml:space="preserve"> : </w:t>
-      </w:r>
-      <w:proofErr w:type="spellStart"/>
-      <w:r>
-        <w:rPr>
-          <w:highlight w:val="green"/>
-        </w:rPr>
-        <w:t>dτ·γ</w:t>
-      </w:r>
-      <w:proofErr w:type="spellEnd"/>
+        <w:t>Seitenverhältnis dx : dy : dτ·γ</w:t>
+      </w:r>
       <w:r>
         <w:t xml:space="preserve"> ändern sich aber von Sample zu Sample, und G hängt davon ab</w:t>
       </w:r>
@@ -4170,7 +2609,6 @@
           <w:numId w:val="6"/>
         </w:numPr>
       </w:pPr>
-      <w:proofErr w:type="spellStart"/>
       <w:r>
         <w:rPr>
           <w:b/>
@@ -4179,7 +2617,6 @@
         <w:lastRenderedPageBreak/>
         <w:t>Entdimensionalisierung</w:t>
       </w:r>
-      <w:proofErr w:type="spellEnd"/>
       <w:r>
         <w:rPr>
           <w:iCs/>
@@ -4195,94 +2632,19 @@
         </w:numPr>
       </w:pPr>
       <w:r>
-        <w:t xml:space="preserve">Mit Q als Gesamtladung, V als Zellvolumen und h = (dx · </w:t>
-      </w:r>
-      <w:proofErr w:type="spellStart"/>
-      <w:r>
-        <w:t>dy</w:t>
-      </w:r>
-      <w:proofErr w:type="spellEnd"/>
-      <w:r>
-        <w:t xml:space="preserve"> · </w:t>
-      </w:r>
-      <w:proofErr w:type="spellStart"/>
-      <w:r>
-        <w:t>dτ·</w:t>
-      </w:r>
-      <w:proofErr w:type="gramStart"/>
-      <w:r>
-        <w:t>γ</w:t>
-      </w:r>
-      <w:proofErr w:type="spellEnd"/>
-      <w:r>
-        <w:t>)^</w:t>
-      </w:r>
-      <w:proofErr w:type="gramEnd"/>
-      <w:r>
-        <w:t>(1/3) als charakteristischer Zelllänge:</w:t>
+        <w:t>Mit Q als Gesamtladung, V als Zellvolumen und h = (dx · dy · dτ·γ)^(1/3) als charakteristischer Zelllänge:</w:t>
       </w:r>
       <w:r>
         <w:br/>
-      </w:r>
-      <w:proofErr w:type="spellStart"/>
-      <w:r>
-        <w:t>rho_hat</w:t>
-      </w:r>
-      <w:proofErr w:type="spellEnd"/>
-      <w:r>
-        <w:t xml:space="preserve"> = </w:t>
-      </w:r>
-      <w:proofErr w:type="spellStart"/>
-      <w:r>
-        <w:t>rho</w:t>
-      </w:r>
-      <w:proofErr w:type="spellEnd"/>
-      <w:r>
-        <w:t xml:space="preserve"> * V / Q                       # Ladungsanteil pro Zelle, Summe ≈ </w:t>
-      </w:r>
-      <w:r>
-        <w:t>1</w:t>
+        <w:t>rho_hat = rho * V / Q                       # Ladungsanteil pro Zelle, Summe ≈ 1</w:t>
       </w:r>
       <w:r>
         <w:br/>
-      </w:r>
-      <w:proofErr w:type="spellStart"/>
-      <w:r>
-        <w:t>phi_hat</w:t>
-      </w:r>
-      <w:proofErr w:type="spellEnd"/>
-      <w:r>
-        <w:t xml:space="preserve"> = </w:t>
-      </w:r>
-      <w:proofErr w:type="spellStart"/>
-      <w:r>
-        <w:t>phi</w:t>
-      </w:r>
-      <w:proofErr w:type="spellEnd"/>
-      <w:r>
-        <w:t xml:space="preserve"> * 4*</w:t>
-      </w:r>
-      <w:proofErr w:type="spellStart"/>
-      <w:r>
-        <w:t>pi</w:t>
-      </w:r>
-      <w:proofErr w:type="spellEnd"/>
-      <w:r>
-        <w:t>*eps0 * h / Q</w:t>
+        <w:t>phi_hat = phi * 4*pi*eps0 * h / Q</w:t>
       </w:r>
       <w:r>
         <w:br/>
-      </w:r>
-      <w:r>
-        <w:t xml:space="preserve">Die IGF hat die Einheit Länge² und skaliert mit h², das Zellvolumen mit h³. Damit ist </w:t>
-      </w:r>
-      <w:proofErr w:type="spellStart"/>
-      <w:r>
-        <w:t>phi_hat</w:t>
-      </w:r>
-      <w:proofErr w:type="spellEnd"/>
-      <w:r>
-        <w:t xml:space="preserve"> = g </w:t>
+        <w:t xml:space="preserve">Die IGF hat die Einheit Länge² und skaliert mit h², das Zellvolumen mit h³. Damit ist phi_hat = g </w:t>
       </w:r>
       <w:r>
         <w:rPr>
@@ -4291,15 +2653,7 @@
         <w:t>∗</w:t>
       </w:r>
       <w:r>
-        <w:t xml:space="preserve"> </w:t>
-      </w:r>
-      <w:proofErr w:type="spellStart"/>
-      <w:r>
-        <w:t>rho_hat</w:t>
-      </w:r>
-      <w:proofErr w:type="spellEnd"/>
-      <w:r>
-        <w:t>, und der Kern g h</w:t>
+        <w:t xml:space="preserve"> rho_hat, und der Kern g h</w:t>
       </w:r>
       <w:r>
         <w:rPr>
@@ -4317,27 +2671,7 @@
         <w:t>ä</w:t>
       </w:r>
       <w:r>
-        <w:t xml:space="preserve">ltnissen </w:t>
-      </w:r>
-      <w:proofErr w:type="gramStart"/>
-      <w:r>
-        <w:t>dx :</w:t>
-      </w:r>
-      <w:proofErr w:type="gramEnd"/>
-      <w:r>
-        <w:t xml:space="preserve"> </w:t>
-      </w:r>
-      <w:proofErr w:type="spellStart"/>
-      <w:r>
-        <w:t>dy</w:t>
-      </w:r>
-      <w:proofErr w:type="spellEnd"/>
-      <w:r>
-        <w:t xml:space="preserve"> : </w:t>
-      </w:r>
-      <w:proofErr w:type="spellStart"/>
-      <w:r>
-        <w:t>d</w:t>
+        <w:t>ltnissen dx : dy : d</w:t>
       </w:r>
       <w:r>
         <w:rPr>
@@ -4345,7 +2679,6 @@
         </w:rPr>
         <w:t>τγ</w:t>
       </w:r>
-      <w:proofErr w:type="spellEnd"/>
       <w:r>
         <w:t xml:space="preserve"> ab. Ladung und absolute Strahlgr</w:t>
       </w:r>
@@ -4384,37 +2717,12 @@
           <w:numId w:val="6"/>
         </w:numPr>
       </w:pPr>
-      <w:proofErr w:type="spellStart"/>
       <w:r>
         <w:rPr>
           <w:b/>
           <w:bCs/>
         </w:rPr>
-        <w:t>UnitGaussianNormalizer</w:t>
-      </w:r>
-      <w:proofErr w:type="spellEnd"/>
-      <w:r>
-        <w:rPr>
-          <w:b/>
-          <w:bCs/>
-        </w:rPr>
-        <w:t xml:space="preserve"> über den </w:t>
-      </w:r>
-      <w:proofErr w:type="spellStart"/>
-      <w:r>
-        <w:rPr>
-          <w:b/>
-          <w:bCs/>
-        </w:rPr>
-        <w:t>data_processor</w:t>
-      </w:r>
-      <w:proofErr w:type="spellEnd"/>
-      <w:r>
-        <w:rPr>
-          <w:b/>
-          <w:bCs/>
-        </w:rPr>
-        <w:t>.</w:t>
+        <w:t>UnitGaussianNormalizer über den data_processor.</w:t>
       </w:r>
       <w:r>
         <w:t xml:space="preserve"> Auf den dimensionslosen Größen bringt er die verbleibenden Werte nur noch auf Mittelwert 0 und Standardabweichung 1.</w:t>
@@ -4449,77 +2757,18 @@
         </w:rPr>
         <w:br/>
       </w:r>
-      <w:proofErr w:type="spellStart"/>
-      <w:r>
-        <w:t>from</w:t>
-      </w:r>
-      <w:proofErr w:type="spellEnd"/>
-      <w:r>
-        <w:t xml:space="preserve"> </w:t>
-      </w:r>
-      <w:proofErr w:type="spellStart"/>
-      <w:r>
-        <w:t>neuralop.</w:t>
-      </w:r>
-      <w:proofErr w:type="gramStart"/>
-      <w:r>
-        <w:t>data.transforms</w:t>
-      </w:r>
-      <w:proofErr w:type="gramEnd"/>
-      <w:r>
-        <w:t>.data_processors</w:t>
-      </w:r>
-      <w:proofErr w:type="spellEnd"/>
-      <w:r>
-        <w:t xml:space="preserve"> </w:t>
-      </w:r>
-      <w:proofErr w:type="spellStart"/>
-      <w:r>
-        <w:t>import</w:t>
-      </w:r>
-      <w:proofErr w:type="spellEnd"/>
-      <w:r>
-        <w:t xml:space="preserve"> </w:t>
-      </w:r>
-      <w:proofErr w:type="spellStart"/>
-      <w:r>
-        <w:t>DefaultDataProcessor</w:t>
-      </w:r>
-      <w:proofErr w:type="spellEnd"/>
+      <w:r>
+        <w:t>from neuralop.data.transforms.data_processors import DefaultDataProcessor</w:t>
+      </w:r>
       <w:r>
         <w:br/>
       </w:r>
       <w:r>
         <w:br/>
-      </w:r>
-      <w:proofErr w:type="spellStart"/>
-      <w:r>
-        <w:t>class</w:t>
-      </w:r>
-      <w:proofErr w:type="spellEnd"/>
-      <w:r>
-        <w:t xml:space="preserve"> </w:t>
-      </w:r>
-      <w:proofErr w:type="spellStart"/>
-      <w:r>
-        <w:t>PhysicalScalingProcessor</w:t>
-      </w:r>
-      <w:proofErr w:type="spellEnd"/>
-      <w:r>
-        <w:t>(</w:t>
-      </w:r>
-      <w:proofErr w:type="spellStart"/>
-      <w:r>
-        <w:t>DefaultDataProcessor</w:t>
-      </w:r>
-      <w:proofErr w:type="spellEnd"/>
-      <w:r>
-        <w:t>):</w:t>
+        <w:t>class PhysicalScalingProcessor(DefaultDataProcessor):</w:t>
       </w:r>
       <w:r>
         <w:br/>
-      </w:r>
-      <w:r>
         <w:t xml:space="preserve">    </w:t>
       </w:r>
       <w:r>
@@ -4538,61 +2787,14 @@
         <w:rPr>
           <w:lang w:val="en-US"/>
         </w:rPr>
-        <w:t xml:space="preserve">def preprocess(self, </w:t>
-      </w:r>
-      <w:proofErr w:type="spellStart"/>
-      <w:r>
-        <w:rPr>
-          <w:lang w:val="en-US"/>
-        </w:rPr>
-        <w:t>data_dict</w:t>
-      </w:r>
-      <w:proofErr w:type="spellEnd"/>
-      <w:r>
-        <w:rPr>
-          <w:lang w:val="en-US"/>
-        </w:rPr>
-        <w:t>, batched=True):</w:t>
+        <w:t>def preprocess(self, data_dict, batched=True):</w:t>
       </w:r>
       <w:r>
         <w:rPr>
           <w:lang w:val="en-US"/>
         </w:rPr>
         <w:br/>
-      </w:r>
-      <w:r>
-        <w:rPr>
-          <w:lang w:val="en-US"/>
-        </w:rPr>
-        <w:t xml:space="preserve">        q = </w:t>
-      </w:r>
-      <w:proofErr w:type="spellStart"/>
-      <w:r>
-        <w:rPr>
-          <w:lang w:val="en-US"/>
-        </w:rPr>
-        <w:t>data_dict</w:t>
-      </w:r>
-      <w:proofErr w:type="spellEnd"/>
-      <w:r>
-        <w:rPr>
-          <w:lang w:val="en-US"/>
-        </w:rPr>
-        <w:t>["Q"].to(</w:t>
-      </w:r>
-      <w:proofErr w:type="spellStart"/>
-      <w:r>
-        <w:rPr>
-          <w:lang w:val="en-US"/>
-        </w:rPr>
-        <w:t>self.device</w:t>
-      </w:r>
-      <w:proofErr w:type="spellEnd"/>
-      <w:r>
-        <w:rPr>
-          <w:lang w:val="en-US"/>
-        </w:rPr>
-        <w:t>).view(-1, 1, 1, 1, 1)</w:t>
+        <w:t xml:space="preserve">        q = data_dict["Q"].to(self.device).view(-1, 1, 1, 1, 1)</w:t>
       </w:r>
       <w:r>
         <w:rPr>
@@ -4604,35 +2806,7 @@
         <w:rPr>
           <w:lang w:val="en-US"/>
         </w:rPr>
-        <w:t xml:space="preserve">        v = </w:t>
-      </w:r>
-      <w:proofErr w:type="spellStart"/>
-      <w:r>
-        <w:rPr>
-          <w:lang w:val="en-US"/>
-        </w:rPr>
-        <w:t>data_dict</w:t>
-      </w:r>
-      <w:proofErr w:type="spellEnd"/>
-      <w:r>
-        <w:rPr>
-          <w:lang w:val="en-US"/>
-        </w:rPr>
-        <w:t>["V"].to(</w:t>
-      </w:r>
-      <w:proofErr w:type="spellStart"/>
-      <w:r>
-        <w:rPr>
-          <w:lang w:val="en-US"/>
-        </w:rPr>
-        <w:t>self.device</w:t>
-      </w:r>
-      <w:proofErr w:type="spellEnd"/>
-      <w:r>
-        <w:rPr>
-          <w:lang w:val="en-US"/>
-        </w:rPr>
-        <w:t>).view(-1, 1, 1, 1, 1)</w:t>
+        <w:t xml:space="preserve">        v = data_dict["V"].to(self.device).view(-1, 1, 1, 1, 1)</w:t>
       </w:r>
       <w:r>
         <w:rPr>
@@ -4644,35 +2818,7 @@
         <w:rPr>
           <w:lang w:val="en-US"/>
         </w:rPr>
-        <w:t xml:space="preserve">        h = </w:t>
-      </w:r>
-      <w:proofErr w:type="spellStart"/>
-      <w:r>
-        <w:rPr>
-          <w:lang w:val="en-US"/>
-        </w:rPr>
-        <w:t>data_dict</w:t>
-      </w:r>
-      <w:proofErr w:type="spellEnd"/>
-      <w:r>
-        <w:rPr>
-          <w:lang w:val="en-US"/>
-        </w:rPr>
-        <w:t>["h"].to(</w:t>
-      </w:r>
-      <w:proofErr w:type="spellStart"/>
-      <w:r>
-        <w:rPr>
-          <w:lang w:val="en-US"/>
-        </w:rPr>
-        <w:t>self.device</w:t>
-      </w:r>
-      <w:proofErr w:type="spellEnd"/>
-      <w:r>
-        <w:rPr>
-          <w:lang w:val="en-US"/>
-        </w:rPr>
-        <w:t>).view(-1, 1, 1, 1, 1)</w:t>
+        <w:t xml:space="preserve">        h = data_dict["h"].to(self.device).view(-1, 1, 1, 1, 1)</w:t>
       </w:r>
       <w:r>
         <w:rPr>
@@ -4684,49 +2830,7 @@
         <w:rPr>
           <w:lang w:val="en-US"/>
         </w:rPr>
-        <w:t xml:space="preserve">        </w:t>
-      </w:r>
-      <w:proofErr w:type="spellStart"/>
-      <w:r>
-        <w:rPr>
-          <w:lang w:val="en-US"/>
-        </w:rPr>
-        <w:t>data_dict</w:t>
-      </w:r>
-      <w:proofErr w:type="spellEnd"/>
-      <w:r>
-        <w:rPr>
-          <w:lang w:val="en-US"/>
-        </w:rPr>
-        <w:t xml:space="preserve">["x"] = </w:t>
-      </w:r>
-      <w:proofErr w:type="spellStart"/>
-      <w:r>
-        <w:rPr>
-          <w:lang w:val="en-US"/>
-        </w:rPr>
-        <w:t>data_dict</w:t>
-      </w:r>
-      <w:proofErr w:type="spellEnd"/>
-      <w:r>
-        <w:rPr>
-          <w:lang w:val="en-US"/>
-        </w:rPr>
-        <w:t>["x"].to(</w:t>
-      </w:r>
-      <w:proofErr w:type="spellStart"/>
-      <w:r>
-        <w:rPr>
-          <w:lang w:val="en-US"/>
-        </w:rPr>
-        <w:t>self.device</w:t>
-      </w:r>
-      <w:proofErr w:type="spellEnd"/>
-      <w:r>
-        <w:rPr>
-          <w:lang w:val="en-US"/>
-        </w:rPr>
-        <w:t>) * v / q</w:t>
+        <w:t xml:space="preserve">        data_dict["x"] = data_dict["x"].to(self.device) * v / q</w:t>
       </w:r>
       <w:r>
         <w:rPr>
@@ -4738,63 +2842,7 @@
         <w:rPr>
           <w:lang w:val="en-US"/>
         </w:rPr>
-        <w:t xml:space="preserve">        </w:t>
-      </w:r>
-      <w:proofErr w:type="spellStart"/>
-      <w:r>
-        <w:rPr>
-          <w:lang w:val="en-US"/>
-        </w:rPr>
-        <w:t>data_dict</w:t>
-      </w:r>
-      <w:proofErr w:type="spellEnd"/>
-      <w:r>
-        <w:rPr>
-          <w:lang w:val="en-US"/>
-        </w:rPr>
-        <w:t xml:space="preserve">["y"] = </w:t>
-      </w:r>
-      <w:proofErr w:type="spellStart"/>
-      <w:r>
-        <w:rPr>
-          <w:lang w:val="en-US"/>
-        </w:rPr>
-        <w:t>data_dict</w:t>
-      </w:r>
-      <w:proofErr w:type="spellEnd"/>
-      <w:r>
-        <w:rPr>
-          <w:lang w:val="en-US"/>
-        </w:rPr>
-        <w:t>["y"].to(</w:t>
-      </w:r>
-      <w:proofErr w:type="spellStart"/>
-      <w:r>
-        <w:rPr>
-          <w:lang w:val="en-US"/>
-        </w:rPr>
-        <w:t>self.device</w:t>
-      </w:r>
-      <w:proofErr w:type="spellEnd"/>
-      <w:r>
-        <w:rPr>
-          <w:lang w:val="en-US"/>
-        </w:rPr>
-        <w:t xml:space="preserve">) * (4 * </w:t>
-      </w:r>
-      <w:proofErr w:type="spellStart"/>
-      <w:r>
-        <w:rPr>
-          <w:lang w:val="en-US"/>
-        </w:rPr>
-        <w:t>torch.pi</w:t>
-      </w:r>
-      <w:proofErr w:type="spellEnd"/>
-      <w:r>
-        <w:rPr>
-          <w:lang w:val="en-US"/>
-        </w:rPr>
-        <w:t xml:space="preserve"> * epsilon_0) * h / q</w:t>
+        <w:t xml:space="preserve">        data_dict["y"] = data_dict["y"].to(self.device) * (4 * torch.pi * epsilon_0) * h / q</w:t>
       </w:r>
       <w:r>
         <w:rPr>
@@ -4806,21 +2854,7 @@
         <w:rPr>
           <w:lang w:val="en-US"/>
         </w:rPr>
-        <w:t xml:space="preserve">        return super().preprocess(</w:t>
-      </w:r>
-      <w:proofErr w:type="spellStart"/>
-      <w:r>
-        <w:rPr>
-          <w:lang w:val="en-US"/>
-        </w:rPr>
-        <w:t>data_dict</w:t>
-      </w:r>
-      <w:proofErr w:type="spellEnd"/>
-      <w:r>
-        <w:rPr>
-          <w:lang w:val="en-US"/>
-        </w:rPr>
-        <w:t>, batched)</w:t>
+        <w:t xml:space="preserve">        return super().preprocess(data_dict, batched)</w:t>
       </w:r>
     </w:p>
     <w:p>
@@ -4849,15 +2883,7 @@
         <w:t xml:space="preserve">. </w:t>
       </w:r>
       <w:r>
-        <w:t xml:space="preserve">Vermeide aber Vorverarbeitung mit </w:t>
-      </w:r>
-      <w:proofErr w:type="spellStart"/>
-      <w:r>
-        <w:t>NumPy</w:t>
-      </w:r>
-      <w:proofErr w:type="spellEnd"/>
-      <w:r>
-        <w:t xml:space="preserve"> im Vorwärtspfad.</w:t>
+        <w:t>Vermeide aber Vorverarbeitung mit NumPy im Vorwärtspfad.</w:t>
       </w:r>
     </w:p>
     <w:p>
@@ -4877,23 +2903,178 @@
         <w:t xml:space="preserve">: </w:t>
       </w:r>
       <w:r>
-        <w:t xml:space="preserve"> Vergleiche dann nicht nur den Feldfehler, sondern auch die Strahlgrößen </w:t>
-      </w:r>
-      <w:proofErr w:type="spellStart"/>
-      <w:r>
-        <w:t>σ_x</w:t>
-      </w:r>
-      <w:proofErr w:type="spellEnd"/>
-      <w:r>
-        <w:t xml:space="preserve">, </w:t>
-      </w:r>
-      <w:proofErr w:type="spellStart"/>
-      <w:r>
-        <w:t>σ_px</w:t>
-      </w:r>
-      <w:proofErr w:type="spellEnd"/>
-      <w:r>
-        <w:t xml:space="preserve"> nach dem Tracking. </w:t>
+        <w:t> Vergleiche dann nicht nur den Feldfehler, sondern auch die Strahlgrößen σ_x, σ_px nach dem Tracking. </w:t>
+      </w:r>
+    </w:p>
+    <w:p/>
+    <w:p>
+      <w:pPr>
+        <w:pStyle w:val="berschrift1"/>
+      </w:pPr>
+      <w:r>
+        <w:lastRenderedPageBreak/>
+        <w:t>Offene Entscheidungen aus Plan: Datengenerierung</w:t>
+      </w:r>
+    </w:p>
+    <w:p>
+      <w:pPr>
+        <w:pStyle w:val="Listenabsatz"/>
+        <w:numPr>
+          <w:ilvl w:val="1"/>
+          <w:numId w:val="6"/>
+        </w:numPr>
+      </w:pPr>
+      <w:r>
+        <w:rPr>
+          <w:b/>
+        </w:rPr>
+        <w:t>Polsterung:</w:t>
+      </w:r>
+      <w:r>
+        <w:t xml:space="preserve"> \rho_{hat} ohne Nullpolsterung</w:t>
+      </w:r>
+      <w:r>
+        <w:rPr>
+          <w:rStyle w:val="Funotenzeichen"/>
+        </w:rPr>
+        <w:footnoteReference w:id="2"/>
+      </w:r>
+      <w:r>
+        <w:t xml:space="preserve"> , dafür FNO mit domai_padding (default = Gitter * 1.25)</w:t>
+      </w:r>
+    </w:p>
+    <w:p>
+      <w:pPr>
+        <w:pStyle w:val="Listenabsatz"/>
+        <w:numPr>
+          <w:ilvl w:val="1"/>
+          <w:numId w:val="6"/>
+        </w:numPr>
+      </w:pPr>
+      <w:r>
+        <w:rPr>
+          <w:b/>
+        </w:rPr>
+        <w:t>Zielgröße:</w:t>
+      </w:r>
+      <w:r>
+        <w:t xml:space="preserve"> \rho_{hat} -&gt; \phi_{hat} (Schnitt A)</w:t>
+      </w:r>
+    </w:p>
+    <w:p>
+      <w:pPr>
+        <w:pStyle w:val="Listenabsatz"/>
+        <w:numPr>
+          <w:ilvl w:val="1"/>
+          <w:numId w:val="6"/>
+        </w:numPr>
+        <w:rPr>
+          <w:lang w:val="en-US"/>
+        </w:rPr>
+      </w:pPr>
+      <w:r>
+        <w:rPr>
+          <w:b/>
+          <w:lang w:val="en-US"/>
+        </w:rPr>
+        <w:t>Datenquelle:</w:t>
+      </w:r>
+      <w:r>
+        <w:rPr>
+          <w:lang w:val="en-US"/>
+        </w:rPr>
+        <w:t xml:space="preserve"> Strahlen aus echtem Cheetah-Lattice (uniform_3d_ellipsoid, from_parameters, </w:t>
+      </w:r>
+      <w:r>
+        <w:rPr>
+          <w:lang w:val="en-US"/>
+        </w:rPr>
+        <w:t xml:space="preserve">ggf. </w:t>
+      </w:r>
+      <w:r>
+        <w:rPr>
+          <w:lang w:val="en-US"/>
+        </w:rPr>
+        <w:t>from</w:t>
+      </w:r>
+      <w:r>
+        <w:rPr>
+          <w:lang w:val="en-US"/>
+        </w:rPr>
+        <w:t>_astra, from_twiss etc.)</w:t>
+      </w:r>
+    </w:p>
+    <w:p>
+      <w:pPr>
+        <w:pStyle w:val="Listenabsatz"/>
+        <w:numPr>
+          <w:ilvl w:val="1"/>
+          <w:numId w:val="6"/>
+        </w:numPr>
+        <w:rPr>
+          <w:lang w:val="en-US"/>
+        </w:rPr>
+      </w:pPr>
+      <w:r>
+        <w:rPr>
+          <w:b/>
+          <w:lang w:val="en-US"/>
+        </w:rPr>
+        <w:t>Datenmengen:</w:t>
+      </w:r>
+    </w:p>
+    <w:p>
+      <w:pPr>
+        <w:pStyle w:val="Listenabsatz"/>
+        <w:numPr>
+          <w:ilvl w:val="2"/>
+          <w:numId w:val="6"/>
+        </w:numPr>
+        <w:rPr>
+          <w:lang w:val="en-US"/>
+        </w:rPr>
+      </w:pPr>
+      <w:r>
+        <w:rPr>
+          <w:lang w:val="en-US"/>
+        </w:rPr>
+        <w:t>Für Probe: 1000</w:t>
+      </w:r>
+    </w:p>
+    <w:p>
+      <w:pPr>
+        <w:pStyle w:val="Listenabsatz"/>
+        <w:numPr>
+          <w:ilvl w:val="2"/>
+          <w:numId w:val="6"/>
+        </w:numPr>
+        <w:rPr>
+          <w:lang w:val="en-US"/>
+        </w:rPr>
+      </w:pPr>
+      <w:r>
+        <w:rPr>
+          <w:lang w:val="en-US"/>
+        </w:rPr>
+        <w:t>Minimum: 5000</w:t>
+      </w:r>
+    </w:p>
+    <w:p>
+      <w:pPr>
+        <w:pStyle w:val="Listenabsatz"/>
+        <w:numPr>
+          <w:ilvl w:val="2"/>
+          <w:numId w:val="6"/>
+        </w:numPr>
+        <w:rPr>
+          <w:lang w:val="en-US"/>
+        </w:rPr>
+      </w:pPr>
+      <w:r>
+        <w:rPr>
+          <w:lang w:val="en-US"/>
+        </w:rPr>
+        <w:t>Maximum: 50000</w:t>
       </w:r>
     </w:p>
     <w:sectPr>
@@ -5035,6 +3216,28 @@
       </w:hyperlink>
     </w:p>
   </w:footnote>
+  <w:footnote w:id="2">
+    <w:p>
+      <w:pPr>
+        <w:pStyle w:val="Funotentext"/>
+      </w:pPr>
+      <w:r>
+        <w:rPr>
+          <w:rStyle w:val="Funotenzeichen"/>
+        </w:rPr>
+        <w:footnoteRef/>
+      </w:r>
+      <w:r>
+        <w:t xml:space="preserve"> Urspr. mit 32³ -&gt; 64³ (</w:t>
+      </w:r>
+      <w:r>
+        <w:t>Hockney-Methode</w:t>
+      </w:r>
+      <w:r>
+        <w:t>) vorgesehen, wenn aus _array_rho() kommend für Berechnnung via FFT, welches periodisch/ zyklisch arbeitet</w:t>
+      </w:r>
+    </w:p>
+  </w:footnote>
 </w:footnotes>
 </file>
 
@@ -5366,7 +3569,7 @@
         <w:ind w:left="1440" w:hanging="360"/>
       </w:pPr>
     </w:lvl>
-    <w:lvl w:ilvl="2" w:tentative="1">
+    <w:lvl w:ilvl="2">
       <w:start w:val="1"/>
       <w:numFmt w:val="decimal"/>
       <w:lvlText w:val="%3."/>
@@ -6456,6 +4659,7 @@
   <w:style w:type="character" w:default="1" w:styleId="Absatz-Standardschriftart">
     <w:name w:val="Default Paragraph Font"/>
     <w:uiPriority w:val="1"/>
+    <w:semiHidden/>
     <w:unhideWhenUsed/>
   </w:style>
   <w:style w:type="table" w:default="1" w:styleId="NormaleTabelle">

</xml_diff>

<commit_message>
Todos für FNO-Modell festgehlaten
</commit_message>
<xml_diff>
--- a/Konzeptionierung/NO Spezifikationen/Modell/Schnittstelle für NO-Surrogat.docx
+++ b/Konzeptionierung/NO Spezifikationen/Modell/Schnittstelle für NO-Surrogat.docx
@@ -52,7 +52,23 @@
           </w:tcPr>
           <w:p>
             <w:r>
-              <w:t>_integrated_green_function()</w:t>
+              <w:t>_</w:t>
+            </w:r>
+            <w:proofErr w:type="spellStart"/>
+            <w:r>
+              <w:t>integrated_green_</w:t>
+            </w:r>
+            <w:proofErr w:type="gramStart"/>
+            <w:r>
+              <w:t>function</w:t>
+            </w:r>
+            <w:proofErr w:type="spellEnd"/>
+            <w:r>
+              <w:t>(</w:t>
+            </w:r>
+            <w:proofErr w:type="gramEnd"/>
+            <w:r>
+              <w:t>)</w:t>
             </w:r>
           </w:p>
         </w:tc>
@@ -70,8 +86,37 @@
           </w:tcPr>
           <w:p>
             <w:r>
-              <w:t>8× _integrated_potential(), Oktanten-Spiegelung, dτ = dz·γ</w:t>
+              <w:t>8× _</w:t>
             </w:r>
+            <w:proofErr w:type="spellStart"/>
+            <w:r>
+              <w:t>integrated_</w:t>
+            </w:r>
+            <w:proofErr w:type="gramStart"/>
+            <w:r>
+              <w:t>potential</w:t>
+            </w:r>
+            <w:proofErr w:type="spellEnd"/>
+            <w:r>
+              <w:t>(</w:t>
+            </w:r>
+            <w:proofErr w:type="gramEnd"/>
+            <w:r>
+              <w:t xml:space="preserve">), Oktanten-Spiegelung, </w:t>
+            </w:r>
+            <w:proofErr w:type="spellStart"/>
+            <w:r>
+              <w:t>dτ</w:t>
+            </w:r>
+            <w:proofErr w:type="spellEnd"/>
+            <w:r>
+              <w:t xml:space="preserve"> = </w:t>
+            </w:r>
+            <w:proofErr w:type="spellStart"/>
+            <w:r>
+              <w:t>dz·γ</w:t>
+            </w:r>
+            <w:proofErr w:type="spellEnd"/>
           </w:p>
         </w:tc>
         <w:tc>
@@ -126,7 +171,23 @@
           </w:tcPr>
           <w:p>
             <w:r>
-              <w:t>_solve_poisson_equation()</w:t>
+              <w:t>_</w:t>
+            </w:r>
+            <w:proofErr w:type="spellStart"/>
+            <w:r>
+              <w:t>solve_poisson_</w:t>
+            </w:r>
+            <w:proofErr w:type="gramStart"/>
+            <w:r>
+              <w:t>equation</w:t>
+            </w:r>
+            <w:proofErr w:type="spellEnd"/>
+            <w:r>
+              <w:t>(</w:t>
+            </w:r>
+            <w:proofErr w:type="gramEnd"/>
+            <w:r>
+              <w:t>)</w:t>
             </w:r>
           </w:p>
         </w:tc>
@@ -143,8 +204,29 @@
             <w:hideMark/>
           </w:tcPr>
           <w:p>
+            <w:proofErr w:type="spellStart"/>
             <w:r>
-              <w:t>rfftn(ρ)·rfftn(G) → irfftn, ÷ 4πε₀, zurückschneiden</w:t>
+              <w:t>rfftn</w:t>
+            </w:r>
+            <w:proofErr w:type="spellEnd"/>
+            <w:r>
+              <w:t>(ρ)·</w:t>
+            </w:r>
+            <w:proofErr w:type="spellStart"/>
+            <w:r>
+              <w:t>rfftn</w:t>
+            </w:r>
+            <w:proofErr w:type="spellEnd"/>
+            <w:r>
+              <w:t xml:space="preserve">(G) → </w:t>
+            </w:r>
+            <w:proofErr w:type="spellStart"/>
+            <w:r>
+              <w:t>irfftn</w:t>
+            </w:r>
+            <w:proofErr w:type="spellEnd"/>
+            <w:r>
+              <w:t>, ÷ 4πε₀, zurückschneiden</w:t>
             </w:r>
           </w:p>
         </w:tc>
@@ -239,7 +321,23 @@
         <w:t>in</w:t>
       </w:r>
       <w:r>
-        <w:t xml:space="preserve"> 7) _solve_poisson_equation() einfügen, </w:t>
+        <w:t xml:space="preserve"> 7) _</w:t>
+      </w:r>
+      <w:proofErr w:type="spellStart"/>
+      <w:r>
+        <w:t>solve_poisson_</w:t>
+      </w:r>
+      <w:proofErr w:type="gramStart"/>
+      <w:r>
+        <w:t>equation</w:t>
+      </w:r>
+      <w:proofErr w:type="spellEnd"/>
+      <w:r>
+        <w:t>(</w:t>
+      </w:r>
+      <w:proofErr w:type="gramEnd"/>
+      <w:r>
+        <w:t xml:space="preserve">) einfügen, </w:t>
       </w:r>
       <w:r>
         <w:t xml:space="preserve">wo FFT von </w:t>
@@ -248,7 +346,15 @@
         <w:t>Green-Funktion(6)</w:t>
       </w:r>
       <w:r>
-        <w:t xml:space="preserve"> und _array_rho(5) </w:t>
+        <w:t xml:space="preserve"> und _</w:t>
+      </w:r>
+      <w:proofErr w:type="spellStart"/>
+      <w:r>
+        <w:t>array_rho</w:t>
+      </w:r>
+      <w:proofErr w:type="spellEnd"/>
+      <w:r>
+        <w:t xml:space="preserve">(5) </w:t>
       </w:r>
       <w:r>
         <w:t xml:space="preserve">hin </w:t>
@@ -284,23 +390,86 @@
       <w:r>
         <w:t>„</w:t>
       </w:r>
-      <w:r>
-        <w:t>phi traegt einen Offset: min = 1.9502e+07 V, Spannweite = 4.6190e+07 V.</w:t>
-      </w:r>
-    </w:p>
-    <w:p>
-      <w:r>
-        <w:t>Die integrierte Greensche Funktion ist nur bis auf eine Konstante bestimmt --</w:t>
-      </w:r>
-    </w:p>
-    <w:p>
-      <w:r>
-        <w:t>physikalisch relevant ist ausschliesslich der Gradient. Fuer ein Surrogat heisst</w:t>
-      </w:r>
-    </w:p>
-    <w:p>
-      <w:r>
-        <w:t>das: Lernziel ist phi ohne Mittelwert, nicht phi.</w:t>
+      <w:proofErr w:type="spellStart"/>
+      <w:r>
+        <w:t>phi</w:t>
+      </w:r>
+      <w:proofErr w:type="spellEnd"/>
+      <w:r>
+        <w:t xml:space="preserve"> </w:t>
+      </w:r>
+      <w:proofErr w:type="spellStart"/>
+      <w:r>
+        <w:t>traegt</w:t>
+      </w:r>
+      <w:proofErr w:type="spellEnd"/>
+      <w:r>
+        <w:t xml:space="preserve"> einen Offset: min = 1.9502e+07 V, Spannweite = 4.6190e+07 V.</w:t>
+      </w:r>
+    </w:p>
+    <w:p>
+      <w:r>
+        <w:t xml:space="preserve">Die integrierte </w:t>
+      </w:r>
+      <w:proofErr w:type="spellStart"/>
+      <w:r>
+        <w:t>Greensche</w:t>
+      </w:r>
+      <w:proofErr w:type="spellEnd"/>
+      <w:r>
+        <w:t xml:space="preserve"> Funktion ist nur bis auf eine Konstante bestimmt --</w:t>
+      </w:r>
+    </w:p>
+    <w:p>
+      <w:r>
+        <w:t xml:space="preserve">physikalisch relevant ist </w:t>
+      </w:r>
+      <w:proofErr w:type="spellStart"/>
+      <w:r>
+        <w:t>ausschliesslich</w:t>
+      </w:r>
+      <w:proofErr w:type="spellEnd"/>
+      <w:r>
+        <w:t xml:space="preserve"> der Gradient. </w:t>
+      </w:r>
+      <w:proofErr w:type="spellStart"/>
+      <w:r>
+        <w:t>Fuer</w:t>
+      </w:r>
+      <w:proofErr w:type="spellEnd"/>
+      <w:r>
+        <w:t xml:space="preserve"> ein Surrogat </w:t>
+      </w:r>
+      <w:proofErr w:type="spellStart"/>
+      <w:r>
+        <w:t>heisst</w:t>
+      </w:r>
+      <w:proofErr w:type="spellEnd"/>
+    </w:p>
+    <w:p>
+      <w:proofErr w:type="gramStart"/>
+      <w:r>
+        <w:t>das</w:t>
+      </w:r>
+      <w:proofErr w:type="gramEnd"/>
+      <w:r>
+        <w:t xml:space="preserve">: Lernziel ist </w:t>
+      </w:r>
+      <w:proofErr w:type="spellStart"/>
+      <w:r>
+        <w:t>phi</w:t>
+      </w:r>
+      <w:proofErr w:type="spellEnd"/>
+      <w:r>
+        <w:t xml:space="preserve"> ohne Mittelwert, nicht </w:t>
+      </w:r>
+      <w:proofErr w:type="spellStart"/>
+      <w:r>
+        <w:t>phi</w:t>
+      </w:r>
+      <w:proofErr w:type="spellEnd"/>
+      <w:r>
+        <w:t>.</w:t>
       </w:r>
       <w:r>
         <w:t>“</w:t>
@@ -311,8 +480,13 @@
         <w:t>PDE (</w:t>
       </w:r>
       <w:r>
-        <w:t>in _integrated_green_function</w:t>
-      </w:r>
+        <w:t>in _</w:t>
+      </w:r>
+      <w:proofErr w:type="spellStart"/>
+      <w:r>
+        <w:t>integrated_green_function</w:t>
+      </w:r>
+      <w:proofErr w:type="spellEnd"/>
       <w:r>
         <w:t xml:space="preserve">) </w:t>
       </w:r>
@@ -323,25 +497,83 @@
         <w:t>anisotrop, d.h. Feldstärke richt</w:t>
       </w:r>
       <w:r>
-        <w:t xml:space="preserve">ungsabhängig sein, da [dx, dy, </w:t>
-      </w:r>
+        <w:t xml:space="preserve">ungsabhängig sein, da [dx, </w:t>
+      </w:r>
+      <w:proofErr w:type="spellStart"/>
+      <w:r>
+        <w:t>dy</w:t>
+      </w:r>
+      <w:proofErr w:type="spellEnd"/>
+      <w:r>
+        <w:t xml:space="preserve">, </w:t>
+      </w:r>
+      <w:proofErr w:type="spellStart"/>
       <w:r>
         <w:rPr>
           <w:b/>
         </w:rPr>
         <w:t>dtau</w:t>
       </w:r>
-      <w:r>
-        <w:t xml:space="preserve">] = [dx, dy, </w:t>
-      </w:r>
+      <w:proofErr w:type="spellEnd"/>
+      <w:r>
+        <w:t xml:space="preserve">] = [dx, </w:t>
+      </w:r>
+      <w:proofErr w:type="spellStart"/>
+      <w:r>
+        <w:t>dy</w:t>
+      </w:r>
+      <w:proofErr w:type="spellEnd"/>
+      <w:r>
+        <w:t xml:space="preserve">, </w:t>
+      </w:r>
+      <w:proofErr w:type="spellStart"/>
       <w:r>
         <w:rPr>
           <w:b/>
         </w:rPr>
-        <w:t>dz * gamma</w:t>
-      </w:r>
-      <w:r>
-        <w:t>], wenn gamma sehr klein oder sehr groß. Das kann andere Anforderungen (hinsichtlich der numerischen Lösbarkeit) an den zu trainierenden Neural Operator stellen, der den bisherigen numerischen Solver in _solve_poisson_equation ersetzen soll.</w:t>
+        <w:t>dz</w:t>
+      </w:r>
+      <w:proofErr w:type="spellEnd"/>
+      <w:r>
+        <w:rPr>
+          <w:b/>
+        </w:rPr>
+        <w:t xml:space="preserve"> * </w:t>
+      </w:r>
+      <w:proofErr w:type="spellStart"/>
+      <w:r>
+        <w:rPr>
+          <w:b/>
+        </w:rPr>
+        <w:t>gamma</w:t>
+      </w:r>
+      <w:proofErr w:type="spellEnd"/>
+      <w:r>
+        <w:t xml:space="preserve">], wenn </w:t>
+      </w:r>
+      <w:proofErr w:type="spellStart"/>
+      <w:r>
+        <w:t>gamma</w:t>
+      </w:r>
+      <w:proofErr w:type="spellEnd"/>
+      <w:r>
+        <w:t xml:space="preserve"> sehr klein oder sehr groß. Das kann andere Anforderungen (hinsichtlich der numerischen Lösbarkeit) an den zu trainierenden </w:t>
+      </w:r>
+      <w:proofErr w:type="spellStart"/>
+      <w:r>
+        <w:t>Neural</w:t>
+      </w:r>
+      <w:proofErr w:type="spellEnd"/>
+      <w:r>
+        <w:t xml:space="preserve"> Operator stellen, der den bisherigen numerischen Solver in _</w:t>
+      </w:r>
+      <w:proofErr w:type="spellStart"/>
+      <w:r>
+        <w:t>solve_poisson_equation</w:t>
+      </w:r>
+      <w:proofErr w:type="spellEnd"/>
+      <w:r>
+        <w:t xml:space="preserve"> ersetzen soll.</w:t>
       </w:r>
     </w:p>
     <w:p/>
@@ -356,8 +588,16 @@
         <w:rPr>
           <w:lang w:val="en-US"/>
         </w:rPr>
-        <w:t>Class SurrogateSpaceChargeKick</w:t>
-      </w:r>
+        <w:t xml:space="preserve">Class </w:t>
+      </w:r>
+      <w:proofErr w:type="spellStart"/>
+      <w:r>
+        <w:rPr>
+          <w:lang w:val="en-US"/>
+        </w:rPr>
+        <w:t>SurrogateSpaceChargeKick</w:t>
+      </w:r>
+      <w:proofErr w:type="spellEnd"/>
     </w:p>
     <w:p>
       <w:pPr>
@@ -368,8 +608,18 @@
         </w:numPr>
       </w:pPr>
       <w:r>
-        <w:t>bisher in cheetah_test.ipynb</w:t>
-      </w:r>
+        <w:t xml:space="preserve">bisher in </w:t>
+      </w:r>
+      <w:proofErr w:type="spellStart"/>
+      <w:r>
+        <w:t>cheetah_</w:t>
+      </w:r>
+      <w:proofErr w:type="gramStart"/>
+      <w:r>
+        <w:t>test.ipynb</w:t>
+      </w:r>
+      <w:proofErr w:type="spellEnd"/>
+      <w:proofErr w:type="gramEnd"/>
     </w:p>
     <w:p>
       <w:pPr>
@@ -380,7 +630,15 @@
         </w:numPr>
       </w:pPr>
       <w:r>
-        <w:t>In ein Eigenes .py überfü</w:t>
+        <w:t>In ein Eigenes .</w:t>
+      </w:r>
+      <w:proofErr w:type="spellStart"/>
+      <w:r>
+        <w:t>py</w:t>
+      </w:r>
+      <w:proofErr w:type="spellEnd"/>
+      <w:r>
+        <w:t xml:space="preserve"> überfü</w:t>
       </w:r>
       <w:r>
         <w:t>hren oder in space_charge_kick.p</w:t>
@@ -401,11 +659,18 @@
         <w:t>ist ein Child</w:t>
       </w:r>
       <w:r>
-        <w:t xml:space="preserve"> von cheetah.</w:t>
+        <w:t xml:space="preserve"> von </w:t>
+      </w:r>
+      <w:proofErr w:type="spellStart"/>
+      <w:proofErr w:type="gramStart"/>
+      <w:r>
+        <w:t>cheetah.</w:t>
       </w:r>
       <w:r>
         <w:t>SpaceChargeKick</w:t>
       </w:r>
+      <w:proofErr w:type="spellEnd"/>
+      <w:proofErr w:type="gramEnd"/>
     </w:p>
     <w:p>
       <w:pPr>
@@ -416,7 +681,23 @@
         </w:numPr>
       </w:pPr>
       <w:r>
-        <w:t>überschreibt _solve_poisson_equation (und __init__),</w:t>
+        <w:t>überschreibt _</w:t>
+      </w:r>
+      <w:proofErr w:type="spellStart"/>
+      <w:r>
+        <w:t>solve_poisson_equation</w:t>
+      </w:r>
+      <w:proofErr w:type="spellEnd"/>
+      <w:r>
+        <w:t xml:space="preserve"> (und __</w:t>
+      </w:r>
+      <w:proofErr w:type="spellStart"/>
+      <w:r>
+        <w:t>init</w:t>
+      </w:r>
+      <w:proofErr w:type="spellEnd"/>
+      <w:r>
+        <w:t>__),</w:t>
       </w:r>
     </w:p>
     <w:p>
@@ -428,7 +709,57 @@
         </w:numPr>
       </w:pPr>
       <w:r>
-        <w:t>um - sobald realisiert - eigenen Solver (d.h. Neural Operator) anzuwenden, wobei solver(rho, cell_size, beam.relativistic_gamma, exact)</w:t>
+        <w:t xml:space="preserve">um - sobald realisiert - eigenen Solver (d.h. </w:t>
+      </w:r>
+      <w:proofErr w:type="spellStart"/>
+      <w:r>
+        <w:t>Neural</w:t>
+      </w:r>
+      <w:proofErr w:type="spellEnd"/>
+      <w:r>
+        <w:t xml:space="preserve"> Operator) anzuwenden, wobei </w:t>
+      </w:r>
+      <w:proofErr w:type="spellStart"/>
+      <w:proofErr w:type="gramStart"/>
+      <w:r>
+        <w:t>solver</w:t>
+      </w:r>
+      <w:proofErr w:type="spellEnd"/>
+      <w:r>
+        <w:t>(</w:t>
+      </w:r>
+      <w:proofErr w:type="spellStart"/>
+      <w:proofErr w:type="gramEnd"/>
+      <w:r>
+        <w:t>rho</w:t>
+      </w:r>
+      <w:proofErr w:type="spellEnd"/>
+      <w:r>
+        <w:t xml:space="preserve">, </w:t>
+      </w:r>
+      <w:proofErr w:type="spellStart"/>
+      <w:r>
+        <w:t>cell_size</w:t>
+      </w:r>
+      <w:proofErr w:type="spellEnd"/>
+      <w:r>
+        <w:t xml:space="preserve">, </w:t>
+      </w:r>
+      <w:proofErr w:type="spellStart"/>
+      <w:r>
+        <w:t>beam.relativistic_gamma</w:t>
+      </w:r>
+      <w:proofErr w:type="spellEnd"/>
+      <w:r>
+        <w:t xml:space="preserve">, </w:t>
+      </w:r>
+      <w:proofErr w:type="spellStart"/>
+      <w:r>
+        <w:t>exact</w:t>
+      </w:r>
+      <w:proofErr w:type="spellEnd"/>
+      <w:r>
+        <w:t>)</w:t>
       </w:r>
     </w:p>
     <w:p>
@@ -440,13 +771,61 @@
         </w:numPr>
       </w:pPr>
       <w:r>
-        <w:t>per default „solver = None“, d.h. Solver/ Neural Opera</w:t>
+        <w:t xml:space="preserve">per </w:t>
+      </w:r>
+      <w:proofErr w:type="spellStart"/>
+      <w:r>
+        <w:t>default</w:t>
+      </w:r>
+      <w:proofErr w:type="spellEnd"/>
+      <w:r>
+        <w:t xml:space="preserve"> „</w:t>
+      </w:r>
+      <w:proofErr w:type="spellStart"/>
+      <w:r>
+        <w:t>solver</w:t>
+      </w:r>
+      <w:proofErr w:type="spellEnd"/>
+      <w:r>
+        <w:t xml:space="preserve"> = None“, d.h. Solver/ </w:t>
+      </w:r>
+      <w:proofErr w:type="spellStart"/>
+      <w:r>
+        <w:t>Neural</w:t>
+      </w:r>
+      <w:proofErr w:type="spellEnd"/>
+      <w:r>
+        <w:t xml:space="preserve"> Opera</w:t>
       </w:r>
       <w:r>
         <w:t>tor noch nicht vor</w:t>
       </w:r>
       <w:r>
-        <w:t>handen – Fallback auf _solve_poisson_equation-Methode bzw. solver davon aus Parent-Class</w:t>
+        <w:t xml:space="preserve">handen – </w:t>
+      </w:r>
+      <w:proofErr w:type="spellStart"/>
+      <w:r>
+        <w:t>Fallback</w:t>
+      </w:r>
+      <w:proofErr w:type="spellEnd"/>
+      <w:r>
+        <w:t xml:space="preserve"> auf _</w:t>
+      </w:r>
+      <w:proofErr w:type="spellStart"/>
+      <w:r>
+        <w:t>solve_poisson_equation</w:t>
+      </w:r>
+      <w:proofErr w:type="spellEnd"/>
+      <w:r>
+        <w:t xml:space="preserve">-Methode bzw. </w:t>
+      </w:r>
+      <w:proofErr w:type="spellStart"/>
+      <w:r>
+        <w:t>solver</w:t>
+      </w:r>
+      <w:proofErr w:type="spellEnd"/>
+      <w:r>
+        <w:t xml:space="preserve"> davon aus Parent-Class</w:t>
       </w:r>
     </w:p>
     <w:p>
@@ -460,12 +839,56 @@
           <w:lang w:val="en-US"/>
         </w:rPr>
       </w:pPr>
-      <w:r>
-        <w:rPr>
-          <w:lang w:val="en-US"/>
-        </w:rPr>
-        <w:t>Methode build_segment(kick_factory) hinzugefügt</w:t>
-      </w:r>
+      <w:proofErr w:type="spellStart"/>
+      <w:r>
+        <w:rPr>
+          <w:lang w:val="en-US"/>
+        </w:rPr>
+        <w:t>Methode</w:t>
+      </w:r>
+      <w:proofErr w:type="spellEnd"/>
+      <w:r>
+        <w:rPr>
+          <w:lang w:val="en-US"/>
+        </w:rPr>
+        <w:t xml:space="preserve"> </w:t>
+      </w:r>
+      <w:proofErr w:type="spellStart"/>
+      <w:r>
+        <w:rPr>
+          <w:lang w:val="en-US"/>
+        </w:rPr>
+        <w:t>build_segment</w:t>
+      </w:r>
+      <w:proofErr w:type="spellEnd"/>
+      <w:r>
+        <w:rPr>
+          <w:lang w:val="en-US"/>
+        </w:rPr>
+        <w:t>(</w:t>
+      </w:r>
+      <w:proofErr w:type="spellStart"/>
+      <w:r>
+        <w:rPr>
+          <w:lang w:val="en-US"/>
+        </w:rPr>
+        <w:t>kick_factory</w:t>
+      </w:r>
+      <w:proofErr w:type="spellEnd"/>
+      <w:r>
+        <w:rPr>
+          <w:lang w:val="en-US"/>
+        </w:rPr>
+        <w:t xml:space="preserve">) </w:t>
+      </w:r>
+      <w:proofErr w:type="spellStart"/>
+      <w:r>
+        <w:rPr>
+          <w:lang w:val="en-US"/>
+        </w:rPr>
+        <w:t>hinzugefügt</w:t>
+      </w:r>
+      <w:proofErr w:type="spellEnd"/>
     </w:p>
     <w:p>
       <w:pPr>
@@ -475,8 +898,13 @@
           <w:numId w:val="2"/>
         </w:numPr>
       </w:pPr>
-      <w:r>
-        <w:t>kick_factory:</w:t>
+      <w:proofErr w:type="spellStart"/>
+      <w:r>
+        <w:t>kick_factory</w:t>
+      </w:r>
+      <w:proofErr w:type="spellEnd"/>
+      <w:r>
+        <w:t>:</w:t>
       </w:r>
     </w:p>
     <w:p>
@@ -488,8 +916,13 @@
         </w:numPr>
       </w:pPr>
       <w:r>
-        <w:t>entweder SurrogateSpaceChargeKick</w:t>
-      </w:r>
+        <w:t xml:space="preserve">entweder </w:t>
+      </w:r>
+      <w:proofErr w:type="spellStart"/>
+      <w:r>
+        <w:t>SurrogateSpaceChargeKick</w:t>
+      </w:r>
+      <w:proofErr w:type="spellEnd"/>
     </w:p>
     <w:p>
       <w:pPr>
@@ -500,8 +933,15 @@
         </w:numPr>
       </w:pPr>
       <w:r>
-        <w:t>oder cheetah.SpaceChargeKick</w:t>
-      </w:r>
+        <w:t xml:space="preserve">oder </w:t>
+      </w:r>
+      <w:proofErr w:type="spellStart"/>
+      <w:proofErr w:type="gramStart"/>
+      <w:r>
+        <w:t>cheetah.SpaceChargeKick</w:t>
+      </w:r>
+      <w:proofErr w:type="spellEnd"/>
+      <w:proofErr w:type="gramEnd"/>
     </w:p>
     <w:p>
       <w:pPr>
@@ -511,8 +951,31 @@
           <w:numId w:val="2"/>
         </w:numPr>
       </w:pPr>
-      <w:r>
-        <w:t>return cheetah.Segment(elements=[…])</w:t>
+      <w:proofErr w:type="spellStart"/>
+      <w:r>
+        <w:t>return</w:t>
+      </w:r>
+      <w:proofErr w:type="spellEnd"/>
+      <w:r>
+        <w:t xml:space="preserve"> </w:t>
+      </w:r>
+      <w:proofErr w:type="spellStart"/>
+      <w:proofErr w:type="gramStart"/>
+      <w:r>
+        <w:t>cheetah.Segment</w:t>
+      </w:r>
+      <w:proofErr w:type="spellEnd"/>
+      <w:proofErr w:type="gramEnd"/>
+      <w:r>
+        <w:t>(</w:t>
+      </w:r>
+      <w:proofErr w:type="spellStart"/>
+      <w:r>
+        <w:t>elements</w:t>
+      </w:r>
+      <w:proofErr w:type="spellEnd"/>
+      <w:r>
+        <w:t>=[…])</w:t>
       </w:r>
     </w:p>
     <w:p>
@@ -525,8 +988,13 @@
       </w:pPr>
       <w:r>
         <w:lastRenderedPageBreak/>
-        <w:t>enthält entsprechenden kick_factory</w:t>
-      </w:r>
+        <w:t xml:space="preserve">enthält entsprechenden </w:t>
+      </w:r>
+      <w:proofErr w:type="spellStart"/>
+      <w:r>
+        <w:t>kick_factory</w:t>
+      </w:r>
+      <w:proofErr w:type="spellEnd"/>
     </w:p>
     <w:p>
       <w:pPr>
@@ -537,8 +1005,21 @@
         </w:numPr>
       </w:pPr>
       <w:r>
-        <w:t>ggf. muss Anordnung innerhalb elements angepasst werden an das jeweilige Lattice</w:t>
-      </w:r>
+        <w:t xml:space="preserve">ggf. muss Anordnung innerhalb </w:t>
+      </w:r>
+      <w:proofErr w:type="spellStart"/>
+      <w:r>
+        <w:t>elements</w:t>
+      </w:r>
+      <w:proofErr w:type="spellEnd"/>
+      <w:r>
+        <w:t xml:space="preserve"> angepasst werden an das jeweilige </w:t>
+      </w:r>
+      <w:proofErr w:type="spellStart"/>
+      <w:r>
+        <w:t>Lattice</w:t>
+      </w:r>
+      <w:proofErr w:type="spellEnd"/>
     </w:p>
     <w:p>
       <w:pPr>
@@ -571,7 +1052,47 @@
           <w:sz w:val="21"/>
           <w:szCs w:val="21"/>
         </w:rPr>
-        <w:t># Minimales Lattice mit SpaceChargeKick.</w:t>
+        <w:t xml:space="preserve"># Minimales </w:t>
+      </w:r>
+      <w:proofErr w:type="spellStart"/>
+      <w:r>
+        <w:rPr>
+          <w:rFonts w:ascii="Consolas" w:hAnsi="Consolas"/>
+          <w:color w:val="8B949E"/>
+          <w:sz w:val="21"/>
+          <w:szCs w:val="21"/>
+        </w:rPr>
+        <w:t>Lattice</w:t>
+      </w:r>
+      <w:proofErr w:type="spellEnd"/>
+      <w:r>
+        <w:rPr>
+          <w:rFonts w:ascii="Consolas" w:hAnsi="Consolas"/>
+          <w:color w:val="8B949E"/>
+          <w:sz w:val="21"/>
+          <w:szCs w:val="21"/>
+        </w:rPr>
+        <w:t xml:space="preserve"> mit </w:t>
+      </w:r>
+      <w:proofErr w:type="spellStart"/>
+      <w:r>
+        <w:rPr>
+          <w:rFonts w:ascii="Consolas" w:hAnsi="Consolas"/>
+          <w:color w:val="8B949E"/>
+          <w:sz w:val="21"/>
+          <w:szCs w:val="21"/>
+        </w:rPr>
+        <w:t>SpaceChargeKick</w:t>
+      </w:r>
+      <w:proofErr w:type="spellEnd"/>
+      <w:r>
+        <w:rPr>
+          <w:rFonts w:ascii="Consolas" w:hAnsi="Consolas"/>
+          <w:color w:val="8B949E"/>
+          <w:sz w:val="21"/>
+          <w:szCs w:val="21"/>
+        </w:rPr>
+        <w:t>.</w:t>
       </w:r>
     </w:p>
     <w:p>
@@ -595,7 +1116,73 @@
           <w:szCs w:val="21"/>
           <w:lang w:val="en-US"/>
         </w:rPr>
-        <w:t># Aufbau uebernommen aus tests/test_space_charge_kick.py::test_cold_uniform_beam_expansion:</w:t>
+        <w:t xml:space="preserve"># Aufbau </w:t>
+      </w:r>
+      <w:proofErr w:type="spellStart"/>
+      <w:r>
+        <w:rPr>
+          <w:rFonts w:ascii="Consolas" w:hAnsi="Consolas"/>
+          <w:color w:val="8B949E"/>
+          <w:sz w:val="21"/>
+          <w:szCs w:val="21"/>
+          <w:lang w:val="en-US"/>
+        </w:rPr>
+        <w:t>uebernommen</w:t>
+      </w:r>
+      <w:proofErr w:type="spellEnd"/>
+      <w:r>
+        <w:rPr>
+          <w:rFonts w:ascii="Consolas" w:hAnsi="Consolas"/>
+          <w:color w:val="8B949E"/>
+          <w:sz w:val="21"/>
+          <w:szCs w:val="21"/>
+          <w:lang w:val="en-US"/>
+        </w:rPr>
+        <w:t xml:space="preserve"> </w:t>
+      </w:r>
+      <w:proofErr w:type="spellStart"/>
+      <w:r>
+        <w:rPr>
+          <w:rFonts w:ascii="Consolas" w:hAnsi="Consolas"/>
+          <w:color w:val="8B949E"/>
+          <w:sz w:val="21"/>
+          <w:szCs w:val="21"/>
+          <w:lang w:val="en-US"/>
+        </w:rPr>
+        <w:t>aus</w:t>
+      </w:r>
+      <w:proofErr w:type="spellEnd"/>
+      <w:r>
+        <w:rPr>
+          <w:rFonts w:ascii="Consolas" w:hAnsi="Consolas"/>
+          <w:color w:val="8B949E"/>
+          <w:sz w:val="21"/>
+          <w:szCs w:val="21"/>
+          <w:lang w:val="en-US"/>
+        </w:rPr>
+        <w:t xml:space="preserve"> </w:t>
+      </w:r>
+      <w:proofErr w:type="gramStart"/>
+      <w:r>
+        <w:rPr>
+          <w:rFonts w:ascii="Consolas" w:hAnsi="Consolas"/>
+          <w:color w:val="8B949E"/>
+          <w:sz w:val="21"/>
+          <w:szCs w:val="21"/>
+          <w:lang w:val="en-US"/>
+        </w:rPr>
+        <w:t>tests/test_space_charge_kick.py::</w:t>
+      </w:r>
+      <w:proofErr w:type="gramEnd"/>
+      <w:r>
+        <w:rPr>
+          <w:rFonts w:ascii="Consolas" w:hAnsi="Consolas"/>
+          <w:color w:val="8B949E"/>
+          <w:sz w:val="21"/>
+          <w:szCs w:val="21"/>
+          <w:lang w:val="en-US"/>
+        </w:rPr>
+        <w:t>test_cold_uniform_beam_expansion:</w:t>
       </w:r>
     </w:p>
     <w:p>
@@ -617,7 +1204,107 @@
           <w:sz w:val="21"/>
           <w:szCs w:val="21"/>
         </w:rPr>
-        <w:t># ein kalter, uniform gefuellter Bunch verdoppelt ueber `section_length` seine Groesse.</w:t>
+        <w:t xml:space="preserve"># ein kalter, uniform </w:t>
+      </w:r>
+      <w:proofErr w:type="spellStart"/>
+      <w:r>
+        <w:rPr>
+          <w:rFonts w:ascii="Consolas" w:hAnsi="Consolas"/>
+          <w:color w:val="8B949E"/>
+          <w:sz w:val="21"/>
+          <w:szCs w:val="21"/>
+        </w:rPr>
+        <w:t>gefuellter</w:t>
+      </w:r>
+      <w:proofErr w:type="spellEnd"/>
+      <w:r>
+        <w:rPr>
+          <w:rFonts w:ascii="Consolas" w:hAnsi="Consolas"/>
+          <w:color w:val="8B949E"/>
+          <w:sz w:val="21"/>
+          <w:szCs w:val="21"/>
+        </w:rPr>
+        <w:t xml:space="preserve"> </w:t>
+      </w:r>
+      <w:proofErr w:type="spellStart"/>
+      <w:r>
+        <w:rPr>
+          <w:rFonts w:ascii="Consolas" w:hAnsi="Consolas"/>
+          <w:color w:val="8B949E"/>
+          <w:sz w:val="21"/>
+          <w:szCs w:val="21"/>
+        </w:rPr>
+        <w:t>Bunch</w:t>
+      </w:r>
+      <w:proofErr w:type="spellEnd"/>
+      <w:r>
+        <w:rPr>
+          <w:rFonts w:ascii="Consolas" w:hAnsi="Consolas"/>
+          <w:color w:val="8B949E"/>
+          <w:sz w:val="21"/>
+          <w:szCs w:val="21"/>
+        </w:rPr>
+        <w:t xml:space="preserve"> verdoppelt </w:t>
+      </w:r>
+      <w:proofErr w:type="spellStart"/>
+      <w:r>
+        <w:rPr>
+          <w:rFonts w:ascii="Consolas" w:hAnsi="Consolas"/>
+          <w:color w:val="8B949E"/>
+          <w:sz w:val="21"/>
+          <w:szCs w:val="21"/>
+        </w:rPr>
+        <w:t>ueber</w:t>
+      </w:r>
+      <w:proofErr w:type="spellEnd"/>
+      <w:r>
+        <w:rPr>
+          <w:rFonts w:ascii="Consolas" w:hAnsi="Consolas"/>
+          <w:color w:val="8B949E"/>
+          <w:sz w:val="21"/>
+          <w:szCs w:val="21"/>
+        </w:rPr>
+        <w:t xml:space="preserve"> `</w:t>
+      </w:r>
+      <w:proofErr w:type="spellStart"/>
+      <w:r>
+        <w:rPr>
+          <w:rFonts w:ascii="Consolas" w:hAnsi="Consolas"/>
+          <w:color w:val="8B949E"/>
+          <w:sz w:val="21"/>
+          <w:szCs w:val="21"/>
+        </w:rPr>
+        <w:t>section_length</w:t>
+      </w:r>
+      <w:proofErr w:type="spellEnd"/>
+      <w:r>
+        <w:rPr>
+          <w:rFonts w:ascii="Consolas" w:hAnsi="Consolas"/>
+          <w:color w:val="8B949E"/>
+          <w:sz w:val="21"/>
+          <w:szCs w:val="21"/>
+        </w:rPr>
+        <w:t xml:space="preserve">` seine </w:t>
+      </w:r>
+      <w:proofErr w:type="spellStart"/>
+      <w:r>
+        <w:rPr>
+          <w:rFonts w:ascii="Consolas" w:hAnsi="Consolas"/>
+          <w:color w:val="8B949E"/>
+          <w:sz w:val="21"/>
+          <w:szCs w:val="21"/>
+        </w:rPr>
+        <w:t>Groesse</w:t>
+      </w:r>
+      <w:proofErr w:type="spellEnd"/>
+      <w:r>
+        <w:rPr>
+          <w:rFonts w:ascii="Consolas" w:hAnsi="Consolas"/>
+          <w:color w:val="8B949E"/>
+          <w:sz w:val="21"/>
+          <w:szCs w:val="21"/>
+        </w:rPr>
+        <w:t>.</w:t>
       </w:r>
     </w:p>
     <w:p>
@@ -639,7 +1326,27 @@
           <w:sz w:val="21"/>
           <w:szCs w:val="21"/>
         </w:rPr>
-        <w:t># Damit ist "einen Kick tracken" nicht nur ausgefuehrt, sondern gegen eine analytische</w:t>
+        <w:t xml:space="preserve"># Damit ist "einen Kick tracken" nicht nur </w:t>
+      </w:r>
+      <w:proofErr w:type="spellStart"/>
+      <w:r>
+        <w:rPr>
+          <w:rFonts w:ascii="Consolas" w:hAnsi="Consolas"/>
+          <w:color w:val="8B949E"/>
+          <w:sz w:val="21"/>
+          <w:szCs w:val="21"/>
+        </w:rPr>
+        <w:t>ausgefuehrt</w:t>
+      </w:r>
+      <w:proofErr w:type="spellEnd"/>
+      <w:r>
+        <w:rPr>
+          <w:rFonts w:ascii="Consolas" w:hAnsi="Consolas"/>
+          <w:color w:val="8B949E"/>
+          <w:sz w:val="21"/>
+          <w:szCs w:val="21"/>
+        </w:rPr>
+        <w:t>, sondern gegen eine analytische</w:t>
       </w:r>
     </w:p>
     <w:p>
@@ -661,7 +1368,27 @@
           <w:sz w:val="21"/>
           <w:szCs w:val="21"/>
         </w:rPr>
-        <w:t># Referenz geprueft.</w:t>
+        <w:t xml:space="preserve"># Referenz </w:t>
+      </w:r>
+      <w:proofErr w:type="spellStart"/>
+      <w:r>
+        <w:rPr>
+          <w:rFonts w:ascii="Consolas" w:hAnsi="Consolas"/>
+          <w:color w:val="8B949E"/>
+          <w:sz w:val="21"/>
+          <w:szCs w:val="21"/>
+        </w:rPr>
+        <w:t>geprueft</w:t>
+      </w:r>
+      <w:proofErr w:type="spellEnd"/>
+      <w:r>
+        <w:rPr>
+          <w:rFonts w:ascii="Consolas" w:hAnsi="Consolas"/>
+          <w:color w:val="8B949E"/>
+          <w:sz w:val="21"/>
+          <w:szCs w:val="21"/>
+        </w:rPr>
+        <w:t>.</w:t>
       </w:r>
     </w:p>
     <w:p>
@@ -714,7 +1441,29 @@
           <w:sz w:val="21"/>
           <w:szCs w:val="21"/>
         </w:rPr>
-        <w:t xml:space="preserve"> torch.tensor(</w:t>
+        <w:t xml:space="preserve"> </w:t>
+      </w:r>
+      <w:proofErr w:type="spellStart"/>
+      <w:proofErr w:type="gramStart"/>
+      <w:r>
+        <w:rPr>
+          <w:rFonts w:ascii="Consolas" w:hAnsi="Consolas"/>
+          <w:color w:val="BBBEBF"/>
+          <w:sz w:val="21"/>
+          <w:szCs w:val="21"/>
+        </w:rPr>
+        <w:t>torch.tensor</w:t>
+      </w:r>
+      <w:proofErr w:type="spellEnd"/>
+      <w:proofErr w:type="gramEnd"/>
+      <w:r>
+        <w:rPr>
+          <w:rFonts w:ascii="Consolas" w:hAnsi="Consolas"/>
+          <w:color w:val="BBBEBF"/>
+          <w:sz w:val="21"/>
+          <w:szCs w:val="21"/>
+        </w:rPr>
+        <w:t>(</w:t>
       </w:r>
       <w:r>
         <w:rPr>
@@ -741,7 +1490,27 @@
           <w:sz w:val="21"/>
           <w:szCs w:val="21"/>
         </w:rPr>
-        <w:t># Bunchradius im Ruhesystem, m</w:t>
+        <w:t xml:space="preserve"># </w:t>
+      </w:r>
+      <w:proofErr w:type="spellStart"/>
+      <w:r>
+        <w:rPr>
+          <w:rFonts w:ascii="Consolas" w:hAnsi="Consolas"/>
+          <w:color w:val="8B949E"/>
+          <w:sz w:val="21"/>
+          <w:szCs w:val="21"/>
+        </w:rPr>
+        <w:t>Bunchradius</w:t>
+      </w:r>
+      <w:proofErr w:type="spellEnd"/>
+      <w:r>
+        <w:rPr>
+          <w:rFonts w:ascii="Consolas" w:hAnsi="Consolas"/>
+          <w:color w:val="8B949E"/>
+          <w:sz w:val="21"/>
+          <w:szCs w:val="21"/>
+        </w:rPr>
+        <w:t xml:space="preserve"> im Ruhesystem, m</w:t>
       </w:r>
     </w:p>
     <w:p>
@@ -795,7 +1564,31 @@
           <w:szCs w:val="21"/>
           <w:lang w:val="en-US"/>
         </w:rPr>
-        <w:t xml:space="preserve"> torch.tensor(</w:t>
+        <w:t xml:space="preserve"> </w:t>
+      </w:r>
+      <w:proofErr w:type="spellStart"/>
+      <w:proofErr w:type="gramStart"/>
+      <w:r>
+        <w:rPr>
+          <w:rFonts w:ascii="Consolas" w:hAnsi="Consolas"/>
+          <w:color w:val="BBBEBF"/>
+          <w:sz w:val="21"/>
+          <w:szCs w:val="21"/>
+          <w:lang w:val="en-US"/>
+        </w:rPr>
+        <w:t>torch.tensor</w:t>
+      </w:r>
+      <w:proofErr w:type="spellEnd"/>
+      <w:proofErr w:type="gramEnd"/>
+      <w:r>
+        <w:rPr>
+          <w:rFonts w:ascii="Consolas" w:hAnsi="Consolas"/>
+          <w:color w:val="BBBEBF"/>
+          <w:sz w:val="21"/>
+          <w:szCs w:val="21"/>
+          <w:lang w:val="en-US"/>
+        </w:rPr>
+        <w:t>(</w:t>
       </w:r>
       <w:r>
         <w:rPr>
@@ -879,7 +1672,31 @@
           <w:szCs w:val="21"/>
           <w:lang w:val="en-US"/>
         </w:rPr>
-        <w:t xml:space="preserve"> torch.tensor(</w:t>
+        <w:t xml:space="preserve"> </w:t>
+      </w:r>
+      <w:proofErr w:type="spellStart"/>
+      <w:proofErr w:type="gramStart"/>
+      <w:r>
+        <w:rPr>
+          <w:rFonts w:ascii="Consolas" w:hAnsi="Consolas"/>
+          <w:color w:val="BBBEBF"/>
+          <w:sz w:val="21"/>
+          <w:szCs w:val="21"/>
+          <w:lang w:val="en-US"/>
+        </w:rPr>
+        <w:t>torch.tensor</w:t>
+      </w:r>
+      <w:proofErr w:type="spellEnd"/>
+      <w:proofErr w:type="gramEnd"/>
+      <w:r>
+        <w:rPr>
+          <w:rFonts w:ascii="Consolas" w:hAnsi="Consolas"/>
+          <w:color w:val="BBBEBF"/>
+          <w:sz w:val="21"/>
+          <w:szCs w:val="21"/>
+          <w:lang w:val="en-US"/>
+        </w:rPr>
+        <w:t>(</w:t>
       </w:r>
       <w:r>
         <w:rPr>
@@ -1165,7 +1982,31 @@
           <w:szCs w:val="21"/>
           <w:lang w:val="en-US"/>
         </w:rPr>
-        <w:t xml:space="preserve"> gamma.square().reciprocal()).sqrt()</w:t>
+        <w:t xml:space="preserve"> </w:t>
+      </w:r>
+      <w:proofErr w:type="spellStart"/>
+      <w:proofErr w:type="gramStart"/>
+      <w:r>
+        <w:rPr>
+          <w:rFonts w:ascii="Consolas" w:hAnsi="Consolas"/>
+          <w:color w:val="BBBEBF"/>
+          <w:sz w:val="21"/>
+          <w:szCs w:val="21"/>
+          <w:lang w:val="en-US"/>
+        </w:rPr>
+        <w:t>gamma.square</w:t>
+      </w:r>
+      <w:proofErr w:type="spellEnd"/>
+      <w:proofErr w:type="gramEnd"/>
+      <w:r>
+        <w:rPr>
+          <w:rFonts w:ascii="Consolas" w:hAnsi="Consolas"/>
+          <w:color w:val="BBBEBF"/>
+          <w:sz w:val="21"/>
+          <w:szCs w:val="21"/>
+          <w:lang w:val="en-US"/>
+        </w:rPr>
+        <w:t>().reciprocal()).sqrt()</w:t>
       </w:r>
     </w:p>
     <w:p>
@@ -1223,7 +2064,29 @@
           <w:szCs w:val="21"/>
           <w:lang w:val="en-US"/>
         </w:rPr>
-        <w:t xml:space="preserve"> cheetah.ParticleBeam.uniform_3d_ellipsoid(</w:t>
+        <w:t xml:space="preserve"> </w:t>
+      </w:r>
+      <w:proofErr w:type="gramStart"/>
+      <w:r>
+        <w:rPr>
+          <w:rFonts w:ascii="Consolas" w:hAnsi="Consolas"/>
+          <w:color w:val="BBBEBF"/>
+          <w:sz w:val="21"/>
+          <w:szCs w:val="21"/>
+          <w:lang w:val="en-US"/>
+        </w:rPr>
+        <w:t>cheetah.ParticleBeam.uniform</w:t>
+      </w:r>
+      <w:proofErr w:type="gramEnd"/>
+      <w:r>
+        <w:rPr>
+          <w:rFonts w:ascii="Consolas" w:hAnsi="Consolas"/>
+          <w:color w:val="BBBEBF"/>
+          <w:sz w:val="21"/>
+          <w:szCs w:val="21"/>
+          <w:lang w:val="en-US"/>
+        </w:rPr>
+        <w:t>_3d_ellipsoid(</w:t>
       </w:r>
     </w:p>
     <w:p>
@@ -1249,6 +2112,7 @@
         </w:rPr>
         <w:t xml:space="preserve">    </w:t>
       </w:r>
+      <w:proofErr w:type="spellStart"/>
       <w:r>
         <w:rPr>
           <w:rFonts w:ascii="Consolas" w:hAnsi="Consolas"/>
@@ -1259,6 +2123,7 @@
         </w:rPr>
         <w:t>num_particles</w:t>
       </w:r>
+      <w:proofErr w:type="spellEnd"/>
       <w:r>
         <w:rPr>
           <w:rFonts w:ascii="Consolas" w:hAnsi="Consolas"/>
@@ -1313,6 +2178,7 @@
         </w:rPr>
         <w:t xml:space="preserve">    </w:t>
       </w:r>
+      <w:proofErr w:type="spellStart"/>
       <w:r>
         <w:rPr>
           <w:rFonts w:ascii="Consolas" w:hAnsi="Consolas"/>
@@ -1323,6 +2189,7 @@
         </w:rPr>
         <w:t>total_charge</w:t>
       </w:r>
+      <w:proofErr w:type="spellEnd"/>
       <w:r>
         <w:rPr>
           <w:rFonts w:ascii="Consolas" w:hAnsi="Consolas"/>
@@ -1376,6 +2243,7 @@
         </w:rPr>
         <w:t xml:space="preserve">    </w:t>
       </w:r>
+      <w:proofErr w:type="spellStart"/>
       <w:r>
         <w:rPr>
           <w:rFonts w:ascii="Consolas" w:hAnsi="Consolas"/>
@@ -1385,6 +2253,7 @@
         </w:rPr>
         <w:t>energy</w:t>
       </w:r>
+      <w:proofErr w:type="spellEnd"/>
       <w:r>
         <w:rPr>
           <w:rFonts w:ascii="Consolas" w:hAnsi="Consolas"/>
@@ -1434,6 +2303,7 @@
         </w:rPr>
         <w:t xml:space="preserve">    </w:t>
       </w:r>
+      <w:proofErr w:type="spellStart"/>
       <w:r>
         <w:rPr>
           <w:rFonts w:ascii="Consolas" w:hAnsi="Consolas"/>
@@ -1443,6 +2313,7 @@
         </w:rPr>
         <w:t>radius_x</w:t>
       </w:r>
+      <w:proofErr w:type="spellEnd"/>
       <w:r>
         <w:rPr>
           <w:rFonts w:ascii="Consolas" w:hAnsi="Consolas"/>
@@ -1483,6 +2354,7 @@
         </w:rPr>
         <w:t xml:space="preserve">    </w:t>
       </w:r>
+      <w:proofErr w:type="spellStart"/>
       <w:r>
         <w:rPr>
           <w:rFonts w:ascii="Consolas" w:hAnsi="Consolas"/>
@@ -1492,6 +2364,7 @@
         </w:rPr>
         <w:t>radius_y</w:t>
       </w:r>
+      <w:proofErr w:type="spellEnd"/>
       <w:r>
         <w:rPr>
           <w:rFonts w:ascii="Consolas" w:hAnsi="Consolas"/>
@@ -1532,6 +2405,7 @@
         </w:rPr>
         <w:t xml:space="preserve">    </w:t>
       </w:r>
+      <w:proofErr w:type="spellStart"/>
       <w:r>
         <w:rPr>
           <w:rFonts w:ascii="Consolas" w:hAnsi="Consolas"/>
@@ -1541,6 +2415,7 @@
         </w:rPr>
         <w:t>radius_tau</w:t>
       </w:r>
+      <w:proofErr w:type="spellEnd"/>
       <w:r>
         <w:rPr>
           <w:rFonts w:ascii="Consolas" w:hAnsi="Consolas"/>
@@ -1575,7 +2450,27 @@
           <w:sz w:val="21"/>
           <w:szCs w:val="21"/>
         </w:rPr>
-        <w:t xml:space="preserve"> gamma </w:t>
+        <w:t xml:space="preserve"> </w:t>
+      </w:r>
+      <w:proofErr w:type="spellStart"/>
+      <w:r>
+        <w:rPr>
+          <w:rFonts w:ascii="Consolas" w:hAnsi="Consolas"/>
+          <w:color w:val="BBBEBF"/>
+          <w:sz w:val="21"/>
+          <w:szCs w:val="21"/>
+        </w:rPr>
+        <w:t>gamma</w:t>
+      </w:r>
+      <w:proofErr w:type="spellEnd"/>
+      <w:r>
+        <w:rPr>
+          <w:rFonts w:ascii="Consolas" w:hAnsi="Consolas"/>
+          <w:color w:val="BBBEBF"/>
+          <w:sz w:val="21"/>
+          <w:szCs w:val="21"/>
+        </w:rPr>
+        <w:t xml:space="preserve"> </w:t>
       </w:r>
       <w:r>
         <w:rPr>
@@ -1593,7 +2488,28 @@
           <w:sz w:val="21"/>
           <w:szCs w:val="21"/>
         </w:rPr>
-        <w:t xml:space="preserve"> beta,  </w:t>
+        <w:t xml:space="preserve"> </w:t>
+      </w:r>
+      <w:proofErr w:type="spellStart"/>
+      <w:proofErr w:type="gramStart"/>
+      <w:r>
+        <w:rPr>
+          <w:rFonts w:ascii="Consolas" w:hAnsi="Consolas"/>
+          <w:color w:val="BBBEBF"/>
+          <w:sz w:val="21"/>
+          <w:szCs w:val="21"/>
+        </w:rPr>
+        <w:t>beta</w:t>
+      </w:r>
+      <w:proofErr w:type="spellEnd"/>
+      <w:r>
+        <w:rPr>
+          <w:rFonts w:ascii="Consolas" w:hAnsi="Consolas"/>
+          <w:color w:val="BBBEBF"/>
+          <w:sz w:val="21"/>
+          <w:szCs w:val="21"/>
+        </w:rPr>
+        <w:t>,  </w:t>
       </w:r>
       <w:r>
         <w:rPr>
@@ -1602,7 +2518,37 @@
           <w:sz w:val="21"/>
           <w:szCs w:val="21"/>
         </w:rPr>
-        <w:t># Bunchlaenge im Laborsystem</w:t>
+        <w:t>#</w:t>
+      </w:r>
+      <w:proofErr w:type="gramEnd"/>
+      <w:r>
+        <w:rPr>
+          <w:rFonts w:ascii="Consolas" w:hAnsi="Consolas"/>
+          <w:color w:val="8B949E"/>
+          <w:sz w:val="21"/>
+          <w:szCs w:val="21"/>
+        </w:rPr>
+        <w:t xml:space="preserve"> </w:t>
+      </w:r>
+      <w:proofErr w:type="spellStart"/>
+      <w:r>
+        <w:rPr>
+          <w:rFonts w:ascii="Consolas" w:hAnsi="Consolas"/>
+          <w:color w:val="8B949E"/>
+          <w:sz w:val="21"/>
+          <w:szCs w:val="21"/>
+        </w:rPr>
+        <w:t>Bunchlaenge</w:t>
+      </w:r>
+      <w:proofErr w:type="spellEnd"/>
+      <w:r>
+        <w:rPr>
+          <w:rFonts w:ascii="Consolas" w:hAnsi="Consolas"/>
+          <w:color w:val="8B949E"/>
+          <w:sz w:val="21"/>
+          <w:szCs w:val="21"/>
+        </w:rPr>
+        <w:t xml:space="preserve"> im Laborsystem</w:t>
       </w:r>
     </w:p>
     <w:p>
@@ -1626,6 +2572,7 @@
         </w:rPr>
         <w:t xml:space="preserve">    </w:t>
       </w:r>
+      <w:proofErr w:type="spellStart"/>
       <w:r>
         <w:rPr>
           <w:rFonts w:ascii="Consolas" w:hAnsi="Consolas"/>
@@ -1635,6 +2582,7 @@
         </w:rPr>
         <w:t>sigma_px</w:t>
       </w:r>
+      <w:proofErr w:type="spellEnd"/>
       <w:r>
         <w:rPr>
           <w:rFonts w:ascii="Consolas" w:hAnsi="Consolas"/>
@@ -1644,14 +2592,27 @@
         </w:rPr>
         <w:t>=</w:t>
       </w:r>
-      <w:r>
-        <w:rPr>
-          <w:rFonts w:ascii="Consolas" w:hAnsi="Consolas"/>
-          <w:color w:val="BBBEBF"/>
-          <w:sz w:val="21"/>
-          <w:szCs w:val="21"/>
-        </w:rPr>
-        <w:t>torch.tensor(</w:t>
+      <w:proofErr w:type="spellStart"/>
+      <w:proofErr w:type="gramStart"/>
+      <w:r>
+        <w:rPr>
+          <w:rFonts w:ascii="Consolas" w:hAnsi="Consolas"/>
+          <w:color w:val="BBBEBF"/>
+          <w:sz w:val="21"/>
+          <w:szCs w:val="21"/>
+        </w:rPr>
+        <w:t>torch.tensor</w:t>
+      </w:r>
+      <w:proofErr w:type="spellEnd"/>
+      <w:proofErr w:type="gramEnd"/>
+      <w:r>
+        <w:rPr>
+          <w:rFonts w:ascii="Consolas" w:hAnsi="Consolas"/>
+          <w:color w:val="BBBEBF"/>
+          <w:sz w:val="21"/>
+          <w:szCs w:val="21"/>
+        </w:rPr>
+        <w:t>(</w:t>
       </w:r>
       <w:r>
         <w:rPr>
@@ -1702,6 +2663,7 @@
         </w:rPr>
         <w:t xml:space="preserve">    </w:t>
       </w:r>
+      <w:proofErr w:type="spellStart"/>
       <w:r>
         <w:rPr>
           <w:rFonts w:ascii="Consolas" w:hAnsi="Consolas"/>
@@ -1711,6 +2673,7 @@
         </w:rPr>
         <w:t>sigma_py</w:t>
       </w:r>
+      <w:proofErr w:type="spellEnd"/>
       <w:r>
         <w:rPr>
           <w:rFonts w:ascii="Consolas" w:hAnsi="Consolas"/>
@@ -1720,14 +2683,27 @@
         </w:rPr>
         <w:t>=</w:t>
       </w:r>
-      <w:r>
-        <w:rPr>
-          <w:rFonts w:ascii="Consolas" w:hAnsi="Consolas"/>
-          <w:color w:val="BBBEBF"/>
-          <w:sz w:val="21"/>
-          <w:szCs w:val="21"/>
-        </w:rPr>
-        <w:t>torch.tensor(</w:t>
+      <w:proofErr w:type="spellStart"/>
+      <w:proofErr w:type="gramStart"/>
+      <w:r>
+        <w:rPr>
+          <w:rFonts w:ascii="Consolas" w:hAnsi="Consolas"/>
+          <w:color w:val="BBBEBF"/>
+          <w:sz w:val="21"/>
+          <w:szCs w:val="21"/>
+        </w:rPr>
+        <w:t>torch.tensor</w:t>
+      </w:r>
+      <w:proofErr w:type="spellEnd"/>
+      <w:proofErr w:type="gramEnd"/>
+      <w:r>
+        <w:rPr>
+          <w:rFonts w:ascii="Consolas" w:hAnsi="Consolas"/>
+          <w:color w:val="BBBEBF"/>
+          <w:sz w:val="21"/>
+          <w:szCs w:val="21"/>
+        </w:rPr>
+        <w:t>(</w:t>
       </w:r>
       <w:r>
         <w:rPr>
@@ -1769,6 +2745,7 @@
         </w:rPr>
         <w:t xml:space="preserve">    </w:t>
       </w:r>
+      <w:proofErr w:type="spellStart"/>
       <w:r>
         <w:rPr>
           <w:rFonts w:ascii="Consolas" w:hAnsi="Consolas"/>
@@ -1778,6 +2755,7 @@
         </w:rPr>
         <w:t>sigma_p</w:t>
       </w:r>
+      <w:proofErr w:type="spellEnd"/>
       <w:r>
         <w:rPr>
           <w:rFonts w:ascii="Consolas" w:hAnsi="Consolas"/>
@@ -1787,14 +2765,27 @@
         </w:rPr>
         <w:t>=</w:t>
       </w:r>
-      <w:r>
-        <w:rPr>
-          <w:rFonts w:ascii="Consolas" w:hAnsi="Consolas"/>
-          <w:color w:val="BBBEBF"/>
-          <w:sz w:val="21"/>
-          <w:szCs w:val="21"/>
-        </w:rPr>
-        <w:t>torch.tensor(</w:t>
+      <w:proofErr w:type="spellStart"/>
+      <w:proofErr w:type="gramStart"/>
+      <w:r>
+        <w:rPr>
+          <w:rFonts w:ascii="Consolas" w:hAnsi="Consolas"/>
+          <w:color w:val="BBBEBF"/>
+          <w:sz w:val="21"/>
+          <w:szCs w:val="21"/>
+        </w:rPr>
+        <w:t>torch.tensor</w:t>
+      </w:r>
+      <w:proofErr w:type="spellEnd"/>
+      <w:proofErr w:type="gramEnd"/>
+      <w:r>
+        <w:rPr>
+          <w:rFonts w:ascii="Consolas" w:hAnsi="Consolas"/>
+          <w:color w:val="BBBEBF"/>
+          <w:sz w:val="21"/>
+          <w:szCs w:val="21"/>
+        </w:rPr>
+        <w:t>(</w:t>
       </w:r>
       <w:r>
         <w:rPr>
@@ -1894,7 +2885,85 @@
           <w:szCs w:val="21"/>
           <w:lang w:val="en-US"/>
         </w:rPr>
-        <w:t xml:space="preserve"> build_segment(SurrogateSpaceChargeKick, solver=neuraloperator)</w:t>
+        <w:t xml:space="preserve"> </w:t>
+      </w:r>
+      <w:proofErr w:type="spellStart"/>
+      <w:r>
+        <w:rPr>
+          <w:rFonts w:ascii="Consolas" w:hAnsi="Consolas"/>
+          <w:color w:val="BBBEBF"/>
+          <w:sz w:val="21"/>
+          <w:szCs w:val="21"/>
+          <w:lang w:val="en-US"/>
+        </w:rPr>
+        <w:t>build_</w:t>
+      </w:r>
+      <w:proofErr w:type="gramStart"/>
+      <w:r>
+        <w:rPr>
+          <w:rFonts w:ascii="Consolas" w:hAnsi="Consolas"/>
+          <w:color w:val="BBBEBF"/>
+          <w:sz w:val="21"/>
+          <w:szCs w:val="21"/>
+          <w:lang w:val="en-US"/>
+        </w:rPr>
+        <w:t>segment</w:t>
+      </w:r>
+      <w:proofErr w:type="spellEnd"/>
+      <w:r>
+        <w:rPr>
+          <w:rFonts w:ascii="Consolas" w:hAnsi="Consolas"/>
+          <w:color w:val="BBBEBF"/>
+          <w:sz w:val="21"/>
+          <w:szCs w:val="21"/>
+          <w:lang w:val="en-US"/>
+        </w:rPr>
+        <w:t>(</w:t>
+      </w:r>
+      <w:proofErr w:type="spellStart"/>
+      <w:proofErr w:type="gramEnd"/>
+      <w:r>
+        <w:rPr>
+          <w:rFonts w:ascii="Consolas" w:hAnsi="Consolas"/>
+          <w:color w:val="BBBEBF"/>
+          <w:sz w:val="21"/>
+          <w:szCs w:val="21"/>
+          <w:lang w:val="en-US"/>
+        </w:rPr>
+        <w:t>SurrogateSpaceChargeKick</w:t>
+      </w:r>
+      <w:proofErr w:type="spellEnd"/>
+      <w:r>
+        <w:rPr>
+          <w:rFonts w:ascii="Consolas" w:hAnsi="Consolas"/>
+          <w:color w:val="BBBEBF"/>
+          <w:sz w:val="21"/>
+          <w:szCs w:val="21"/>
+          <w:lang w:val="en-US"/>
+        </w:rPr>
+        <w:t>, solver=</w:t>
+      </w:r>
+      <w:proofErr w:type="spellStart"/>
+      <w:r>
+        <w:rPr>
+          <w:rFonts w:ascii="Consolas" w:hAnsi="Consolas"/>
+          <w:color w:val="BBBEBF"/>
+          <w:sz w:val="21"/>
+          <w:szCs w:val="21"/>
+          <w:lang w:val="en-US"/>
+        </w:rPr>
+        <w:t>neuraloperator</w:t>
+      </w:r>
+      <w:proofErr w:type="spellEnd"/>
+      <w:r>
+        <w:rPr>
+          <w:rFonts w:ascii="Consolas" w:hAnsi="Consolas"/>
+          <w:color w:val="BBBEBF"/>
+          <w:sz w:val="21"/>
+          <w:szCs w:val="21"/>
+          <w:lang w:val="en-US"/>
+        </w:rPr>
+        <w:t>)</w:t>
       </w:r>
     </w:p>
     <w:p>
@@ -1909,14 +2978,25 @@
           <w:szCs w:val="21"/>
         </w:rPr>
       </w:pPr>
-      <w:r>
-        <w:rPr>
-          <w:rFonts w:ascii="Consolas" w:hAnsi="Consolas"/>
-          <w:color w:val="BBBEBF"/>
-          <w:sz w:val="21"/>
-          <w:szCs w:val="21"/>
-        </w:rPr>
-        <w:t xml:space="preserve">outgoing </w:t>
+      <w:proofErr w:type="spellStart"/>
+      <w:r>
+        <w:rPr>
+          <w:rFonts w:ascii="Consolas" w:hAnsi="Consolas"/>
+          <w:color w:val="BBBEBF"/>
+          <w:sz w:val="21"/>
+          <w:szCs w:val="21"/>
+        </w:rPr>
+        <w:t>outgoing</w:t>
+      </w:r>
+      <w:proofErr w:type="spellEnd"/>
+      <w:r>
+        <w:rPr>
+          <w:rFonts w:ascii="Consolas" w:hAnsi="Consolas"/>
+          <w:color w:val="BBBEBF"/>
+          <w:sz w:val="21"/>
+          <w:szCs w:val="21"/>
+        </w:rPr>
+        <w:t xml:space="preserve"> </w:t>
       </w:r>
       <w:r>
         <w:rPr>
@@ -1934,19 +3014,90 @@
           <w:sz w:val="21"/>
           <w:szCs w:val="21"/>
         </w:rPr>
-        <w:t xml:space="preserve"> segment.track(incoming)</w:t>
+        <w:t xml:space="preserve"> </w:t>
+      </w:r>
+      <w:proofErr w:type="spellStart"/>
+      <w:proofErr w:type="gramStart"/>
+      <w:r>
+        <w:rPr>
+          <w:rFonts w:ascii="Consolas" w:hAnsi="Consolas"/>
+          <w:color w:val="BBBEBF"/>
+          <w:sz w:val="21"/>
+          <w:szCs w:val="21"/>
+        </w:rPr>
+        <w:t>segment.track</w:t>
+      </w:r>
+      <w:proofErr w:type="spellEnd"/>
+      <w:proofErr w:type="gramEnd"/>
+      <w:r>
+        <w:rPr>
+          <w:rFonts w:ascii="Consolas" w:hAnsi="Consolas"/>
+          <w:color w:val="BBBEBF"/>
+          <w:sz w:val="21"/>
+          <w:szCs w:val="21"/>
+        </w:rPr>
+        <w:t>(</w:t>
+      </w:r>
+      <w:proofErr w:type="spellStart"/>
+      <w:r>
+        <w:rPr>
+          <w:rFonts w:ascii="Consolas" w:hAnsi="Consolas"/>
+          <w:color w:val="BBBEBF"/>
+          <w:sz w:val="21"/>
+          <w:szCs w:val="21"/>
+        </w:rPr>
+        <w:t>incoming</w:t>
+      </w:r>
+      <w:proofErr w:type="spellEnd"/>
+      <w:r>
+        <w:rPr>
+          <w:rFonts w:ascii="Consolas" w:hAnsi="Consolas"/>
+          <w:color w:val="BBBEBF"/>
+          <w:sz w:val="21"/>
+          <w:szCs w:val="21"/>
+        </w:rPr>
+        <w:t>)</w:t>
       </w:r>
     </w:p>
     <w:p/>
     <w:p>
       <w:r>
-        <w:t>Zitat Claude Opus 5 (cheetah_test.ipynb): Die FFT-Faltung ist zyklisch, die Physik ist es nicht. Deshalb wird ρ auf das doppelte</w:t>
+        <w:t>Zitat Claude Opus 5 (</w:t>
+      </w:r>
+      <w:proofErr w:type="spellStart"/>
+      <w:r>
+        <w:t>cheetah_</w:t>
+      </w:r>
+      <w:proofErr w:type="gramStart"/>
+      <w:r>
+        <w:t>test.ipynb</w:t>
+      </w:r>
+      <w:proofErr w:type="spellEnd"/>
+      <w:proofErr w:type="gramEnd"/>
+      <w:r>
+        <w:t>): Die FFT-Faltung ist zyklisch, die Physik ist es nicht. Deshalb wird ρ auf das doppelte</w:t>
       </w:r>
       <w:r>
         <w:t xml:space="preserve"> </w:t>
       </w:r>
       <w:r>
-        <w:t>Gitter genullpolstert (`_array_rho`), G in alle acht Oktanten gespiegelt, und nach der</w:t>
+        <w:t xml:space="preserve">Gitter </w:t>
+      </w:r>
+      <w:proofErr w:type="spellStart"/>
+      <w:r>
+        <w:t>genullpolstert</w:t>
+      </w:r>
+      <w:proofErr w:type="spellEnd"/>
+      <w:r>
+        <w:t xml:space="preserve"> (`_</w:t>
+      </w:r>
+      <w:proofErr w:type="spellStart"/>
+      <w:r>
+        <w:t>array_rho</w:t>
+      </w:r>
+      <w:proofErr w:type="spellEnd"/>
+      <w:r>
+        <w:t>`), G in alle acht Oktanten gespiegelt, und nach der</w:t>
       </w:r>
       <w:r>
         <w:t xml:space="preserve"> </w:t>
@@ -1994,8 +3145,45 @@
     <w:p>
       <w:r>
         <w:lastRenderedPageBreak/>
-        <w:t>\mathcal{S}: \rho \;\longmapsto\; \phi</w:t>
-      </w:r>
+        <w:t>\</w:t>
+      </w:r>
+      <w:proofErr w:type="spellStart"/>
+      <w:r>
+        <w:t>mathcal</w:t>
+      </w:r>
+      <w:proofErr w:type="spellEnd"/>
+      <w:r>
+        <w:t>{S}: \</w:t>
+      </w:r>
+      <w:proofErr w:type="spellStart"/>
+      <w:r>
+        <w:t>rho</w:t>
+      </w:r>
+      <w:proofErr w:type="spellEnd"/>
+      <w:r>
+        <w:t xml:space="preserve"> </w:t>
+      </w:r>
+      <w:proofErr w:type="gramStart"/>
+      <w:r>
+        <w:t>\;\</w:t>
+      </w:r>
+      <w:proofErr w:type="spellStart"/>
+      <w:r>
+        <w:t>longmapsto</w:t>
+      </w:r>
+      <w:proofErr w:type="spellEnd"/>
+      <w:r>
+        <w:t>\</w:t>
+      </w:r>
+      <w:proofErr w:type="gramEnd"/>
+      <w:r>
+        <w:t>; \</w:t>
+      </w:r>
+      <w:proofErr w:type="spellStart"/>
+      <w:r>
+        <w:t>phi</w:t>
+      </w:r>
+      <w:proofErr w:type="spellEnd"/>
     </w:p>
     <w:p>
       <w:r>
@@ -2013,7 +3201,31 @@
     </w:p>
     <w:p>
       <w:r>
-        <w:t xml:space="preserve">Der Charme dabei: die exakte Lösung ist eine Faltung im Ortsraum, also eine punktweise Multiplikation im Fourierraum. Genau das macht eine FNO-Schicht. Der Operator, den du lernen willst, liegt bauartlich schon in der Architektur — dein Netz muss im Grunde nur den Kern </w:t>
+        <w:t xml:space="preserve">Der Charme dabei: die exakte Lösung ist eine Faltung im </w:t>
+      </w:r>
+      <w:proofErr w:type="spellStart"/>
+      <w:r>
+        <w:t>Ortsraum</w:t>
+      </w:r>
+      <w:proofErr w:type="spellEnd"/>
+      <w:r>
+        <w:t xml:space="preserve">, also eine punktweise Multiplikation im </w:t>
+      </w:r>
+      <w:proofErr w:type="spellStart"/>
+      <w:r>
+        <w:t>Fourierraum</w:t>
+      </w:r>
+      <w:proofErr w:type="spellEnd"/>
+      <w:r>
+        <w:t xml:space="preserve">. Genau das macht eine FNO-Schicht. Der Operator, den du lernen willst, liegt </w:t>
+      </w:r>
+      <w:proofErr w:type="spellStart"/>
+      <w:r>
+        <w:t>bauartlich</w:t>
+      </w:r>
+      <w:proofErr w:type="spellEnd"/>
+      <w:r>
+        <w:t xml:space="preserve"> schon in der Architektur — dein Netz muss im Grunde nur den Kern </w:t>
       </w:r>
       <w:r>
         <w:rPr>
@@ -2051,13 +3263,63 @@
         <w:t>innerhalb von</w:t>
       </w:r>
       <w:r>
-        <w:t xml:space="preserve"> _solve_poisson_equation. </w:t>
-      </w:r>
-      <w:r>
-        <w:rPr>
-          <w:lang w:val="en-US"/>
-        </w:rPr>
-        <w:t xml:space="preserve">Rein: charge_density (ungepaddet, grid_shape) plus </w:t>
+        <w:t xml:space="preserve"> _</w:t>
+      </w:r>
+      <w:proofErr w:type="spellStart"/>
+      <w:r>
+        <w:t>solve_poisson_equation</w:t>
+      </w:r>
+      <w:proofErr w:type="spellEnd"/>
+      <w:r>
+        <w:t xml:space="preserve">. </w:t>
+      </w:r>
+      <w:r>
+        <w:rPr>
+          <w:lang w:val="en-US"/>
+        </w:rPr>
+        <w:t xml:space="preserve">Rein: </w:t>
+      </w:r>
+      <w:proofErr w:type="spellStart"/>
+      <w:r>
+        <w:rPr>
+          <w:lang w:val="en-US"/>
+        </w:rPr>
+        <w:t>charge_density</w:t>
+      </w:r>
+      <w:proofErr w:type="spellEnd"/>
+      <w:r>
+        <w:rPr>
+          <w:lang w:val="en-US"/>
+        </w:rPr>
+        <w:t xml:space="preserve"> (</w:t>
+      </w:r>
+      <w:proofErr w:type="spellStart"/>
+      <w:r>
+        <w:rPr>
+          <w:lang w:val="en-US"/>
+        </w:rPr>
+        <w:t>ungepaddet</w:t>
+      </w:r>
+      <w:proofErr w:type="spellEnd"/>
+      <w:r>
+        <w:rPr>
+          <w:lang w:val="en-US"/>
+        </w:rPr>
+        <w:t xml:space="preserve">, </w:t>
+      </w:r>
+      <w:proofErr w:type="spellStart"/>
+      <w:r>
+        <w:rPr>
+          <w:lang w:val="en-US"/>
+        </w:rPr>
+        <w:t>grid_shape</w:t>
+      </w:r>
+      <w:proofErr w:type="spellEnd"/>
+      <w:r>
+        <w:rPr>
+          <w:lang w:val="en-US"/>
+        </w:rPr>
+        <w:t xml:space="preserve">) plus </w:t>
       </w:r>
       <w:r>
         <w:t>γ</w:t>
@@ -2066,7 +3328,21 @@
         <w:rPr>
           <w:lang w:val="en-US"/>
         </w:rPr>
-        <w:t xml:space="preserve"> und cell_size. </w:t>
+        <w:t xml:space="preserve"> und </w:t>
+      </w:r>
+      <w:proofErr w:type="spellStart"/>
+      <w:r>
+        <w:rPr>
+          <w:lang w:val="en-US"/>
+        </w:rPr>
+        <w:t>cell_size</w:t>
+      </w:r>
+      <w:proofErr w:type="spellEnd"/>
+      <w:r>
+        <w:rPr>
+          <w:lang w:val="en-US"/>
+        </w:rPr>
+        <w:t xml:space="preserve">. </w:t>
       </w:r>
       <w:r>
         <w:t>Raus: potential auf demselben Gitter.</w:t>
@@ -2078,7 +3354,31 @@
         <w:pStyle w:val="berschrift1"/>
       </w:pPr>
       <w:r>
-        <w:t>Aus Claude Code Opus 5.5 (Medium) Chat „space_charge_kick gradient error” (05.10.2026):</w:t>
+        <w:t>Aus Claude Code Opus 5.5 (Medium) Chat „</w:t>
+      </w:r>
+      <w:proofErr w:type="spellStart"/>
+      <w:r>
+        <w:t>space_charge_kick</w:t>
+      </w:r>
+      <w:proofErr w:type="spellEnd"/>
+      <w:r>
+        <w:t xml:space="preserve"> </w:t>
+      </w:r>
+      <w:proofErr w:type="spellStart"/>
+      <w:r>
+        <w:t>gradient</w:t>
+      </w:r>
+      <w:proofErr w:type="spellEnd"/>
+      <w:r>
+        <w:t xml:space="preserve"> </w:t>
+      </w:r>
+      <w:proofErr w:type="spellStart"/>
+      <w:r>
+        <w:t>error</w:t>
+      </w:r>
+      <w:proofErr w:type="spellEnd"/>
+      <w:r>
+        <w:t>” (05.10.2026):</w:t>
       </w:r>
     </w:p>
     <w:p>
@@ -2121,7 +3421,47 @@
         <w:t>Speichern</w:t>
       </w:r>
       <w:r>
-        <w:t> als {"x": rho[N,1,nx,ny,nτ], "y": phi[...], "cell_size": ..., "gamma": ...}.</w:t>
+        <w:t xml:space="preserve"> als {"x": </w:t>
+      </w:r>
+      <w:proofErr w:type="spellStart"/>
+      <w:r>
+        <w:t>rho</w:t>
+      </w:r>
+      <w:proofErr w:type="spellEnd"/>
+      <w:r>
+        <w:t>[N,</w:t>
+      </w:r>
+      <w:proofErr w:type="gramStart"/>
+      <w:r>
+        <w:t>1,nx</w:t>
+      </w:r>
+      <w:proofErr w:type="gramEnd"/>
+      <w:r>
+        <w:t xml:space="preserve">,ny,nτ], "y": </w:t>
+      </w:r>
+      <w:proofErr w:type="spellStart"/>
+      <w:r>
+        <w:t>phi</w:t>
+      </w:r>
+      <w:proofErr w:type="spellEnd"/>
+      <w:r>
+        <w:t>[...], "</w:t>
+      </w:r>
+      <w:proofErr w:type="spellStart"/>
+      <w:r>
+        <w:t>cell_size</w:t>
+      </w:r>
+      <w:proofErr w:type="spellEnd"/>
+      <w:r>
+        <w:t>": ..., "</w:t>
+      </w:r>
+      <w:proofErr w:type="spellStart"/>
+      <w:r>
+        <w:t>gamma</w:t>
+      </w:r>
+      <w:proofErr w:type="spellEnd"/>
+      <w:r>
+        <w:t>": ...}.</w:t>
       </w:r>
     </w:p>
     <w:p>
@@ -2139,7 +3479,15 @@
         <w:t>Test bei mehreren Auflösungen,</w:t>
       </w:r>
       <w:r>
-        <w:t> z. B. Training auf 32³ und Test auf 64³, wie die Darcy-Tests bei 16/32. So prüfst du, ob das Modell bei feinerem Gitter genauso gut funktioniert, was ein Hauptargument für Neural Operators ist.</w:t>
+        <w:t xml:space="preserve"> z. B. Training auf 32³ und Test auf 64³, wie die Darcy-Tests bei 16/32. So prüfst du, ob das Modell bei feinerem Gitter genauso gut funktioniert, was ein Hauptargument für </w:t>
+      </w:r>
+      <w:proofErr w:type="spellStart"/>
+      <w:r>
+        <w:t>Neural</w:t>
+      </w:r>
+      <w:proofErr w:type="spellEnd"/>
+      <w:r>
+        <w:t xml:space="preserve"> Operators ist.</w:t>
       </w:r>
     </w:p>
     <w:p>
@@ -2154,7 +3502,23 @@
           <w:b/>
           <w:bCs/>
         </w:rPr>
-        <w:t>Ein Testset mit Strahltypen, die im Training nicht vorkamen.</w:t>
+        <w:t xml:space="preserve">Ein </w:t>
+      </w:r>
+      <w:proofErr w:type="spellStart"/>
+      <w:r>
+        <w:rPr>
+          <w:b/>
+          <w:bCs/>
+        </w:rPr>
+        <w:t>Testset</w:t>
+      </w:r>
+      <w:proofErr w:type="spellEnd"/>
+      <w:r>
+        <w:rPr>
+          <w:b/>
+          <w:bCs/>
+        </w:rPr>
+        <w:t xml:space="preserve"> mit Strahltypen, die im Training nicht vorkamen.</w:t>
       </w:r>
       <w:r>
         <w:t> Sonst misst du nur, wie gut das Modell bekannte Fälle reproduziert.</w:t>
@@ -2204,7 +3568,21 @@
         <w:rPr>
           <w:highlight w:val="green"/>
         </w:rPr>
-        <w:t> (32³) speichern und übergeben, plus domain_padding im FNO</w:t>
+        <w:t> (32³) speichern und übergeben, plus </w:t>
+      </w:r>
+      <w:proofErr w:type="spellStart"/>
+      <w:r>
+        <w:rPr>
+          <w:highlight w:val="green"/>
+        </w:rPr>
+        <w:t>domain_padding</w:t>
+      </w:r>
+      <w:proofErr w:type="spellEnd"/>
+      <w:r>
+        <w:rPr>
+          <w:highlight w:val="green"/>
+        </w:rPr>
+        <w:t> im FNO</w:t>
       </w:r>
       <w:r>
         <w:t>. Das Hockney-Polster ist ein Detail des klassischen Lösers. Das Modell sollte es nicht lernen müssen.</w:t>
@@ -2257,7 +3635,21 @@
         <w:rPr>
           <w:highlight w:val="green"/>
         </w:rPr>
-        <w:t>G hängt aber von cell_size und γ ab, ändert sich also von Sample zu Sample. Das ist der eigentliche Lerninhalt (siehe Abschnitt</w:t>
+        <w:t>G hängt aber von </w:t>
+      </w:r>
+      <w:proofErr w:type="spellStart"/>
+      <w:r>
+        <w:rPr>
+          <w:highlight w:val="green"/>
+        </w:rPr>
+        <w:t>cell_size</w:t>
+      </w:r>
+      <w:proofErr w:type="spellEnd"/>
+      <w:r>
+        <w:rPr>
+          <w:highlight w:val="green"/>
+        </w:rPr>
+        <w:t> und γ ab, ändert sich also von Sample zu Sample. Das ist der eigentliche Lerninhalt (siehe Abschnitt</w:t>
       </w:r>
       <w:r>
         <w:rPr>
@@ -2328,17 +3720,35 @@
           <w:b/>
           <w:bCs/>
         </w:rPr>
-        <w:t>Was n_modes bedeutet:</w:t>
+        <w:t>Was </w:t>
+      </w:r>
+      <w:proofErr w:type="spellStart"/>
+      <w:r>
+        <w:rPr>
+          <w:b/>
+          <w:bCs/>
+        </w:rPr>
+        <w:t>n_modes</w:t>
+      </w:r>
+      <w:proofErr w:type="spellEnd"/>
+      <w:r>
+        <w:rPr>
+          <w:b/>
+          <w:bCs/>
+        </w:rPr>
+        <w:t> bedeutet:</w:t>
       </w:r>
       <w:r>
         <w:t> Pro Fourier-Schicht behält ein FNO nur die untersten </w:t>
       </w:r>
+      <w:proofErr w:type="spellStart"/>
       <w:r>
         <w:rPr>
           <w:highlight w:val="green"/>
         </w:rPr>
         <w:t>n_modes</w:t>
       </w:r>
+      <w:proofErr w:type="spellEnd"/>
       <w:r>
         <w:t xml:space="preserve"> Moden pro Richtung. </w:t>
       </w:r>
@@ -2391,13 +3801,62 @@
         <w:rPr>
           <w:highlight w:val="green"/>
         </w:rPr>
-        <w:t>Wie du n_modes wählst: Dein TruncatedSolver aus Zelle 22</w:t>
-      </w:r>
-      <w:r>
-        <w:t xml:space="preserve"> (cheetah_test.ipynb)</w:t>
-      </w:r>
-      <w:r>
-        <w:t xml:space="preserve"> ist genau dafür gebaut. Er zeigt, welchen Fehler im Strahl eine bestimmte Modenzahl im besten Fall verursacht. Damit kannst du n_modes belegen statt raten.</w:t>
+        <w:t xml:space="preserve">Wie du </w:t>
+      </w:r>
+      <w:proofErr w:type="spellStart"/>
+      <w:r>
+        <w:rPr>
+          <w:highlight w:val="green"/>
+        </w:rPr>
+        <w:t>n_modes</w:t>
+      </w:r>
+      <w:proofErr w:type="spellEnd"/>
+      <w:r>
+        <w:rPr>
+          <w:highlight w:val="green"/>
+        </w:rPr>
+        <w:t xml:space="preserve"> wählst: Dein </w:t>
+      </w:r>
+      <w:proofErr w:type="spellStart"/>
+      <w:r>
+        <w:rPr>
+          <w:highlight w:val="green"/>
+        </w:rPr>
+        <w:t>TruncatedSolver</w:t>
+      </w:r>
+      <w:proofErr w:type="spellEnd"/>
+      <w:r>
+        <w:rPr>
+          <w:highlight w:val="green"/>
+        </w:rPr>
+        <w:t xml:space="preserve"> aus Zelle 22</w:t>
+      </w:r>
+      <w:r>
+        <w:t xml:space="preserve"> (</w:t>
+      </w:r>
+      <w:proofErr w:type="spellStart"/>
+      <w:r>
+        <w:t>cheetah_</w:t>
+      </w:r>
+      <w:proofErr w:type="gramStart"/>
+      <w:r>
+        <w:t>test.ipynb</w:t>
+      </w:r>
+      <w:proofErr w:type="spellEnd"/>
+      <w:proofErr w:type="gramEnd"/>
+      <w:r>
+        <w:t>)</w:t>
+      </w:r>
+      <w:r>
+        <w:t xml:space="preserve"> ist genau dafür gebaut. Er zeigt, welchen Fehler im Strahl eine bestimmte Modenzahl im besten Fall verursacht. Damit kannst du </w:t>
+      </w:r>
+      <w:proofErr w:type="spellStart"/>
+      <w:r>
+        <w:t>n_modes</w:t>
+      </w:r>
+      <w:proofErr w:type="spellEnd"/>
+      <w:r>
+        <w:t xml:space="preserve"> belegen statt raten.</w:t>
       </w:r>
     </w:p>
     <w:p>
@@ -2425,12 +3884,42 @@
       <w:r>
         <w:t>Schau dir deshalb Tucker- oder CP-faktorisierte Gewichte an (</w:t>
       </w:r>
+      <w:proofErr w:type="spellStart"/>
       <w:r>
         <w:rPr>
           <w:highlight w:val="yellow"/>
         </w:rPr>
-        <w:t>factorization="tucker" im FNO von neuralop</w:t>
-      </w:r>
+        <w:t>factorization</w:t>
+      </w:r>
+      <w:proofErr w:type="spellEnd"/>
+      <w:r>
+        <w:rPr>
+          <w:highlight w:val="yellow"/>
+        </w:rPr>
+        <w:t>="</w:t>
+      </w:r>
+      <w:proofErr w:type="spellStart"/>
+      <w:r>
+        <w:rPr>
+          <w:highlight w:val="yellow"/>
+        </w:rPr>
+        <w:t>tucker</w:t>
+      </w:r>
+      <w:proofErr w:type="spellEnd"/>
+      <w:r>
+        <w:rPr>
+          <w:highlight w:val="yellow"/>
+        </w:rPr>
+        <w:t>" im FNO von </w:t>
+      </w:r>
+      <w:proofErr w:type="spellStart"/>
+      <w:r>
+        <w:rPr>
+          <w:highlight w:val="yellow"/>
+        </w:rPr>
+        <w:t>neuralop</w:t>
+      </w:r>
+      <w:proofErr w:type="spellEnd"/>
       <w:r>
         <w:t>).</w:t>
       </w:r>
@@ -2482,7 +3971,15 @@
         <w:t>Trainiere deshalb entweder auf φ ohne Mittelwert</w:t>
       </w:r>
       <w:r>
-        <w:t xml:space="preserve"> oder direkt auf dem Feld (Schnitt bei _E_plus_vB_field).</w:t>
+        <w:t xml:space="preserve"> oder direkt auf dem Feld (Schnitt bei _</w:t>
+      </w:r>
+      <w:proofErr w:type="spellStart"/>
+      <w:r>
+        <w:t>E_plus_vB_field</w:t>
+      </w:r>
+      <w:proofErr w:type="spellEnd"/>
+      <w:r>
+        <w:t>).</w:t>
       </w:r>
     </w:p>
     <w:p>
@@ -2555,7 +4052,15 @@
         <w:t>Gitter</w:t>
       </w:r>
       <w:r>
-        <w:t xml:space="preserve"> mit dem Strahl (grid_extent · σ)</w:t>
+        <w:t xml:space="preserve"> mit dem Strahl (</w:t>
+      </w:r>
+      <w:proofErr w:type="spellStart"/>
+      <w:r>
+        <w:t>grid_extent</w:t>
+      </w:r>
+      <w:proofErr w:type="spellEnd"/>
+      <w:r>
+        <w:t xml:space="preserve"> · σ)</w:t>
       </w:r>
       <w:r>
         <w:br/>
@@ -2586,8 +4091,44 @@
         <w:rPr>
           <w:highlight w:val="green"/>
         </w:rPr>
-        <w:t>Seitenverhältnis dx : dy : dτ·γ</w:t>
-      </w:r>
+        <w:t xml:space="preserve">Seitenverhältnis </w:t>
+      </w:r>
+      <w:proofErr w:type="gramStart"/>
+      <w:r>
+        <w:rPr>
+          <w:highlight w:val="green"/>
+        </w:rPr>
+        <w:t>dx :</w:t>
+      </w:r>
+      <w:proofErr w:type="gramEnd"/>
+      <w:r>
+        <w:rPr>
+          <w:highlight w:val="green"/>
+        </w:rPr>
+        <w:t xml:space="preserve"> </w:t>
+      </w:r>
+      <w:proofErr w:type="spellStart"/>
+      <w:r>
+        <w:rPr>
+          <w:highlight w:val="green"/>
+        </w:rPr>
+        <w:t>dy</w:t>
+      </w:r>
+      <w:proofErr w:type="spellEnd"/>
+      <w:r>
+        <w:rPr>
+          <w:highlight w:val="green"/>
+        </w:rPr>
+        <w:t xml:space="preserve"> : </w:t>
+      </w:r>
+      <w:proofErr w:type="spellStart"/>
+      <w:r>
+        <w:rPr>
+          <w:highlight w:val="green"/>
+        </w:rPr>
+        <w:t>dτ·γ</w:t>
+      </w:r>
+      <w:proofErr w:type="spellEnd"/>
       <w:r>
         <w:t xml:space="preserve"> ändern sich aber von Sample zu Sample, und G hängt davon ab</w:t>
       </w:r>
@@ -2609,6 +4150,7 @@
           <w:numId w:val="6"/>
         </w:numPr>
       </w:pPr>
+      <w:proofErr w:type="spellStart"/>
       <w:r>
         <w:rPr>
           <w:b/>
@@ -2617,6 +4159,7 @@
         <w:lastRenderedPageBreak/>
         <w:t>Entdimensionalisierung</w:t>
       </w:r>
+      <w:proofErr w:type="spellEnd"/>
       <w:r>
         <w:rPr>
           <w:iCs/>
@@ -2632,19 +4175,89 @@
         </w:numPr>
       </w:pPr>
       <w:r>
-        <w:t>Mit Q als Gesamtladung, V als Zellvolumen und h = (dx · dy · dτ·γ)^(1/3) als charakteristischer Zelllänge:</w:t>
+        <w:t xml:space="preserve">Mit Q als Gesamtladung, V als Zellvolumen und h = (dx · </w:t>
+      </w:r>
+      <w:proofErr w:type="spellStart"/>
+      <w:r>
+        <w:t>dy</w:t>
+      </w:r>
+      <w:proofErr w:type="spellEnd"/>
+      <w:r>
+        <w:t xml:space="preserve"> · </w:t>
+      </w:r>
+      <w:proofErr w:type="spellStart"/>
+      <w:r>
+        <w:t>dτ·</w:t>
+      </w:r>
+      <w:proofErr w:type="gramStart"/>
+      <w:r>
+        <w:t>γ</w:t>
+      </w:r>
+      <w:proofErr w:type="spellEnd"/>
+      <w:r>
+        <w:t>)^</w:t>
+      </w:r>
+      <w:proofErr w:type="gramEnd"/>
+      <w:r>
+        <w:t>(1/3) als charakteristischer Zelllänge:</w:t>
       </w:r>
       <w:r>
         <w:br/>
-        <w:t>rho_hat = rho * V / Q                       # Ladungsanteil pro Zelle, Summe ≈ 1</w:t>
+      </w:r>
+      <w:proofErr w:type="spellStart"/>
+      <w:r>
+        <w:t>rho_hat</w:t>
+      </w:r>
+      <w:proofErr w:type="spellEnd"/>
+      <w:r>
+        <w:t xml:space="preserve"> = </w:t>
+      </w:r>
+      <w:proofErr w:type="spellStart"/>
+      <w:r>
+        <w:t>rho</w:t>
+      </w:r>
+      <w:proofErr w:type="spellEnd"/>
+      <w:r>
+        <w:t xml:space="preserve"> * V / Q                       # Ladungsanteil pro Zelle, Summe ≈ 1</w:t>
       </w:r>
       <w:r>
         <w:br/>
-        <w:t>phi_hat = phi * 4*pi*eps0 * h / Q</w:t>
+      </w:r>
+      <w:proofErr w:type="spellStart"/>
+      <w:r>
+        <w:t>phi_hat</w:t>
+      </w:r>
+      <w:proofErr w:type="spellEnd"/>
+      <w:r>
+        <w:t xml:space="preserve"> = </w:t>
+      </w:r>
+      <w:proofErr w:type="spellStart"/>
+      <w:r>
+        <w:t>phi</w:t>
+      </w:r>
+      <w:proofErr w:type="spellEnd"/>
+      <w:r>
+        <w:t xml:space="preserve"> * 4*</w:t>
+      </w:r>
+      <w:proofErr w:type="spellStart"/>
+      <w:r>
+        <w:t>pi</w:t>
+      </w:r>
+      <w:proofErr w:type="spellEnd"/>
+      <w:r>
+        <w:t>*eps0 * h / Q</w:t>
       </w:r>
       <w:r>
         <w:br/>
-        <w:t xml:space="preserve">Die IGF hat die Einheit Länge² und skaliert mit h², das Zellvolumen mit h³. Damit ist phi_hat = g </w:t>
+        <w:t xml:space="preserve">Die IGF hat die Einheit Länge² und skaliert mit h², das Zellvolumen mit h³. Damit ist </w:t>
+      </w:r>
+      <w:proofErr w:type="spellStart"/>
+      <w:r>
+        <w:t>phi_hat</w:t>
+      </w:r>
+      <w:proofErr w:type="spellEnd"/>
+      <w:r>
+        <w:t xml:space="preserve"> = g </w:t>
       </w:r>
       <w:r>
         <w:rPr>
@@ -2653,7 +4266,15 @@
         <w:t>∗</w:t>
       </w:r>
       <w:r>
-        <w:t xml:space="preserve"> rho_hat, und der Kern g h</w:t>
+        <w:t xml:space="preserve"> </w:t>
+      </w:r>
+      <w:proofErr w:type="spellStart"/>
+      <w:r>
+        <w:t>rho_hat</w:t>
+      </w:r>
+      <w:proofErr w:type="spellEnd"/>
+      <w:r>
+        <w:t>, und der Kern g h</w:t>
       </w:r>
       <w:r>
         <w:rPr>
@@ -2671,7 +4292,27 @@
         <w:t>ä</w:t>
       </w:r>
       <w:r>
-        <w:t>ltnissen dx : dy : d</w:t>
+        <w:t xml:space="preserve">ltnissen </w:t>
+      </w:r>
+      <w:proofErr w:type="gramStart"/>
+      <w:r>
+        <w:t>dx :</w:t>
+      </w:r>
+      <w:proofErr w:type="gramEnd"/>
+      <w:r>
+        <w:t xml:space="preserve"> </w:t>
+      </w:r>
+      <w:proofErr w:type="spellStart"/>
+      <w:r>
+        <w:t>dy</w:t>
+      </w:r>
+      <w:proofErr w:type="spellEnd"/>
+      <w:r>
+        <w:t xml:space="preserve"> : </w:t>
+      </w:r>
+      <w:proofErr w:type="spellStart"/>
+      <w:r>
+        <w:t>d</w:t>
       </w:r>
       <w:r>
         <w:rPr>
@@ -2679,6 +4320,7 @@
         </w:rPr>
         <w:t>τγ</w:t>
       </w:r>
+      <w:proofErr w:type="spellEnd"/>
       <w:r>
         <w:t xml:space="preserve"> ab. Ladung und absolute Strahlgr</w:t>
       </w:r>
@@ -2717,12 +4359,37 @@
           <w:numId w:val="6"/>
         </w:numPr>
       </w:pPr>
+      <w:proofErr w:type="spellStart"/>
       <w:r>
         <w:rPr>
           <w:b/>
           <w:bCs/>
         </w:rPr>
-        <w:t>UnitGaussianNormalizer über den data_processor.</w:t>
+        <w:t>UnitGaussianNormalizer</w:t>
+      </w:r>
+      <w:proofErr w:type="spellEnd"/>
+      <w:r>
+        <w:rPr>
+          <w:b/>
+          <w:bCs/>
+        </w:rPr>
+        <w:t xml:space="preserve"> über den </w:t>
+      </w:r>
+      <w:proofErr w:type="spellStart"/>
+      <w:r>
+        <w:rPr>
+          <w:b/>
+          <w:bCs/>
+        </w:rPr>
+        <w:t>data_processor</w:t>
+      </w:r>
+      <w:proofErr w:type="spellEnd"/>
+      <w:r>
+        <w:rPr>
+          <w:b/>
+          <w:bCs/>
+        </w:rPr>
+        <w:t>.</w:t>
       </w:r>
       <w:r>
         <w:t xml:space="preserve"> Auf den dimensionslosen Größen bringt er die verbleibenden Werte nur noch auf Mittelwert 0 und Standardabweichung 1.</w:t>
@@ -2757,15 +4424,64 @@
         </w:rPr>
         <w:br/>
       </w:r>
-      <w:r>
-        <w:t>from neuralop.data.transforms.data_processors import DefaultDataProcessor</w:t>
-      </w:r>
+      <w:proofErr w:type="spellStart"/>
+      <w:r>
+        <w:t>from</w:t>
+      </w:r>
+      <w:proofErr w:type="spellEnd"/>
+      <w:r>
+        <w:t xml:space="preserve"> </w:t>
+      </w:r>
+      <w:proofErr w:type="spellStart"/>
+      <w:r>
+        <w:t>neuralop.data.transforms.data_processors</w:t>
+      </w:r>
+      <w:proofErr w:type="spellEnd"/>
+      <w:r>
+        <w:t xml:space="preserve"> </w:t>
+      </w:r>
+      <w:proofErr w:type="spellStart"/>
+      <w:r>
+        <w:t>import</w:t>
+      </w:r>
+      <w:proofErr w:type="spellEnd"/>
+      <w:r>
+        <w:t xml:space="preserve"> </w:t>
+      </w:r>
+      <w:proofErr w:type="spellStart"/>
+      <w:r>
+        <w:t>DefaultDataProcessor</w:t>
+      </w:r>
+      <w:proofErr w:type="spellEnd"/>
       <w:r>
         <w:br/>
       </w:r>
       <w:r>
         <w:br/>
-        <w:t>class PhysicalScalingProcessor(DefaultDataProcessor):</w:t>
+      </w:r>
+      <w:proofErr w:type="spellStart"/>
+      <w:r>
+        <w:t>class</w:t>
+      </w:r>
+      <w:proofErr w:type="spellEnd"/>
+      <w:r>
+        <w:t xml:space="preserve"> </w:t>
+      </w:r>
+      <w:proofErr w:type="spellStart"/>
+      <w:r>
+        <w:t>PhysicalScalingProcessor</w:t>
+      </w:r>
+      <w:proofErr w:type="spellEnd"/>
+      <w:r>
+        <w:t>(</w:t>
+      </w:r>
+      <w:proofErr w:type="spellStart"/>
+      <w:r>
+        <w:t>DefaultDataProcessor</w:t>
+      </w:r>
+      <w:proofErr w:type="spellEnd"/>
+      <w:r>
+        <w:t>):</w:t>
       </w:r>
       <w:r>
         <w:br/>
@@ -2787,14 +4503,56 @@
         <w:rPr>
           <w:lang w:val="en-US"/>
         </w:rPr>
-        <w:t>def preprocess(self, data_dict, batched=True):</w:t>
+        <w:t xml:space="preserve">def preprocess(self, </w:t>
+      </w:r>
+      <w:proofErr w:type="spellStart"/>
+      <w:r>
+        <w:rPr>
+          <w:lang w:val="en-US"/>
+        </w:rPr>
+        <w:t>data_dict</w:t>
+      </w:r>
+      <w:proofErr w:type="spellEnd"/>
+      <w:r>
+        <w:rPr>
+          <w:lang w:val="en-US"/>
+        </w:rPr>
+        <w:t>, batched=True):</w:t>
       </w:r>
       <w:r>
         <w:rPr>
           <w:lang w:val="en-US"/>
         </w:rPr>
         <w:br/>
-        <w:t xml:space="preserve">        q = data_dict["Q"].to(self.device).view(-1, 1, 1, 1, 1)</w:t>
+        <w:t xml:space="preserve">        q = </w:t>
+      </w:r>
+      <w:proofErr w:type="spellStart"/>
+      <w:r>
+        <w:rPr>
+          <w:lang w:val="en-US"/>
+        </w:rPr>
+        <w:t>data_dict</w:t>
+      </w:r>
+      <w:proofErr w:type="spellEnd"/>
+      <w:r>
+        <w:rPr>
+          <w:lang w:val="en-US"/>
+        </w:rPr>
+        <w:t>["Q"].to(</w:t>
+      </w:r>
+      <w:proofErr w:type="spellStart"/>
+      <w:r>
+        <w:rPr>
+          <w:lang w:val="en-US"/>
+        </w:rPr>
+        <w:t>self.device</w:t>
+      </w:r>
+      <w:proofErr w:type="spellEnd"/>
+      <w:r>
+        <w:rPr>
+          <w:lang w:val="en-US"/>
+        </w:rPr>
+        <w:t>).view(-1, 1, 1, 1, 1)</w:t>
       </w:r>
       <w:r>
         <w:rPr>
@@ -2806,7 +4564,35 @@
         <w:rPr>
           <w:lang w:val="en-US"/>
         </w:rPr>
-        <w:t xml:space="preserve">        v = data_dict["V"].to(self.device).view(-1, 1, 1, 1, 1)</w:t>
+        <w:t xml:space="preserve">        v = </w:t>
+      </w:r>
+      <w:proofErr w:type="spellStart"/>
+      <w:r>
+        <w:rPr>
+          <w:lang w:val="en-US"/>
+        </w:rPr>
+        <w:t>data_dict</w:t>
+      </w:r>
+      <w:proofErr w:type="spellEnd"/>
+      <w:r>
+        <w:rPr>
+          <w:lang w:val="en-US"/>
+        </w:rPr>
+        <w:t>["V"].to(</w:t>
+      </w:r>
+      <w:proofErr w:type="spellStart"/>
+      <w:r>
+        <w:rPr>
+          <w:lang w:val="en-US"/>
+        </w:rPr>
+        <w:t>self.device</w:t>
+      </w:r>
+      <w:proofErr w:type="spellEnd"/>
+      <w:r>
+        <w:rPr>
+          <w:lang w:val="en-US"/>
+        </w:rPr>
+        <w:t>).view(-1, 1, 1, 1, 1)</w:t>
       </w:r>
       <w:r>
         <w:rPr>
@@ -2818,7 +4604,35 @@
         <w:rPr>
           <w:lang w:val="en-US"/>
         </w:rPr>
-        <w:t xml:space="preserve">        h = data_dict["h"].to(self.device).view(-1, 1, 1, 1, 1)</w:t>
+        <w:t xml:space="preserve">        h = </w:t>
+      </w:r>
+      <w:proofErr w:type="spellStart"/>
+      <w:r>
+        <w:rPr>
+          <w:lang w:val="en-US"/>
+        </w:rPr>
+        <w:t>data_dict</w:t>
+      </w:r>
+      <w:proofErr w:type="spellEnd"/>
+      <w:r>
+        <w:rPr>
+          <w:lang w:val="en-US"/>
+        </w:rPr>
+        <w:t>["h"].to(</w:t>
+      </w:r>
+      <w:proofErr w:type="spellStart"/>
+      <w:r>
+        <w:rPr>
+          <w:lang w:val="en-US"/>
+        </w:rPr>
+        <w:t>self.device</w:t>
+      </w:r>
+      <w:proofErr w:type="spellEnd"/>
+      <w:r>
+        <w:rPr>
+          <w:lang w:val="en-US"/>
+        </w:rPr>
+        <w:t>).view(-1, 1, 1, 1, 1)</w:t>
       </w:r>
       <w:r>
         <w:rPr>
@@ -2830,7 +4644,49 @@
         <w:rPr>
           <w:lang w:val="en-US"/>
         </w:rPr>
-        <w:t xml:space="preserve">        data_dict["x"] = data_dict["x"].to(self.device) * v / q</w:t>
+        <w:t xml:space="preserve">        </w:t>
+      </w:r>
+      <w:proofErr w:type="spellStart"/>
+      <w:r>
+        <w:rPr>
+          <w:lang w:val="en-US"/>
+        </w:rPr>
+        <w:t>data_dict</w:t>
+      </w:r>
+      <w:proofErr w:type="spellEnd"/>
+      <w:r>
+        <w:rPr>
+          <w:lang w:val="en-US"/>
+        </w:rPr>
+        <w:t xml:space="preserve">["x"] = </w:t>
+      </w:r>
+      <w:proofErr w:type="spellStart"/>
+      <w:r>
+        <w:rPr>
+          <w:lang w:val="en-US"/>
+        </w:rPr>
+        <w:t>data_dict</w:t>
+      </w:r>
+      <w:proofErr w:type="spellEnd"/>
+      <w:r>
+        <w:rPr>
+          <w:lang w:val="en-US"/>
+        </w:rPr>
+        <w:t>["x"].to(</w:t>
+      </w:r>
+      <w:proofErr w:type="spellStart"/>
+      <w:r>
+        <w:rPr>
+          <w:lang w:val="en-US"/>
+        </w:rPr>
+        <w:t>self.device</w:t>
+      </w:r>
+      <w:proofErr w:type="spellEnd"/>
+      <w:r>
+        <w:rPr>
+          <w:lang w:val="en-US"/>
+        </w:rPr>
+        <w:t>) * v / q</w:t>
       </w:r>
       <w:r>
         <w:rPr>
@@ -2842,7 +4698,63 @@
         <w:rPr>
           <w:lang w:val="en-US"/>
         </w:rPr>
-        <w:t xml:space="preserve">        data_dict["y"] = data_dict["y"].to(self.device) * (4 * torch.pi * epsilon_0) * h / q</w:t>
+        <w:t xml:space="preserve">        </w:t>
+      </w:r>
+      <w:proofErr w:type="spellStart"/>
+      <w:r>
+        <w:rPr>
+          <w:lang w:val="en-US"/>
+        </w:rPr>
+        <w:t>data_dict</w:t>
+      </w:r>
+      <w:proofErr w:type="spellEnd"/>
+      <w:r>
+        <w:rPr>
+          <w:lang w:val="en-US"/>
+        </w:rPr>
+        <w:t xml:space="preserve">["y"] = </w:t>
+      </w:r>
+      <w:proofErr w:type="spellStart"/>
+      <w:r>
+        <w:rPr>
+          <w:lang w:val="en-US"/>
+        </w:rPr>
+        <w:t>data_dict</w:t>
+      </w:r>
+      <w:proofErr w:type="spellEnd"/>
+      <w:r>
+        <w:rPr>
+          <w:lang w:val="en-US"/>
+        </w:rPr>
+        <w:t>["y"].to(</w:t>
+      </w:r>
+      <w:proofErr w:type="spellStart"/>
+      <w:r>
+        <w:rPr>
+          <w:lang w:val="en-US"/>
+        </w:rPr>
+        <w:t>self.device</w:t>
+      </w:r>
+      <w:proofErr w:type="spellEnd"/>
+      <w:r>
+        <w:rPr>
+          <w:lang w:val="en-US"/>
+        </w:rPr>
+        <w:t xml:space="preserve">) * (4 * </w:t>
+      </w:r>
+      <w:proofErr w:type="spellStart"/>
+      <w:r>
+        <w:rPr>
+          <w:lang w:val="en-US"/>
+        </w:rPr>
+        <w:t>torch.pi</w:t>
+      </w:r>
+      <w:proofErr w:type="spellEnd"/>
+      <w:r>
+        <w:rPr>
+          <w:lang w:val="en-US"/>
+        </w:rPr>
+        <w:t xml:space="preserve"> * epsilon_0) * h / q</w:t>
       </w:r>
       <w:r>
         <w:rPr>
@@ -2854,7 +4766,21 @@
         <w:rPr>
           <w:lang w:val="en-US"/>
         </w:rPr>
-        <w:t xml:space="preserve">        return super().preprocess(data_dict, batched)</w:t>
+        <w:t xml:space="preserve">        return super().preprocess(</w:t>
+      </w:r>
+      <w:proofErr w:type="spellStart"/>
+      <w:r>
+        <w:rPr>
+          <w:lang w:val="en-US"/>
+        </w:rPr>
+        <w:t>data_dict</w:t>
+      </w:r>
+      <w:proofErr w:type="spellEnd"/>
+      <w:r>
+        <w:rPr>
+          <w:lang w:val="en-US"/>
+        </w:rPr>
+        <w:t>, batched)</w:t>
       </w:r>
     </w:p>
     <w:p>
@@ -2883,7 +4809,15 @@
         <w:t xml:space="preserve">. </w:t>
       </w:r>
       <w:r>
-        <w:t>Vermeide aber Vorverarbeitung mit NumPy im Vorwärtspfad.</w:t>
+        <w:t xml:space="preserve">Vermeide aber Vorverarbeitung mit </w:t>
+      </w:r>
+      <w:proofErr w:type="spellStart"/>
+      <w:r>
+        <w:t>NumPy</w:t>
+      </w:r>
+      <w:proofErr w:type="spellEnd"/>
+      <w:r>
+        <w:t xml:space="preserve"> im Vorwärtspfad.</w:t>
       </w:r>
     </w:p>
     <w:p>
@@ -2903,7 +4837,23 @@
         <w:t xml:space="preserve">: </w:t>
       </w:r>
       <w:r>
-        <w:t> Vergleiche dann nicht nur den Feldfehler, sondern auch die Strahlgrößen σ_x, σ_px nach dem Tracking. </w:t>
+        <w:t xml:space="preserve"> Vergleiche dann nicht nur den Feldfehler, sondern auch die Strahlgrößen </w:t>
+      </w:r>
+      <w:proofErr w:type="spellStart"/>
+      <w:r>
+        <w:t>σ_x</w:t>
+      </w:r>
+      <w:proofErr w:type="spellEnd"/>
+      <w:r>
+        <w:t xml:space="preserve">, </w:t>
+      </w:r>
+      <w:proofErr w:type="spellStart"/>
+      <w:r>
+        <w:t>σ_px</w:t>
+      </w:r>
+      <w:proofErr w:type="spellEnd"/>
+      <w:r>
+        <w:t xml:space="preserve"> nach dem Tracking. </w:t>
       </w:r>
     </w:p>
     <w:p/>
@@ -2931,7 +4881,15 @@
         <w:t>Polsterung:</w:t>
       </w:r>
       <w:r>
-        <w:t xml:space="preserve"> \rho_{hat} ohne Nullpolsterung</w:t>
+        <w:t xml:space="preserve"> \</w:t>
+      </w:r>
+      <w:proofErr w:type="spellStart"/>
+      <w:r>
+        <w:t>rho</w:t>
+      </w:r>
+      <w:proofErr w:type="spellEnd"/>
+      <w:r>
+        <w:t>_{hat} ohne Nullpolsterung</w:t>
       </w:r>
       <w:r>
         <w:rPr>
@@ -2940,7 +4898,23 @@
         <w:footnoteReference w:id="2"/>
       </w:r>
       <w:r>
-        <w:t xml:space="preserve"> , dafür FNO mit domai_padding (default = Gitter * 1.25)</w:t>
+        <w:t xml:space="preserve"> , dafür FNO mit </w:t>
+      </w:r>
+      <w:proofErr w:type="spellStart"/>
+      <w:r>
+        <w:t>domai_padding</w:t>
+      </w:r>
+      <w:proofErr w:type="spellEnd"/>
+      <w:r>
+        <w:t xml:space="preserve"> (</w:t>
+      </w:r>
+      <w:proofErr w:type="spellStart"/>
+      <w:r>
+        <w:t>default</w:t>
+      </w:r>
+      <w:proofErr w:type="spellEnd"/>
+      <w:r>
+        <w:t xml:space="preserve"> = Gitter * 1.25)</w:t>
       </w:r>
     </w:p>
     <w:p>
@@ -2958,7 +4932,23 @@
         <w:t>Zielgröße:</w:t>
       </w:r>
       <w:r>
-        <w:t xml:space="preserve"> \rho_{hat} -&gt; \phi_{hat} (Schnitt A)</w:t>
+        <w:t xml:space="preserve"> \</w:t>
+      </w:r>
+      <w:proofErr w:type="spellStart"/>
+      <w:r>
+        <w:t>rho</w:t>
+      </w:r>
+      <w:proofErr w:type="spellEnd"/>
+      <w:r>
+        <w:t>_{hat} -&gt; \</w:t>
+      </w:r>
+      <w:proofErr w:type="spellStart"/>
+      <w:r>
+        <w:t>phi</w:t>
+      </w:r>
+      <w:proofErr w:type="spellEnd"/>
+      <w:r>
+        <w:t>_{hat} (Schnitt A)</w:t>
       </w:r>
     </w:p>
     <w:p>
@@ -2972,25 +4962,99 @@
           <w:lang w:val="en-US"/>
         </w:rPr>
       </w:pPr>
+      <w:proofErr w:type="spellStart"/>
       <w:r>
         <w:rPr>
           <w:b/>
           <w:lang w:val="en-US"/>
         </w:rPr>
-        <w:t>Datenquelle:</w:t>
-      </w:r>
-      <w:r>
-        <w:rPr>
-          <w:lang w:val="en-US"/>
-        </w:rPr>
-        <w:t xml:space="preserve"> Strahlen aus echtem Cheetah-Lattice (uniform_3d_ellipsoid, from_parameters, </w:t>
-      </w:r>
-      <w:r>
-        <w:rPr>
-          <w:lang w:val="en-US"/>
-        </w:rPr>
-        <w:t xml:space="preserve">ggf. </w:t>
-      </w:r>
+        <w:t>Datenquelle</w:t>
+      </w:r>
+      <w:proofErr w:type="spellEnd"/>
+      <w:r>
+        <w:rPr>
+          <w:b/>
+          <w:lang w:val="en-US"/>
+        </w:rPr>
+        <w:t>:</w:t>
+      </w:r>
+      <w:r>
+        <w:rPr>
+          <w:lang w:val="en-US"/>
+        </w:rPr>
+        <w:t xml:space="preserve"> </w:t>
+      </w:r>
+      <w:proofErr w:type="spellStart"/>
+      <w:r>
+        <w:rPr>
+          <w:lang w:val="en-US"/>
+        </w:rPr>
+        <w:t>Strahlen</w:t>
+      </w:r>
+      <w:proofErr w:type="spellEnd"/>
+      <w:r>
+        <w:rPr>
+          <w:lang w:val="en-US"/>
+        </w:rPr>
+        <w:t xml:space="preserve"> </w:t>
+      </w:r>
+      <w:proofErr w:type="spellStart"/>
+      <w:r>
+        <w:rPr>
+          <w:lang w:val="en-US"/>
+        </w:rPr>
+        <w:t>aus</w:t>
+      </w:r>
+      <w:proofErr w:type="spellEnd"/>
+      <w:r>
+        <w:rPr>
+          <w:lang w:val="en-US"/>
+        </w:rPr>
+        <w:t xml:space="preserve"> </w:t>
+      </w:r>
+      <w:proofErr w:type="spellStart"/>
+      <w:r>
+        <w:rPr>
+          <w:lang w:val="en-US"/>
+        </w:rPr>
+        <w:t>echtem</w:t>
+      </w:r>
+      <w:proofErr w:type="spellEnd"/>
+      <w:r>
+        <w:rPr>
+          <w:lang w:val="en-US"/>
+        </w:rPr>
+        <w:t xml:space="preserve"> Cheetah-Lattice (uniform_3d_ellipsoid, </w:t>
+      </w:r>
+      <w:proofErr w:type="spellStart"/>
+      <w:r>
+        <w:rPr>
+          <w:lang w:val="en-US"/>
+        </w:rPr>
+        <w:t>from_parameters</w:t>
+      </w:r>
+      <w:proofErr w:type="spellEnd"/>
+      <w:r>
+        <w:rPr>
+          <w:lang w:val="en-US"/>
+        </w:rPr>
+        <w:t xml:space="preserve">, </w:t>
+      </w:r>
+      <w:proofErr w:type="spellStart"/>
+      <w:r>
+        <w:rPr>
+          <w:lang w:val="en-US"/>
+        </w:rPr>
+        <w:t>ggf</w:t>
+      </w:r>
+      <w:proofErr w:type="spellEnd"/>
+      <w:r>
+        <w:rPr>
+          <w:lang w:val="en-US"/>
+        </w:rPr>
+        <w:t xml:space="preserve">. </w:t>
+      </w:r>
+      <w:proofErr w:type="spellStart"/>
       <w:r>
         <w:rPr>
           <w:lang w:val="en-US"/>
@@ -3001,7 +5065,28 @@
         <w:rPr>
           <w:lang w:val="en-US"/>
         </w:rPr>
-        <w:t>_astra, from_twiss etc.)</w:t>
+        <w:t>_astra</w:t>
+      </w:r>
+      <w:proofErr w:type="spellEnd"/>
+      <w:r>
+        <w:rPr>
+          <w:lang w:val="en-US"/>
+        </w:rPr>
+        <w:t xml:space="preserve">, </w:t>
+      </w:r>
+      <w:proofErr w:type="spellStart"/>
+      <w:r>
+        <w:rPr>
+          <w:lang w:val="en-US"/>
+        </w:rPr>
+        <w:t>from_twiss</w:t>
+      </w:r>
+      <w:proofErr w:type="spellEnd"/>
+      <w:r>
+        <w:rPr>
+          <w:lang w:val="en-US"/>
+        </w:rPr>
+        <w:t xml:space="preserve"> etc.)</w:t>
       </w:r>
     </w:p>
     <w:p>
@@ -3015,12 +5100,21 @@
           <w:lang w:val="en-US"/>
         </w:rPr>
       </w:pPr>
+      <w:proofErr w:type="spellStart"/>
       <w:r>
         <w:rPr>
           <w:b/>
           <w:lang w:val="en-US"/>
         </w:rPr>
-        <w:t>Datenmengen:</w:t>
+        <w:t>Datenmengen</w:t>
+      </w:r>
+      <w:proofErr w:type="spellEnd"/>
+      <w:r>
+        <w:rPr>
+          <w:b/>
+          <w:lang w:val="en-US"/>
+        </w:rPr>
+        <w:t>:</w:t>
       </w:r>
     </w:p>
     <w:p>
@@ -3075,6 +5169,115 @@
           <w:lang w:val="en-US"/>
         </w:rPr>
         <w:t>Maximum: 50000</w:t>
+      </w:r>
+    </w:p>
+    <w:p>
+      <w:pPr>
+        <w:rPr>
+          <w:lang w:val="en-US"/>
+        </w:rPr>
+      </w:pPr>
+    </w:p>
+    <w:p>
+      <w:pPr>
+        <w:pStyle w:val="berschrift1"/>
+        <w:rPr>
+          <w:lang w:val="en-US"/>
+        </w:rPr>
+      </w:pPr>
+      <w:r>
+        <w:rPr>
+          <w:lang w:val="en-US"/>
+        </w:rPr>
+        <w:t>Modell Stand 08.10.2026</w:t>
+      </w:r>
+    </w:p>
+    <w:p>
+      <w:pPr>
+        <w:rPr>
+          <w:lang w:val="en-US"/>
+        </w:rPr>
+      </w:pPr>
+      <w:r>
+        <w:rPr>
+          <w:lang w:val="en-US"/>
+        </w:rPr>
+        <w:t xml:space="preserve">Training auf </w:t>
+      </w:r>
+      <w:proofErr w:type="spellStart"/>
+      <w:r>
+        <w:rPr>
+          <w:lang w:val="en-US"/>
+        </w:rPr>
+        <w:t>Auflösung</w:t>
+      </w:r>
+      <w:proofErr w:type="spellEnd"/>
+      <w:r>
+        <w:rPr>
+          <w:lang w:val="en-US"/>
+        </w:rPr>
+        <w:t xml:space="preserve"> 16³</w:t>
+      </w:r>
+    </w:p>
+    <w:p>
+      <w:r>
+        <w:t>Test auf Auflösungen 16³ - 128³ zeigt, dass e</w:t>
+      </w:r>
+      <w:r>
+        <w:t xml:space="preserve">her </w:t>
+      </w:r>
+      <w:proofErr w:type="spellStart"/>
+      <w:r>
+        <w:t>rho</w:t>
+      </w:r>
+      <w:proofErr w:type="spellEnd"/>
+      <w:r>
+        <w:t xml:space="preserve"> identitär auf </w:t>
+      </w:r>
+      <w:proofErr w:type="spellStart"/>
+      <w:r>
+        <w:t>phi</w:t>
+      </w:r>
+      <w:proofErr w:type="spellEnd"/>
+      <w:r>
+        <w:t xml:space="preserve"> abgebildet wird, als dass das Netz die GT von </w:t>
+      </w:r>
+      <w:proofErr w:type="spellStart"/>
+      <w:r>
+        <w:t>phi</w:t>
+      </w:r>
+      <w:proofErr w:type="spellEnd"/>
+      <w:r>
+        <w:t xml:space="preserve"> lernt.</w:t>
+      </w:r>
+    </w:p>
+    <w:p>
+      <w:r>
+        <w:t xml:space="preserve">Mögliche Lösung: Aktivierungsfunktionen von FNO prüfen und </w:t>
+      </w:r>
+      <w:proofErr w:type="spellStart"/>
+      <w:r>
+        <w:t>Hyperparams</w:t>
+      </w:r>
+      <w:proofErr w:type="spellEnd"/>
+      <w:r>
+        <w:t xml:space="preserve"> anpassen, z.B. Tiefe (</w:t>
+      </w:r>
+      <w:proofErr w:type="spellStart"/>
+      <w:r>
+        <w:t>fourier</w:t>
+      </w:r>
+      <w:proofErr w:type="spellEnd"/>
+      <w:r>
+        <w:t xml:space="preserve"> </w:t>
+      </w:r>
+      <w:proofErr w:type="spellStart"/>
+      <w:r>
+        <w:t>layers</w:t>
+      </w:r>
+      <w:proofErr w:type="spellEnd"/>
+      <w:r>
+        <w:t>) und Breite (Neuronen pro Layer)</w:t>
       </w:r>
     </w:p>
     <w:sectPr>
@@ -3228,13 +5431,31 @@
         <w:footnoteRef/>
       </w:r>
       <w:r>
-        <w:t xml:space="preserve"> Urspr. mit 32³ -&gt; 64³ (</w:t>
-      </w:r>
-      <w:r>
-        <w:t>Hockney-Methode</w:t>
-      </w:r>
-      <w:r>
-        <w:t>) vorgesehen, wenn aus _array_rho() kommend für Berechnnung via FFT, welches periodisch/ zyklisch arbeitet</w:t>
+        <w:t xml:space="preserve"> Urspr. mit 32³ -&gt; 64³ (Hockney-Methode) vorgesehen, wenn aus _</w:t>
+      </w:r>
+      <w:proofErr w:type="spellStart"/>
+      <w:r>
+        <w:t>array_</w:t>
+      </w:r>
+      <w:proofErr w:type="gramStart"/>
+      <w:r>
+        <w:t>rho</w:t>
+      </w:r>
+      <w:proofErr w:type="spellEnd"/>
+      <w:r>
+        <w:t>(</w:t>
+      </w:r>
+      <w:proofErr w:type="gramEnd"/>
+      <w:r>
+        <w:t xml:space="preserve">) kommend für </w:t>
+      </w:r>
+      <w:proofErr w:type="spellStart"/>
+      <w:r>
+        <w:t>Berechnnung</w:t>
+      </w:r>
+      <w:proofErr w:type="spellEnd"/>
+      <w:r>
+        <w:t xml:space="preserve"> via FFT, welches periodisch/ zyklisch arbeitet</w:t>
       </w:r>
     </w:p>
   </w:footnote>

</xml_diff>